<commit_message>
Integrate Docker with GitHub Actions
</commit_message>
<xml_diff>
--- a/Word/Note.docx
+++ b/Word/Note.docx
@@ -8323,7 +8323,7 @@
           <w:sz w:val="36"/>
           <w:szCs w:val="36"/>
         </w:rPr>
-        <w:t>15.CI/CD:</w:t>
+        <w:t>15.CI:</w:t>
       </w:r>
     </w:p>
     <w:p>
@@ -8929,34 +8929,7 @@
           <w:sz w:val="36"/>
           <w:szCs w:val="36"/>
         </w:rPr>
-        <w:t xml:space="preserve">Create package </w:t>
-      </w:r>
-      <w:r>
-        <w:rPr>
-          <w:rFonts w:ascii="Times New Roman" w:hAnsi="Times New Roman" w:cs="Times New Roman"/>
-          <w:color w:val="000000" w:themeColor="text1"/>
-          <w:sz w:val="36"/>
-          <w:szCs w:val="36"/>
-        </w:rPr>
-        <w:t>.github</w:t>
-      </w:r>
-      <w:r>
-        <w:rPr>
-          <w:rFonts w:ascii="Times New Roman" w:hAnsi="Times New Roman" w:cs="Times New Roman"/>
-          <w:color w:val="000000" w:themeColor="text1"/>
-          <w:sz w:val="36"/>
-          <w:szCs w:val="36"/>
-        </w:rPr>
-        <w:t>/</w:t>
-      </w:r>
-      <w:r>
-        <w:rPr>
-          <w:rFonts w:ascii="Times New Roman" w:hAnsi="Times New Roman" w:cs="Times New Roman"/>
-          <w:color w:val="000000" w:themeColor="text1"/>
-          <w:sz w:val="36"/>
-          <w:szCs w:val="36"/>
-        </w:rPr>
-        <w:t>workflows</w:t>
+        <w:t>Create package .github/workflows</w:t>
       </w:r>
     </w:p>
     <w:p>
@@ -8994,16 +8967,7 @@
           <w:sz w:val="36"/>
           <w:szCs w:val="36"/>
         </w:rPr>
-        <w:t>.github/workflows</w:t>
-      </w:r>
-      <w:r>
-        <w:rPr>
-          <w:rFonts w:ascii="Times New Roman" w:hAnsi="Times New Roman" w:cs="Times New Roman"/>
-          <w:color w:val="000000" w:themeColor="text1"/>
-          <w:sz w:val="36"/>
-          <w:szCs w:val="36"/>
-        </w:rPr>
-        <w:t>/ci.yml</w:t>
+        <w:t>.github/workflows/ci.yml</w:t>
       </w:r>
     </w:p>
     <w:p>
@@ -9494,55 +9458,7 @@
           <w:sz w:val="36"/>
           <w:szCs w:val="36"/>
         </w:rPr>
-        <w:t xml:space="preserve"> </w:t>
-      </w:r>
-      <w:r>
-        <w:rPr>
-          <w:rFonts w:ascii="Times New Roman" w:eastAsia="Times New Roman" w:hAnsi="Times New Roman" w:cs="Times New Roman"/>
-          <w:sz w:val="36"/>
-          <w:szCs w:val="36"/>
-        </w:rPr>
-        <w:t>b</w:t>
-      </w:r>
-      <w:r>
-        <w:rPr>
-          <w:rFonts w:ascii="Times New Roman" w:eastAsia="Times New Roman" w:hAnsi="Times New Roman" w:cs="Times New Roman"/>
-          <w:sz w:val="36"/>
-          <w:szCs w:val="36"/>
-        </w:rPr>
-        <w:t>uild</w:t>
-      </w:r>
-      <w:r>
-        <w:rPr>
-          <w:rFonts w:ascii="Times New Roman" w:eastAsia="Times New Roman" w:hAnsi="Times New Roman" w:cs="Times New Roman"/>
-          <w:sz w:val="36"/>
-          <w:szCs w:val="36"/>
-        </w:rPr>
-        <w:t>-</w:t>
-      </w:r>
-      <w:r>
-        <w:rPr>
-          <w:rFonts w:ascii="Times New Roman" w:eastAsia="Times New Roman" w:hAnsi="Times New Roman" w:cs="Times New Roman"/>
-          <w:sz w:val="36"/>
-          <w:szCs w:val="36"/>
-        </w:rPr>
-        <w:t>and</w:t>
-      </w:r>
-      <w:r>
-        <w:rPr>
-          <w:rFonts w:ascii="Times New Roman" w:eastAsia="Times New Roman" w:hAnsi="Times New Roman" w:cs="Times New Roman"/>
-          <w:sz w:val="36"/>
-          <w:szCs w:val="36"/>
-        </w:rPr>
-        <w:t>-</w:t>
-      </w:r>
-      <w:r>
-        <w:rPr>
-          <w:rFonts w:ascii="Times New Roman" w:eastAsia="Times New Roman" w:hAnsi="Times New Roman" w:cs="Times New Roman"/>
-          <w:sz w:val="36"/>
-          <w:szCs w:val="36"/>
-        </w:rPr>
-        <w:t>test</w:t>
+        <w:t xml:space="preserve"> build-and-test</w:t>
       </w:r>
     </w:p>
     <w:p>
@@ -9591,6 +9507,4321 @@
         </w:rPr>
         <w:t>It means that I created CI successfully.</w:t>
       </w:r>
+    </w:p>
+    <w:p>
+      <w:pPr>
+        <w:rPr>
+          <w:rFonts w:ascii="Times New Roman" w:hAnsi="Times New Roman" w:cs="Times New Roman"/>
+          <w:color w:val="000000" w:themeColor="text1"/>
+          <w:sz w:val="36"/>
+          <w:szCs w:val="36"/>
+        </w:rPr>
+      </w:pPr>
+    </w:p>
+    <w:p>
+      <w:pPr>
+        <w:rPr>
+          <w:rFonts w:ascii="Times New Roman" w:hAnsi="Times New Roman" w:cs="Times New Roman"/>
+          <w:b/>
+          <w:bCs/>
+          <w:color w:val="000000" w:themeColor="text1"/>
+          <w:sz w:val="36"/>
+          <w:szCs w:val="36"/>
+        </w:rPr>
+      </w:pPr>
+      <w:r>
+        <w:rPr>
+          <w:rFonts w:ascii="Times New Roman" w:hAnsi="Times New Roman" w:cs="Times New Roman"/>
+          <w:b/>
+          <w:bCs/>
+          <w:color w:val="000000" w:themeColor="text1"/>
+          <w:sz w:val="36"/>
+          <w:szCs w:val="36"/>
+        </w:rPr>
+        <w:t>16.CD</w:t>
+      </w:r>
+    </w:p>
+    <w:p>
+      <w:pPr>
+        <w:rPr>
+          <w:rFonts w:ascii="Times New Roman" w:hAnsi="Times New Roman" w:cs="Times New Roman"/>
+          <w:b/>
+          <w:bCs/>
+          <w:color w:val="000000" w:themeColor="text1"/>
+          <w:sz w:val="36"/>
+          <w:szCs w:val="36"/>
+        </w:rPr>
+      </w:pPr>
+      <w:r>
+        <w:rPr>
+          <w:rFonts w:ascii="Times New Roman" w:hAnsi="Times New Roman" w:cs="Times New Roman"/>
+          <w:b/>
+          <w:bCs/>
+          <w:color w:val="000000" w:themeColor="text1"/>
+          <w:sz w:val="36"/>
+          <w:szCs w:val="36"/>
+        </w:rPr>
+        <w:t>a.Create th</w:t>
+      </w:r>
+      <w:r>
+        <w:rPr>
+          <w:rFonts w:ascii="Times New Roman" w:hAnsi="Times New Roman" w:cs="Times New Roman"/>
+          <w:b/>
+          <w:bCs/>
+          <w:color w:val="000000" w:themeColor="text1"/>
+          <w:sz w:val="36"/>
+          <w:szCs w:val="36"/>
+        </w:rPr>
+        <w:t>is</w:t>
+      </w:r>
+      <w:r>
+        <w:rPr>
+          <w:rFonts w:ascii="Times New Roman" w:hAnsi="Times New Roman" w:cs="Times New Roman"/>
+          <w:b/>
+          <w:bCs/>
+          <w:color w:val="000000" w:themeColor="text1"/>
+          <w:sz w:val="36"/>
+          <w:szCs w:val="36"/>
+        </w:rPr>
+        <w:t xml:space="preserve"> file</w:t>
+      </w:r>
+      <w:r>
+        <w:rPr>
+          <w:rFonts w:ascii="Times New Roman" w:hAnsi="Times New Roman" w:cs="Times New Roman"/>
+          <w:b/>
+          <w:bCs/>
+          <w:color w:val="000000" w:themeColor="text1"/>
+          <w:sz w:val="36"/>
+          <w:szCs w:val="36"/>
+        </w:rPr>
+        <w:t xml:space="preserve"> </w:t>
+      </w:r>
+    </w:p>
+    <w:p>
+      <w:pPr>
+        <w:rPr>
+          <w:rFonts w:ascii="Times New Roman" w:hAnsi="Times New Roman" w:cs="Times New Roman"/>
+          <w:color w:val="000000" w:themeColor="text1"/>
+          <w:sz w:val="36"/>
+          <w:szCs w:val="36"/>
+        </w:rPr>
+      </w:pPr>
+      <w:r>
+        <w:rPr>
+          <w:rFonts w:ascii="Times New Roman" w:hAnsi="Times New Roman" w:cs="Times New Roman"/>
+          <w:color w:val="000000" w:themeColor="text1"/>
+          <w:sz w:val="36"/>
+          <w:szCs w:val="36"/>
+        </w:rPr>
+        <w:t>Dockerfile</w:t>
+      </w:r>
+    </w:p>
+    <w:p>
+      <w:pPr>
+        <w:pStyle w:val="NormalWeb"/>
+        <w:rPr>
+          <w:sz w:val="36"/>
+          <w:szCs w:val="36"/>
+        </w:rPr>
+      </w:pPr>
+      <w:r>
+        <w:rPr>
+          <w:sz w:val="36"/>
+          <w:szCs w:val="36"/>
+        </w:rPr>
+        <w:t xml:space="preserve">Open </w:t>
+      </w:r>
+      <w:r>
+        <w:rPr>
+          <w:rStyle w:val="Strong"/>
+          <w:sz w:val="36"/>
+          <w:szCs w:val="36"/>
+        </w:rPr>
+        <w:t>Command Prompt</w:t>
+      </w:r>
+      <w:r>
+        <w:rPr>
+          <w:sz w:val="36"/>
+          <w:szCs w:val="36"/>
+        </w:rPr>
+        <w:t xml:space="preserve"> in:</w:t>
+      </w:r>
+    </w:p>
+    <w:p>
+      <w:pPr>
+        <w:pStyle w:val="HTMLPreformatted"/>
+        <w:rPr>
+          <w:rFonts w:ascii="Times New Roman" w:hAnsi="Times New Roman" w:cs="Times New Roman"/>
+          <w:sz w:val="36"/>
+          <w:szCs w:val="36"/>
+        </w:rPr>
+      </w:pPr>
+      <w:r>
+        <w:rPr>
+          <w:rStyle w:val="HTMLCode"/>
+          <w:rFonts w:ascii="Times New Roman" w:hAnsi="Times New Roman" w:cs="Times New Roman"/>
+          <w:sz w:val="36"/>
+          <w:szCs w:val="36"/>
+        </w:rPr>
+        <w:t>F:\IT\IT normal\Java\Projects\API\Test\JavaAPI_DUC_Company1</w:t>
+      </w:r>
+    </w:p>
+    <w:p>
+      <w:pPr>
+        <w:pStyle w:val="NormalWeb"/>
+        <w:rPr>
+          <w:sz w:val="36"/>
+          <w:szCs w:val="36"/>
+        </w:rPr>
+      </w:pPr>
+      <w:r>
+        <w:rPr>
+          <w:sz w:val="36"/>
+          <w:szCs w:val="36"/>
+        </w:rPr>
+        <w:t>Run:</w:t>
+      </w:r>
+    </w:p>
+    <w:p>
+      <w:pPr>
+        <w:pStyle w:val="HTMLPreformatted"/>
+        <w:rPr>
+          <w:rFonts w:ascii="Times New Roman" w:hAnsi="Times New Roman" w:cs="Times New Roman"/>
+          <w:sz w:val="36"/>
+          <w:szCs w:val="36"/>
+        </w:rPr>
+      </w:pPr>
+      <w:r>
+        <w:rPr>
+          <w:rStyle w:val="HTMLCode"/>
+          <w:rFonts w:ascii="Times New Roman" w:hAnsi="Times New Roman" w:cs="Times New Roman"/>
+          <w:sz w:val="36"/>
+          <w:szCs w:val="36"/>
+        </w:rPr>
+        <w:t>mvnw.cmd clean package -DskipTests</w:t>
+      </w:r>
+    </w:p>
+    <w:p>
+      <w:pPr>
+        <w:pStyle w:val="NormalWeb"/>
+        <w:rPr>
+          <w:sz w:val="36"/>
+          <w:szCs w:val="36"/>
+        </w:rPr>
+      </w:pPr>
+      <w:r>
+        <w:rPr>
+          <w:sz w:val="36"/>
+          <w:szCs w:val="36"/>
+        </w:rPr>
+        <w:t>You should eventually see:</w:t>
+      </w:r>
+    </w:p>
+    <w:p>
+      <w:pPr>
+        <w:pStyle w:val="HTMLPreformatted"/>
+        <w:rPr>
+          <w:rFonts w:ascii="Times New Roman" w:hAnsi="Times New Roman" w:cs="Times New Roman"/>
+          <w:sz w:val="36"/>
+          <w:szCs w:val="36"/>
+        </w:rPr>
+      </w:pPr>
+      <w:r>
+        <w:rPr>
+          <w:rStyle w:val="HTMLCode"/>
+          <w:rFonts w:ascii="Times New Roman" w:hAnsi="Times New Roman" w:cs="Times New Roman"/>
+          <w:sz w:val="36"/>
+          <w:szCs w:val="36"/>
+        </w:rPr>
+        <w:t>BUILD SUCCESS</w:t>
+      </w:r>
+    </w:p>
+    <w:p>
+      <w:pPr>
+        <w:pStyle w:val="NormalWeb"/>
+        <w:rPr>
+          <w:sz w:val="36"/>
+          <w:szCs w:val="36"/>
+        </w:rPr>
+      </w:pPr>
+      <w:r>
+        <w:rPr>
+          <w:sz w:val="36"/>
+          <w:szCs w:val="36"/>
+        </w:rPr>
+        <w:t>Then check:</w:t>
+      </w:r>
+    </w:p>
+    <w:p>
+      <w:pPr>
+        <w:pStyle w:val="HTMLPreformatted"/>
+        <w:rPr>
+          <w:rFonts w:ascii="Times New Roman" w:hAnsi="Times New Roman" w:cs="Times New Roman"/>
+          <w:sz w:val="36"/>
+          <w:szCs w:val="36"/>
+        </w:rPr>
+      </w:pPr>
+      <w:r>
+        <w:rPr>
+          <w:rStyle w:val="HTMLCode"/>
+          <w:rFonts w:ascii="Times New Roman" w:hAnsi="Times New Roman" w:cs="Times New Roman"/>
+          <w:sz w:val="36"/>
+          <w:szCs w:val="36"/>
+        </w:rPr>
+        <w:t>dir target</w:t>
+      </w:r>
+    </w:p>
+    <w:p>
+      <w:pPr>
+        <w:pStyle w:val="NormalWeb"/>
+        <w:rPr>
+          <w:sz w:val="36"/>
+          <w:szCs w:val="36"/>
+        </w:rPr>
+      </w:pPr>
+      <w:r>
+        <w:rPr>
+          <w:sz w:val="36"/>
+          <w:szCs w:val="36"/>
+        </w:rPr>
+        <w:t xml:space="preserve">You should see a </w:t>
+      </w:r>
+      <w:r>
+        <w:rPr>
+          <w:rStyle w:val="HTMLCode"/>
+          <w:rFonts w:ascii="Times New Roman" w:hAnsi="Times New Roman" w:cs="Times New Roman"/>
+          <w:sz w:val="36"/>
+          <w:szCs w:val="36"/>
+        </w:rPr>
+        <w:t>.jar</w:t>
+      </w:r>
+      <w:r>
+        <w:rPr>
+          <w:sz w:val="36"/>
+          <w:szCs w:val="36"/>
+        </w:rPr>
+        <w:t xml:space="preserve"> file.</w:t>
+      </w:r>
+    </w:p>
+    <w:p>
+      <w:pPr>
+        <w:pStyle w:val="NormalWeb"/>
+        <w:rPr>
+          <w:sz w:val="36"/>
+          <w:szCs w:val="36"/>
+        </w:rPr>
+      </w:pPr>
+      <w:r>
+        <w:rPr>
+          <w:sz w:val="36"/>
+          <w:szCs w:val="36"/>
+        </w:rPr>
+        <w:t>For example:</w:t>
+      </w:r>
+    </w:p>
+    <w:p>
+      <w:pPr>
+        <w:pStyle w:val="HTMLPreformatted"/>
+        <w:rPr>
+          <w:rStyle w:val="HTMLCode"/>
+          <w:rFonts w:ascii="Times New Roman" w:hAnsi="Times New Roman" w:cs="Times New Roman"/>
+          <w:sz w:val="36"/>
+          <w:szCs w:val="36"/>
+        </w:rPr>
+      </w:pPr>
+      <w:r>
+        <w:rPr>
+          <w:rStyle w:val="HTMLCode"/>
+          <w:rFonts w:ascii="Times New Roman" w:hAnsi="Times New Roman" w:cs="Times New Roman"/>
+          <w:sz w:val="36"/>
+          <w:szCs w:val="36"/>
+        </w:rPr>
+        <w:t>target</w:t>
+      </w:r>
+    </w:p>
+    <w:p>
+      <w:pPr>
+        <w:pStyle w:val="HTMLPreformatted"/>
+        <w:rPr>
+          <w:rStyle w:val="HTMLCode"/>
+          <w:rFonts w:ascii="Times New Roman" w:hAnsi="Times New Roman" w:cs="Times New Roman"/>
+          <w:sz w:val="36"/>
+          <w:szCs w:val="36"/>
+        </w:rPr>
+      </w:pPr>
+      <w:r>
+        <w:rPr>
+          <w:rStyle w:val="HTMLCode"/>
+          <w:rFonts w:ascii="Times New Roman" w:hAnsi="Times New Roman" w:cs="Times New Roman"/>
+          <w:sz w:val="36"/>
+          <w:szCs w:val="36"/>
+        </w:rPr>
+        <w:t>│</w:t>
+      </w:r>
+    </w:p>
+    <w:p>
+      <w:pPr>
+        <w:pStyle w:val="HTMLPreformatted"/>
+        <w:rPr>
+          <w:rStyle w:val="HTMLCode"/>
+          <w:rFonts w:ascii="Times New Roman" w:hAnsi="Times New Roman" w:cs="Times New Roman"/>
+          <w:sz w:val="36"/>
+          <w:szCs w:val="36"/>
+        </w:rPr>
+      </w:pPr>
+      <w:r>
+        <w:rPr>
+          <w:rStyle w:val="HTMLCode"/>
+          <w:rFonts w:ascii="Times New Roman" w:hAnsi="Times New Roman" w:cs="Times New Roman"/>
+          <w:sz w:val="36"/>
+          <w:szCs w:val="36"/>
+        </w:rPr>
+        <w:t>├── JavaAPI_DUC_Company1-0.0.1-SNAPSHOT.jar</w:t>
+      </w:r>
+    </w:p>
+    <w:p>
+      <w:pPr>
+        <w:pStyle w:val="HTMLPreformatted"/>
+        <w:rPr>
+          <w:rStyle w:val="HTMLCode"/>
+          <w:rFonts w:ascii="Times New Roman" w:hAnsi="Times New Roman" w:cs="Times New Roman"/>
+          <w:sz w:val="36"/>
+          <w:szCs w:val="36"/>
+        </w:rPr>
+      </w:pPr>
+      <w:r>
+        <w:rPr>
+          <w:rStyle w:val="HTMLCode"/>
+          <w:rFonts w:ascii="Times New Roman" w:hAnsi="Times New Roman" w:cs="Times New Roman"/>
+          <w:sz w:val="36"/>
+          <w:szCs w:val="36"/>
+        </w:rPr>
+        <w:lastRenderedPageBreak/>
+        <w:t>├── classes</w:t>
+      </w:r>
+    </w:p>
+    <w:p>
+      <w:pPr>
+        <w:pStyle w:val="HTMLPreformatted"/>
+        <w:rPr>
+          <w:rStyle w:val="HTMLCode"/>
+          <w:rFonts w:ascii="Times New Roman" w:hAnsi="Times New Roman" w:cs="Times New Roman"/>
+          <w:sz w:val="36"/>
+          <w:szCs w:val="36"/>
+        </w:rPr>
+      </w:pPr>
+      <w:r>
+        <w:rPr>
+          <w:rStyle w:val="HTMLCode"/>
+          <w:rFonts w:ascii="Times New Roman" w:hAnsi="Times New Roman" w:cs="Times New Roman"/>
+          <w:sz w:val="36"/>
+          <w:szCs w:val="36"/>
+        </w:rPr>
+        <w:t>├── test-classes</w:t>
+      </w:r>
+    </w:p>
+    <w:p>
+      <w:pPr>
+        <w:pStyle w:val="HTMLPreformatted"/>
+        <w:rPr>
+          <w:rFonts w:ascii="Times New Roman" w:hAnsi="Times New Roman" w:cs="Times New Roman"/>
+          <w:sz w:val="36"/>
+          <w:szCs w:val="36"/>
+        </w:rPr>
+      </w:pPr>
+      <w:r>
+        <w:rPr>
+          <w:rStyle w:val="HTMLCode"/>
+          <w:rFonts w:ascii="Times New Roman" w:hAnsi="Times New Roman" w:cs="Times New Roman"/>
+          <w:sz w:val="36"/>
+          <w:szCs w:val="36"/>
+        </w:rPr>
+        <w:t>└── ...</w:t>
+      </w:r>
+    </w:p>
+    <w:p>
+      <w:pPr>
+        <w:rPr>
+          <w:rFonts w:ascii="Times New Roman" w:hAnsi="Times New Roman" w:cs="Times New Roman"/>
+          <w:sz w:val="36"/>
+          <w:szCs w:val="36"/>
+        </w:rPr>
+      </w:pPr>
+      <w:r>
+        <w:rPr>
+          <w:rFonts w:ascii="Times New Roman" w:hAnsi="Times New Roman" w:cs="Times New Roman"/>
+          <w:sz w:val="36"/>
+          <w:szCs w:val="36"/>
+        </w:rPr>
+        <w:pict w14:anchorId="016EBAF2">
+          <v:rect id="_x0000_i1028" style="width:0;height:1.5pt" o:hralign="center" o:hrstd="t" o:hr="t" fillcolor="#a0a0a0" stroked="f"/>
+        </w:pict>
+      </w:r>
+    </w:p>
+    <w:p>
+      <w:pPr>
+        <w:pStyle w:val="Heading1"/>
+        <w:rPr>
+          <w:rFonts w:ascii="Times New Roman" w:hAnsi="Times New Roman" w:cs="Times New Roman"/>
+          <w:sz w:val="36"/>
+          <w:szCs w:val="36"/>
+        </w:rPr>
+      </w:pPr>
+      <w:r>
+        <w:rPr>
+          <w:rFonts w:ascii="Times New Roman" w:hAnsi="Times New Roman" w:cs="Times New Roman"/>
+          <w:sz w:val="36"/>
+          <w:szCs w:val="36"/>
+        </w:rPr>
+        <w:t>Build the Docker image</w:t>
+      </w:r>
+    </w:p>
+    <w:p>
+      <w:pPr>
+        <w:pStyle w:val="NormalWeb"/>
+        <w:rPr>
+          <w:sz w:val="36"/>
+          <w:szCs w:val="36"/>
+        </w:rPr>
+      </w:pPr>
+      <w:r>
+        <w:rPr>
+          <w:sz w:val="36"/>
+          <w:szCs w:val="36"/>
+        </w:rPr>
+        <w:t>Now run:</w:t>
+      </w:r>
+    </w:p>
+    <w:p>
+      <w:pPr>
+        <w:pStyle w:val="HTMLPreformatted"/>
+        <w:rPr>
+          <w:rFonts w:ascii="Times New Roman" w:hAnsi="Times New Roman" w:cs="Times New Roman"/>
+          <w:sz w:val="36"/>
+          <w:szCs w:val="36"/>
+        </w:rPr>
+      </w:pPr>
+      <w:r>
+        <w:rPr>
+          <w:rStyle w:val="HTMLCode"/>
+          <w:rFonts w:ascii="Times New Roman" w:hAnsi="Times New Roman" w:cs="Times New Roman"/>
+          <w:sz w:val="36"/>
+          <w:szCs w:val="36"/>
+        </w:rPr>
+        <w:t>docker build -t javaapi-duc-company1:1.0 .</w:t>
+      </w:r>
+    </w:p>
+    <w:p>
+      <w:pPr>
+        <w:pStyle w:val="NormalWeb"/>
+        <w:rPr>
+          <w:sz w:val="36"/>
+          <w:szCs w:val="36"/>
+        </w:rPr>
+      </w:pPr>
+      <w:r>
+        <w:rPr>
+          <w:sz w:val="36"/>
+          <w:szCs w:val="36"/>
+        </w:rPr>
+        <w:t>Let's break this down:</w:t>
+      </w:r>
+    </w:p>
+    <w:p>
+      <w:pPr>
+        <w:pStyle w:val="HTMLPreformatted"/>
+        <w:rPr>
+          <w:rFonts w:ascii="Times New Roman" w:hAnsi="Times New Roman" w:cs="Times New Roman"/>
+          <w:sz w:val="36"/>
+          <w:szCs w:val="36"/>
+        </w:rPr>
+      </w:pPr>
+      <w:r>
+        <w:rPr>
+          <w:rStyle w:val="HTMLCode"/>
+          <w:rFonts w:ascii="Times New Roman" w:hAnsi="Times New Roman" w:cs="Times New Roman"/>
+          <w:sz w:val="36"/>
+          <w:szCs w:val="36"/>
+        </w:rPr>
+        <w:t>docker build</w:t>
+      </w:r>
+    </w:p>
+    <w:p>
+      <w:pPr>
+        <w:pStyle w:val="NormalWeb"/>
+        <w:rPr>
+          <w:sz w:val="36"/>
+          <w:szCs w:val="36"/>
+        </w:rPr>
+      </w:pPr>
+      <w:r>
+        <w:rPr>
+          <w:sz w:val="36"/>
+          <w:szCs w:val="36"/>
+        </w:rPr>
+        <w:t>means:</w:t>
+      </w:r>
+    </w:p>
+    <w:p>
+      <w:pPr>
+        <w:pStyle w:val="NormalWeb"/>
+        <w:rPr>
+          <w:sz w:val="36"/>
+          <w:szCs w:val="36"/>
+        </w:rPr>
+      </w:pPr>
+      <w:r>
+        <w:rPr>
+          <w:sz w:val="36"/>
+          <w:szCs w:val="36"/>
+        </w:rPr>
+        <w:t>Build a Docker image.</w:t>
+      </w:r>
+    </w:p>
+    <w:p>
+      <w:pPr>
+        <w:pStyle w:val="HTMLPreformatted"/>
+        <w:rPr>
+          <w:rFonts w:ascii="Times New Roman" w:hAnsi="Times New Roman" w:cs="Times New Roman"/>
+          <w:sz w:val="36"/>
+          <w:szCs w:val="36"/>
+        </w:rPr>
+      </w:pPr>
+      <w:r>
+        <w:rPr>
+          <w:rStyle w:val="HTMLCode"/>
+          <w:rFonts w:ascii="Times New Roman" w:hAnsi="Times New Roman" w:cs="Times New Roman"/>
+          <w:sz w:val="36"/>
+          <w:szCs w:val="36"/>
+        </w:rPr>
+        <w:t>-t javaapi-duc-company1:1.0</w:t>
+      </w:r>
+    </w:p>
+    <w:p>
+      <w:pPr>
+        <w:pStyle w:val="NormalWeb"/>
+        <w:rPr>
+          <w:sz w:val="36"/>
+          <w:szCs w:val="36"/>
+        </w:rPr>
+      </w:pPr>
+      <w:r>
+        <w:rPr>
+          <w:sz w:val="36"/>
+          <w:szCs w:val="36"/>
+        </w:rPr>
+        <w:t>gives the image a name and tag:</w:t>
+      </w:r>
+    </w:p>
+    <w:p>
+      <w:pPr>
+        <w:pStyle w:val="HTMLPreformatted"/>
+        <w:rPr>
+          <w:rStyle w:val="HTMLCode"/>
+          <w:rFonts w:ascii="Times New Roman" w:hAnsi="Times New Roman" w:cs="Times New Roman"/>
+          <w:sz w:val="36"/>
+          <w:szCs w:val="36"/>
+        </w:rPr>
+      </w:pPr>
+      <w:r>
+        <w:rPr>
+          <w:rStyle w:val="HTMLCode"/>
+          <w:rFonts w:ascii="Times New Roman" w:hAnsi="Times New Roman" w:cs="Times New Roman"/>
+          <w:sz w:val="36"/>
+          <w:szCs w:val="36"/>
+        </w:rPr>
+        <w:t>name = javaapi-duc-company1</w:t>
+      </w:r>
+    </w:p>
+    <w:p>
+      <w:pPr>
+        <w:pStyle w:val="HTMLPreformatted"/>
+        <w:rPr>
+          <w:rFonts w:ascii="Times New Roman" w:hAnsi="Times New Roman" w:cs="Times New Roman"/>
+          <w:sz w:val="36"/>
+          <w:szCs w:val="36"/>
+        </w:rPr>
+      </w:pPr>
+      <w:r>
+        <w:rPr>
+          <w:rStyle w:val="HTMLCode"/>
+          <w:rFonts w:ascii="Times New Roman" w:hAnsi="Times New Roman" w:cs="Times New Roman"/>
+          <w:sz w:val="36"/>
+          <w:szCs w:val="36"/>
+        </w:rPr>
+        <w:t>tag  = 1.0</w:t>
+      </w:r>
+    </w:p>
+    <w:p>
+      <w:pPr>
+        <w:pStyle w:val="NormalWeb"/>
+        <w:rPr>
+          <w:sz w:val="36"/>
+          <w:szCs w:val="36"/>
+        </w:rPr>
+      </w:pPr>
+      <w:r>
+        <w:rPr>
+          <w:sz w:val="36"/>
+          <w:szCs w:val="36"/>
+        </w:rPr>
+        <w:t>And:</w:t>
+      </w:r>
+    </w:p>
+    <w:p>
+      <w:pPr>
+        <w:pStyle w:val="HTMLPreformatted"/>
+        <w:rPr>
+          <w:rFonts w:ascii="Times New Roman" w:hAnsi="Times New Roman" w:cs="Times New Roman"/>
+          <w:sz w:val="36"/>
+          <w:szCs w:val="36"/>
+        </w:rPr>
+      </w:pPr>
+      <w:r>
+        <w:rPr>
+          <w:rStyle w:val="HTMLCode"/>
+          <w:rFonts w:ascii="Times New Roman" w:hAnsi="Times New Roman" w:cs="Times New Roman"/>
+          <w:sz w:val="36"/>
+          <w:szCs w:val="36"/>
+        </w:rPr>
+        <w:t>.</w:t>
+      </w:r>
+    </w:p>
+    <w:p>
+      <w:pPr>
+        <w:pStyle w:val="NormalWeb"/>
+        <w:rPr>
+          <w:sz w:val="36"/>
+          <w:szCs w:val="36"/>
+        </w:rPr>
+      </w:pPr>
+      <w:r>
+        <w:rPr>
+          <w:sz w:val="36"/>
+          <w:szCs w:val="36"/>
+        </w:rPr>
+        <w:t>means:</w:t>
+      </w:r>
+    </w:p>
+    <w:p>
+      <w:pPr>
+        <w:pStyle w:val="NormalWeb"/>
+        <w:rPr>
+          <w:sz w:val="36"/>
+          <w:szCs w:val="36"/>
+        </w:rPr>
+      </w:pPr>
+      <w:r>
+        <w:rPr>
+          <w:sz w:val="36"/>
+          <w:szCs w:val="36"/>
+        </w:rPr>
+        <w:t>Use the current directory as the Docker build context.</w:t>
+      </w:r>
+    </w:p>
+    <w:p>
+      <w:pPr>
+        <w:pStyle w:val="NormalWeb"/>
+        <w:rPr>
+          <w:sz w:val="36"/>
+          <w:szCs w:val="36"/>
+        </w:rPr>
+      </w:pPr>
+      <w:r>
+        <w:rPr>
+          <w:sz w:val="36"/>
+          <w:szCs w:val="36"/>
+        </w:rPr>
+        <w:t>So Docker sees:</w:t>
+      </w:r>
+    </w:p>
+    <w:p>
+      <w:pPr>
+        <w:pStyle w:val="HTMLPreformatted"/>
+        <w:rPr>
+          <w:rStyle w:val="HTMLCode"/>
+          <w:rFonts w:ascii="Times New Roman" w:hAnsi="Times New Roman" w:cs="Times New Roman"/>
+          <w:sz w:val="36"/>
+          <w:szCs w:val="36"/>
+        </w:rPr>
+      </w:pPr>
+      <w:r>
+        <w:rPr>
+          <w:rStyle w:val="HTMLCode"/>
+          <w:rFonts w:ascii="Times New Roman" w:hAnsi="Times New Roman" w:cs="Times New Roman"/>
+          <w:sz w:val="36"/>
+          <w:szCs w:val="36"/>
+        </w:rPr>
+        <w:lastRenderedPageBreak/>
+        <w:t>JavaAPI_DUC_Company1</w:t>
+      </w:r>
+    </w:p>
+    <w:p>
+      <w:pPr>
+        <w:pStyle w:val="HTMLPreformatted"/>
+        <w:rPr>
+          <w:rStyle w:val="HTMLCode"/>
+          <w:rFonts w:ascii="Times New Roman" w:hAnsi="Times New Roman" w:cs="Times New Roman"/>
+          <w:sz w:val="36"/>
+          <w:szCs w:val="36"/>
+        </w:rPr>
+      </w:pPr>
+      <w:r>
+        <w:rPr>
+          <w:rStyle w:val="HTMLCode"/>
+          <w:rFonts w:ascii="Times New Roman" w:hAnsi="Times New Roman" w:cs="Times New Roman"/>
+          <w:sz w:val="36"/>
+          <w:szCs w:val="36"/>
+        </w:rPr>
+        <w:t>│</w:t>
+      </w:r>
+    </w:p>
+    <w:p>
+      <w:pPr>
+        <w:pStyle w:val="HTMLPreformatted"/>
+        <w:rPr>
+          <w:rStyle w:val="HTMLCode"/>
+          <w:rFonts w:ascii="Times New Roman" w:hAnsi="Times New Roman" w:cs="Times New Roman"/>
+          <w:sz w:val="36"/>
+          <w:szCs w:val="36"/>
+        </w:rPr>
+      </w:pPr>
+      <w:r>
+        <w:rPr>
+          <w:rStyle w:val="HTMLCode"/>
+          <w:rFonts w:ascii="Times New Roman" w:hAnsi="Times New Roman" w:cs="Times New Roman"/>
+          <w:sz w:val="36"/>
+          <w:szCs w:val="36"/>
+        </w:rPr>
+        <w:t>├── Dockerfile</w:t>
+      </w:r>
+    </w:p>
+    <w:p>
+      <w:pPr>
+        <w:pStyle w:val="HTMLPreformatted"/>
+        <w:rPr>
+          <w:rStyle w:val="HTMLCode"/>
+          <w:rFonts w:ascii="Times New Roman" w:hAnsi="Times New Roman" w:cs="Times New Roman"/>
+          <w:sz w:val="36"/>
+          <w:szCs w:val="36"/>
+        </w:rPr>
+      </w:pPr>
+      <w:r>
+        <w:rPr>
+          <w:rStyle w:val="HTMLCode"/>
+          <w:rFonts w:ascii="Times New Roman" w:hAnsi="Times New Roman" w:cs="Times New Roman"/>
+          <w:sz w:val="36"/>
+          <w:szCs w:val="36"/>
+        </w:rPr>
+        <w:t>├── pom.xml</w:t>
+      </w:r>
+    </w:p>
+    <w:p>
+      <w:pPr>
+        <w:pStyle w:val="HTMLPreformatted"/>
+        <w:rPr>
+          <w:rStyle w:val="HTMLCode"/>
+          <w:rFonts w:ascii="Times New Roman" w:hAnsi="Times New Roman" w:cs="Times New Roman"/>
+          <w:sz w:val="36"/>
+          <w:szCs w:val="36"/>
+        </w:rPr>
+      </w:pPr>
+      <w:r>
+        <w:rPr>
+          <w:rStyle w:val="HTMLCode"/>
+          <w:rFonts w:ascii="Times New Roman" w:hAnsi="Times New Roman" w:cs="Times New Roman"/>
+          <w:sz w:val="36"/>
+          <w:szCs w:val="36"/>
+        </w:rPr>
+        <w:t>├── target</w:t>
+      </w:r>
+    </w:p>
+    <w:p>
+      <w:pPr>
+        <w:pStyle w:val="HTMLPreformatted"/>
+        <w:rPr>
+          <w:rStyle w:val="HTMLCode"/>
+          <w:rFonts w:ascii="Times New Roman" w:hAnsi="Times New Roman" w:cs="Times New Roman"/>
+          <w:sz w:val="36"/>
+          <w:szCs w:val="36"/>
+        </w:rPr>
+      </w:pPr>
+      <w:r>
+        <w:rPr>
+          <w:rStyle w:val="HTMLCode"/>
+          <w:rFonts w:ascii="Times New Roman" w:hAnsi="Times New Roman" w:cs="Times New Roman"/>
+          <w:sz w:val="36"/>
+          <w:szCs w:val="36"/>
+        </w:rPr>
+        <w:t>│   └── *.jar</w:t>
+      </w:r>
+    </w:p>
+    <w:p>
+      <w:pPr>
+        <w:pStyle w:val="HTMLPreformatted"/>
+        <w:rPr>
+          <w:rFonts w:ascii="Times New Roman" w:hAnsi="Times New Roman" w:cs="Times New Roman"/>
+          <w:sz w:val="36"/>
+          <w:szCs w:val="36"/>
+        </w:rPr>
+      </w:pPr>
+      <w:r>
+        <w:rPr>
+          <w:rStyle w:val="HTMLCode"/>
+          <w:rFonts w:ascii="Times New Roman" w:hAnsi="Times New Roman" w:cs="Times New Roman"/>
+          <w:sz w:val="36"/>
+          <w:szCs w:val="36"/>
+        </w:rPr>
+        <w:t>└── ...</w:t>
+      </w:r>
+    </w:p>
+    <w:p>
+      <w:pPr>
+        <w:rPr>
+          <w:rFonts w:ascii="Times New Roman" w:hAnsi="Times New Roman" w:cs="Times New Roman"/>
+          <w:sz w:val="36"/>
+          <w:szCs w:val="36"/>
+        </w:rPr>
+      </w:pPr>
+      <w:r>
+        <w:rPr>
+          <w:rFonts w:ascii="Times New Roman" w:hAnsi="Times New Roman" w:cs="Times New Roman"/>
+          <w:sz w:val="36"/>
+          <w:szCs w:val="36"/>
+        </w:rPr>
+        <w:pict w14:anchorId="10068592">
+          <v:rect id="_x0000_i1029" style="width:0;height:1.5pt" o:hralign="center" o:hrstd="t" o:hr="t" fillcolor="#a0a0a0" stroked="f"/>
+        </w:pict>
+      </w:r>
+    </w:p>
+    <w:p>
+      <w:pPr>
+        <w:pStyle w:val="Heading1"/>
+        <w:rPr>
+          <w:rFonts w:ascii="Times New Roman" w:hAnsi="Times New Roman" w:cs="Times New Roman"/>
+          <w:sz w:val="36"/>
+          <w:szCs w:val="36"/>
+        </w:rPr>
+      </w:pPr>
+      <w:r>
+        <w:rPr>
+          <w:rFonts w:ascii="Times New Roman" w:hAnsi="Times New Roman" w:cs="Times New Roman"/>
+          <w:sz w:val="36"/>
+          <w:szCs w:val="36"/>
+        </w:rPr>
+        <w:t>Check the image</w:t>
+      </w:r>
+    </w:p>
+    <w:p>
+      <w:pPr>
+        <w:pStyle w:val="NormalWeb"/>
+        <w:rPr>
+          <w:sz w:val="36"/>
+          <w:szCs w:val="36"/>
+        </w:rPr>
+      </w:pPr>
+      <w:r>
+        <w:rPr>
+          <w:sz w:val="36"/>
+          <w:szCs w:val="36"/>
+        </w:rPr>
+        <w:t>Run:</w:t>
+      </w:r>
+    </w:p>
+    <w:p>
+      <w:pPr>
+        <w:pStyle w:val="HTMLPreformatted"/>
+        <w:rPr>
+          <w:rFonts w:ascii="Times New Roman" w:hAnsi="Times New Roman" w:cs="Times New Roman"/>
+          <w:sz w:val="36"/>
+          <w:szCs w:val="36"/>
+        </w:rPr>
+      </w:pPr>
+      <w:r>
+        <w:rPr>
+          <w:rStyle w:val="HTMLCode"/>
+          <w:rFonts w:ascii="Times New Roman" w:hAnsi="Times New Roman" w:cs="Times New Roman"/>
+          <w:sz w:val="36"/>
+          <w:szCs w:val="36"/>
+        </w:rPr>
+        <w:t>docker images</w:t>
+      </w:r>
+    </w:p>
+    <w:p>
+      <w:pPr>
+        <w:pStyle w:val="NormalWeb"/>
+        <w:rPr>
+          <w:sz w:val="36"/>
+          <w:szCs w:val="36"/>
+        </w:rPr>
+      </w:pPr>
+      <w:r>
+        <w:rPr>
+          <w:sz w:val="36"/>
+          <w:szCs w:val="36"/>
+        </w:rPr>
+        <w:t>You should see something similar to:</w:t>
+      </w:r>
+    </w:p>
+    <w:p>
+      <w:pPr>
+        <w:pStyle w:val="HTMLPreformatted"/>
+        <w:rPr>
+          <w:rStyle w:val="HTMLCode"/>
+          <w:rFonts w:ascii="Times New Roman" w:hAnsi="Times New Roman" w:cs="Times New Roman"/>
+          <w:sz w:val="36"/>
+          <w:szCs w:val="36"/>
+        </w:rPr>
+      </w:pPr>
+      <w:r>
+        <w:rPr>
+          <w:rStyle w:val="HTMLCode"/>
+          <w:rFonts w:ascii="Times New Roman" w:hAnsi="Times New Roman" w:cs="Times New Roman"/>
+          <w:sz w:val="36"/>
+          <w:szCs w:val="36"/>
+        </w:rPr>
+        <w:t>REPOSITORY                TAG       IMAGE ID       ...</w:t>
+      </w:r>
+    </w:p>
+    <w:p>
+      <w:pPr>
+        <w:pStyle w:val="HTMLPreformatted"/>
+        <w:rPr>
+          <w:rFonts w:ascii="Times New Roman" w:hAnsi="Times New Roman" w:cs="Times New Roman"/>
+          <w:sz w:val="36"/>
+          <w:szCs w:val="36"/>
+        </w:rPr>
+      </w:pPr>
+      <w:r>
+        <w:rPr>
+          <w:rStyle w:val="HTMLCode"/>
+          <w:rFonts w:ascii="Times New Roman" w:hAnsi="Times New Roman" w:cs="Times New Roman"/>
+          <w:sz w:val="36"/>
+          <w:szCs w:val="36"/>
+        </w:rPr>
+        <w:t>javaapi-duc-company1     1.0       xxxxxxxxxxxx   ...</w:t>
+      </w:r>
+    </w:p>
+    <w:p>
+      <w:pPr>
+        <w:pStyle w:val="NormalWeb"/>
+        <w:rPr>
+          <w:sz w:val="36"/>
+          <w:szCs w:val="36"/>
+        </w:rPr>
+      </w:pPr>
+      <w:r>
+        <w:rPr>
+          <w:sz w:val="36"/>
+          <w:szCs w:val="36"/>
+        </w:rPr>
+        <w:t xml:space="preserve">Congratulations — you've created your first Docker image for your Spring Boot project. </w:t>
+      </w:r>
+      <w:r>
+        <w:rPr>
+          <w:rFonts w:ascii="Segoe UI Emoji" w:hAnsi="Segoe UI Emoji" w:cs="Segoe UI Emoji"/>
+          <w:sz w:val="36"/>
+          <w:szCs w:val="36"/>
+        </w:rPr>
+        <w:t>🎉</w:t>
+      </w:r>
+    </w:p>
+    <w:p>
+      <w:pPr>
+        <w:rPr>
+          <w:rFonts w:ascii="Times New Roman" w:hAnsi="Times New Roman" w:cs="Times New Roman"/>
+          <w:sz w:val="36"/>
+          <w:szCs w:val="36"/>
+        </w:rPr>
+      </w:pPr>
+      <w:r>
+        <w:rPr>
+          <w:rFonts w:ascii="Times New Roman" w:hAnsi="Times New Roman" w:cs="Times New Roman"/>
+          <w:sz w:val="36"/>
+          <w:szCs w:val="36"/>
+        </w:rPr>
+        <w:pict w14:anchorId="653EF998">
+          <v:rect id="_x0000_i1030" style="width:0;height:1.5pt" o:hralign="center" o:hrstd="t" o:hr="t" fillcolor="#a0a0a0" stroked="f"/>
+        </w:pict>
+      </w:r>
+    </w:p>
+    <w:p>
+      <w:pPr>
+        <w:pStyle w:val="Heading1"/>
+        <w:rPr>
+          <w:rFonts w:ascii="Times New Roman" w:hAnsi="Times New Roman" w:cs="Times New Roman"/>
+          <w:sz w:val="36"/>
+          <w:szCs w:val="36"/>
+        </w:rPr>
+      </w:pPr>
+      <w:r>
+        <w:rPr>
+          <w:rFonts w:ascii="Times New Roman" w:hAnsi="Times New Roman" w:cs="Times New Roman"/>
+          <w:sz w:val="36"/>
+          <w:szCs w:val="36"/>
+        </w:rPr>
+        <w:t xml:space="preserve"> Run the container</w:t>
+      </w:r>
+    </w:p>
+    <w:p>
+      <w:pPr>
+        <w:pStyle w:val="NormalWeb"/>
+        <w:rPr>
+          <w:sz w:val="36"/>
+          <w:szCs w:val="36"/>
+        </w:rPr>
+      </w:pPr>
+      <w:r>
+        <w:rPr>
+          <w:sz w:val="36"/>
+          <w:szCs w:val="36"/>
+        </w:rPr>
+        <w:t>Now run:</w:t>
+      </w:r>
+    </w:p>
+    <w:p>
+      <w:pPr>
+        <w:pStyle w:val="HTMLPreformatted"/>
+        <w:rPr>
+          <w:rFonts w:ascii="Times New Roman" w:hAnsi="Times New Roman" w:cs="Times New Roman"/>
+          <w:sz w:val="36"/>
+          <w:szCs w:val="36"/>
+        </w:rPr>
+      </w:pPr>
+      <w:r>
+        <w:rPr>
+          <w:rStyle w:val="HTMLCode"/>
+          <w:rFonts w:ascii="Times New Roman" w:hAnsi="Times New Roman" w:cs="Times New Roman"/>
+          <w:sz w:val="36"/>
+          <w:szCs w:val="36"/>
+        </w:rPr>
+        <w:t>docker run --name javaapi-duc-company1 -p 8080:8080 javaapi-duc-company1:1.0</w:t>
+      </w:r>
+    </w:p>
+    <w:p>
+      <w:pPr>
+        <w:rPr>
+          <w:rFonts w:ascii="Times New Roman" w:hAnsi="Times New Roman" w:cs="Times New Roman"/>
+          <w:color w:val="000000" w:themeColor="text1"/>
+          <w:sz w:val="36"/>
+          <w:szCs w:val="36"/>
+        </w:rPr>
+      </w:pPr>
+    </w:p>
+    <w:p>
+      <w:pPr>
+        <w:rPr>
+          <w:rFonts w:ascii="Times New Roman" w:hAnsi="Times New Roman" w:cs="Times New Roman"/>
+          <w:color w:val="000000" w:themeColor="text1"/>
+          <w:sz w:val="36"/>
+          <w:szCs w:val="36"/>
+        </w:rPr>
+      </w:pPr>
+      <w:r>
+        <w:rPr>
+          <w:rFonts w:ascii="Times New Roman" w:hAnsi="Times New Roman" w:cs="Times New Roman"/>
+          <w:b/>
+          <w:bCs/>
+          <w:color w:val="000000" w:themeColor="text1"/>
+          <w:sz w:val="36"/>
+          <w:szCs w:val="36"/>
+        </w:rPr>
+        <w:lastRenderedPageBreak/>
+        <w:t>b.Create this file</w:t>
+      </w:r>
+    </w:p>
+    <w:p>
+      <w:pPr>
+        <w:rPr>
+          <w:rFonts w:ascii="Times New Roman" w:hAnsi="Times New Roman" w:cs="Times New Roman"/>
+          <w:color w:val="000000" w:themeColor="text1"/>
+          <w:sz w:val="36"/>
+          <w:szCs w:val="36"/>
+        </w:rPr>
+      </w:pPr>
+      <w:r>
+        <w:rPr>
+          <w:rFonts w:ascii="Times New Roman" w:hAnsi="Times New Roman" w:cs="Times New Roman"/>
+          <w:color w:val="000000" w:themeColor="text1"/>
+          <w:sz w:val="36"/>
+          <w:szCs w:val="36"/>
+        </w:rPr>
+        <w:t>docker-compose.yml</w:t>
+      </w:r>
+    </w:p>
+    <w:p>
+      <w:pPr>
+        <w:spacing w:before="100" w:beforeAutospacing="1" w:after="100" w:afterAutospacing="1" w:line="240" w:lineRule="auto"/>
+        <w:rPr>
+          <w:rFonts w:ascii="Times New Roman" w:eastAsia="Times New Roman" w:hAnsi="Times New Roman" w:cs="Times New Roman"/>
+          <w:sz w:val="36"/>
+          <w:szCs w:val="36"/>
+        </w:rPr>
+      </w:pPr>
+      <w:r>
+        <w:rPr>
+          <w:rFonts w:ascii="Times New Roman" w:eastAsia="Times New Roman" w:hAnsi="Times New Roman" w:cs="Times New Roman"/>
+          <w:sz w:val="36"/>
+          <w:szCs w:val="36"/>
+        </w:rPr>
+        <w:t xml:space="preserve">Place docker-compose.yml in the </w:t>
+      </w:r>
+      <w:r>
+        <w:rPr>
+          <w:rFonts w:ascii="Times New Roman" w:eastAsia="Times New Roman" w:hAnsi="Times New Roman" w:cs="Times New Roman"/>
+          <w:b/>
+          <w:bCs/>
+          <w:sz w:val="36"/>
+          <w:szCs w:val="36"/>
+        </w:rPr>
+        <w:t>root directory of your JavaAPI_DUC_Company1 project</w:t>
+      </w:r>
+      <w:r>
+        <w:rPr>
+          <w:rFonts w:ascii="Times New Roman" w:eastAsia="Times New Roman" w:hAnsi="Times New Roman" w:cs="Times New Roman"/>
+          <w:sz w:val="36"/>
+          <w:szCs w:val="36"/>
+        </w:rPr>
+        <w:t>, at the same level as pom.xml and Dockerfile.</w:t>
+      </w:r>
+    </w:p>
+    <w:p>
+      <w:pPr>
+        <w:spacing w:before="100" w:beforeAutospacing="1" w:after="100" w:afterAutospacing="1" w:line="240" w:lineRule="auto"/>
+        <w:rPr>
+          <w:rFonts w:ascii="Times New Roman" w:eastAsia="Times New Roman" w:hAnsi="Times New Roman" w:cs="Times New Roman"/>
+          <w:sz w:val="36"/>
+          <w:szCs w:val="36"/>
+        </w:rPr>
+      </w:pPr>
+      <w:r>
+        <w:rPr>
+          <w:rFonts w:ascii="Times New Roman" w:eastAsia="Times New Roman" w:hAnsi="Times New Roman" w:cs="Times New Roman"/>
+          <w:sz w:val="36"/>
+          <w:szCs w:val="36"/>
+        </w:rPr>
+        <w:t xml:space="preserve">My </w:t>
+      </w:r>
+      <w:r>
+        <w:rPr>
+          <w:rFonts w:ascii="Times New Roman" w:eastAsia="Times New Roman" w:hAnsi="Times New Roman" w:cs="Times New Roman"/>
+          <w:sz w:val="36"/>
+          <w:szCs w:val="36"/>
+        </w:rPr>
+        <w:t>project should look like this:</w:t>
+      </w:r>
+    </w:p>
+    <w:p>
+      <w:pPr>
+        <w:tabs>
+          <w:tab w:val="left" w:pos="916"/>
+          <w:tab w:val="left" w:pos="1832"/>
+          <w:tab w:val="left" w:pos="2748"/>
+          <w:tab w:val="left" w:pos="3664"/>
+          <w:tab w:val="left" w:pos="4580"/>
+          <w:tab w:val="left" w:pos="5496"/>
+          <w:tab w:val="left" w:pos="6412"/>
+          <w:tab w:val="left" w:pos="7328"/>
+          <w:tab w:val="left" w:pos="8244"/>
+          <w:tab w:val="left" w:pos="9160"/>
+          <w:tab w:val="left" w:pos="10076"/>
+          <w:tab w:val="left" w:pos="10992"/>
+          <w:tab w:val="left" w:pos="11908"/>
+          <w:tab w:val="left" w:pos="12824"/>
+          <w:tab w:val="left" w:pos="13740"/>
+          <w:tab w:val="left" w:pos="14656"/>
+        </w:tabs>
+        <w:spacing w:after="0" w:line="240" w:lineRule="auto"/>
+        <w:rPr>
+          <w:rFonts w:ascii="Times New Roman" w:eastAsia="Times New Roman" w:hAnsi="Times New Roman" w:cs="Times New Roman"/>
+          <w:sz w:val="36"/>
+          <w:szCs w:val="36"/>
+        </w:rPr>
+      </w:pPr>
+      <w:r>
+        <w:rPr>
+          <w:rFonts w:ascii="Times New Roman" w:eastAsia="Times New Roman" w:hAnsi="Times New Roman" w:cs="Times New Roman"/>
+          <w:sz w:val="36"/>
+          <w:szCs w:val="36"/>
+        </w:rPr>
+        <w:t>F:\IT\IT normal\Java\Projects\API\Test\JavaAPI_DUC_Company1</w:t>
+      </w:r>
+    </w:p>
+    <w:p>
+      <w:pPr>
+        <w:tabs>
+          <w:tab w:val="left" w:pos="916"/>
+          <w:tab w:val="left" w:pos="1832"/>
+          <w:tab w:val="left" w:pos="2748"/>
+          <w:tab w:val="left" w:pos="3664"/>
+          <w:tab w:val="left" w:pos="4580"/>
+          <w:tab w:val="left" w:pos="5496"/>
+          <w:tab w:val="left" w:pos="6412"/>
+          <w:tab w:val="left" w:pos="7328"/>
+          <w:tab w:val="left" w:pos="8244"/>
+          <w:tab w:val="left" w:pos="9160"/>
+          <w:tab w:val="left" w:pos="10076"/>
+          <w:tab w:val="left" w:pos="10992"/>
+          <w:tab w:val="left" w:pos="11908"/>
+          <w:tab w:val="left" w:pos="12824"/>
+          <w:tab w:val="left" w:pos="13740"/>
+          <w:tab w:val="left" w:pos="14656"/>
+        </w:tabs>
+        <w:spacing w:after="0" w:line="240" w:lineRule="auto"/>
+        <w:rPr>
+          <w:rFonts w:ascii="Times New Roman" w:eastAsia="Times New Roman" w:hAnsi="Times New Roman" w:cs="Times New Roman"/>
+          <w:sz w:val="36"/>
+          <w:szCs w:val="36"/>
+        </w:rPr>
+      </w:pPr>
+      <w:r>
+        <w:rPr>
+          <w:rFonts w:ascii="Times New Roman" w:eastAsia="Times New Roman" w:hAnsi="Times New Roman" w:cs="Times New Roman"/>
+          <w:sz w:val="36"/>
+          <w:szCs w:val="36"/>
+        </w:rPr>
+        <w:t>│</w:t>
+      </w:r>
+    </w:p>
+    <w:p>
+      <w:pPr>
+        <w:tabs>
+          <w:tab w:val="left" w:pos="916"/>
+          <w:tab w:val="left" w:pos="1832"/>
+          <w:tab w:val="left" w:pos="2748"/>
+          <w:tab w:val="left" w:pos="3664"/>
+          <w:tab w:val="left" w:pos="4580"/>
+          <w:tab w:val="left" w:pos="5496"/>
+          <w:tab w:val="left" w:pos="6412"/>
+          <w:tab w:val="left" w:pos="7328"/>
+          <w:tab w:val="left" w:pos="8244"/>
+          <w:tab w:val="left" w:pos="9160"/>
+          <w:tab w:val="left" w:pos="10076"/>
+          <w:tab w:val="left" w:pos="10992"/>
+          <w:tab w:val="left" w:pos="11908"/>
+          <w:tab w:val="left" w:pos="12824"/>
+          <w:tab w:val="left" w:pos="13740"/>
+          <w:tab w:val="left" w:pos="14656"/>
+        </w:tabs>
+        <w:spacing w:after="0" w:line="240" w:lineRule="auto"/>
+        <w:rPr>
+          <w:rFonts w:ascii="Times New Roman" w:eastAsia="Times New Roman" w:hAnsi="Times New Roman" w:cs="Times New Roman"/>
+          <w:sz w:val="36"/>
+          <w:szCs w:val="36"/>
+        </w:rPr>
+      </w:pPr>
+      <w:r>
+        <w:rPr>
+          <w:rFonts w:ascii="Times New Roman" w:eastAsia="Times New Roman" w:hAnsi="Times New Roman" w:cs="Times New Roman"/>
+          <w:sz w:val="36"/>
+          <w:szCs w:val="36"/>
+        </w:rPr>
+        <w:t>├── .github</w:t>
+      </w:r>
+    </w:p>
+    <w:p>
+      <w:pPr>
+        <w:tabs>
+          <w:tab w:val="left" w:pos="916"/>
+          <w:tab w:val="left" w:pos="1832"/>
+          <w:tab w:val="left" w:pos="2748"/>
+          <w:tab w:val="left" w:pos="3664"/>
+          <w:tab w:val="left" w:pos="4580"/>
+          <w:tab w:val="left" w:pos="5496"/>
+          <w:tab w:val="left" w:pos="6412"/>
+          <w:tab w:val="left" w:pos="7328"/>
+          <w:tab w:val="left" w:pos="8244"/>
+          <w:tab w:val="left" w:pos="9160"/>
+          <w:tab w:val="left" w:pos="10076"/>
+          <w:tab w:val="left" w:pos="10992"/>
+          <w:tab w:val="left" w:pos="11908"/>
+          <w:tab w:val="left" w:pos="12824"/>
+          <w:tab w:val="left" w:pos="13740"/>
+          <w:tab w:val="left" w:pos="14656"/>
+        </w:tabs>
+        <w:spacing w:after="0" w:line="240" w:lineRule="auto"/>
+        <w:rPr>
+          <w:rFonts w:ascii="Times New Roman" w:eastAsia="Times New Roman" w:hAnsi="Times New Roman" w:cs="Times New Roman"/>
+          <w:sz w:val="36"/>
+          <w:szCs w:val="36"/>
+        </w:rPr>
+      </w:pPr>
+      <w:r>
+        <w:rPr>
+          <w:rFonts w:ascii="Times New Roman" w:eastAsia="Times New Roman" w:hAnsi="Times New Roman" w:cs="Times New Roman"/>
+          <w:sz w:val="36"/>
+          <w:szCs w:val="36"/>
+        </w:rPr>
+        <w:t>│   └── workflows</w:t>
+      </w:r>
+    </w:p>
+    <w:p>
+      <w:pPr>
+        <w:tabs>
+          <w:tab w:val="left" w:pos="916"/>
+          <w:tab w:val="left" w:pos="1832"/>
+          <w:tab w:val="left" w:pos="2748"/>
+          <w:tab w:val="left" w:pos="3664"/>
+          <w:tab w:val="left" w:pos="4580"/>
+          <w:tab w:val="left" w:pos="5496"/>
+          <w:tab w:val="left" w:pos="6412"/>
+          <w:tab w:val="left" w:pos="7328"/>
+          <w:tab w:val="left" w:pos="8244"/>
+          <w:tab w:val="left" w:pos="9160"/>
+          <w:tab w:val="left" w:pos="10076"/>
+          <w:tab w:val="left" w:pos="10992"/>
+          <w:tab w:val="left" w:pos="11908"/>
+          <w:tab w:val="left" w:pos="12824"/>
+          <w:tab w:val="left" w:pos="13740"/>
+          <w:tab w:val="left" w:pos="14656"/>
+        </w:tabs>
+        <w:spacing w:after="0" w:line="240" w:lineRule="auto"/>
+        <w:rPr>
+          <w:rFonts w:ascii="Times New Roman" w:eastAsia="Times New Roman" w:hAnsi="Times New Roman" w:cs="Times New Roman"/>
+          <w:sz w:val="36"/>
+          <w:szCs w:val="36"/>
+        </w:rPr>
+      </w:pPr>
+      <w:r>
+        <w:rPr>
+          <w:rFonts w:ascii="Times New Roman" w:eastAsia="Times New Roman" w:hAnsi="Times New Roman" w:cs="Times New Roman"/>
+          <w:sz w:val="36"/>
+          <w:szCs w:val="36"/>
+        </w:rPr>
+        <w:t>│       └── ci.yml</w:t>
+      </w:r>
+    </w:p>
+    <w:p>
+      <w:pPr>
+        <w:tabs>
+          <w:tab w:val="left" w:pos="916"/>
+          <w:tab w:val="left" w:pos="1832"/>
+          <w:tab w:val="left" w:pos="2748"/>
+          <w:tab w:val="left" w:pos="3664"/>
+          <w:tab w:val="left" w:pos="4580"/>
+          <w:tab w:val="left" w:pos="5496"/>
+          <w:tab w:val="left" w:pos="6412"/>
+          <w:tab w:val="left" w:pos="7328"/>
+          <w:tab w:val="left" w:pos="8244"/>
+          <w:tab w:val="left" w:pos="9160"/>
+          <w:tab w:val="left" w:pos="10076"/>
+          <w:tab w:val="left" w:pos="10992"/>
+          <w:tab w:val="left" w:pos="11908"/>
+          <w:tab w:val="left" w:pos="12824"/>
+          <w:tab w:val="left" w:pos="13740"/>
+          <w:tab w:val="left" w:pos="14656"/>
+        </w:tabs>
+        <w:spacing w:after="0" w:line="240" w:lineRule="auto"/>
+        <w:rPr>
+          <w:rFonts w:ascii="Times New Roman" w:eastAsia="Times New Roman" w:hAnsi="Times New Roman" w:cs="Times New Roman"/>
+          <w:sz w:val="36"/>
+          <w:szCs w:val="36"/>
+        </w:rPr>
+      </w:pPr>
+      <w:r>
+        <w:rPr>
+          <w:rFonts w:ascii="Times New Roman" w:eastAsia="Times New Roman" w:hAnsi="Times New Roman" w:cs="Times New Roman"/>
+          <w:sz w:val="36"/>
+          <w:szCs w:val="36"/>
+        </w:rPr>
+        <w:t>│</w:t>
+      </w:r>
+    </w:p>
+    <w:p>
+      <w:pPr>
+        <w:tabs>
+          <w:tab w:val="left" w:pos="916"/>
+          <w:tab w:val="left" w:pos="1832"/>
+          <w:tab w:val="left" w:pos="2748"/>
+          <w:tab w:val="left" w:pos="3664"/>
+          <w:tab w:val="left" w:pos="4580"/>
+          <w:tab w:val="left" w:pos="5496"/>
+          <w:tab w:val="left" w:pos="6412"/>
+          <w:tab w:val="left" w:pos="7328"/>
+          <w:tab w:val="left" w:pos="8244"/>
+          <w:tab w:val="left" w:pos="9160"/>
+          <w:tab w:val="left" w:pos="10076"/>
+          <w:tab w:val="left" w:pos="10992"/>
+          <w:tab w:val="left" w:pos="11908"/>
+          <w:tab w:val="left" w:pos="12824"/>
+          <w:tab w:val="left" w:pos="13740"/>
+          <w:tab w:val="left" w:pos="14656"/>
+        </w:tabs>
+        <w:spacing w:after="0" w:line="240" w:lineRule="auto"/>
+        <w:rPr>
+          <w:rFonts w:ascii="Times New Roman" w:eastAsia="Times New Roman" w:hAnsi="Times New Roman" w:cs="Times New Roman"/>
+          <w:sz w:val="36"/>
+          <w:szCs w:val="36"/>
+        </w:rPr>
+      </w:pPr>
+      <w:r>
+        <w:rPr>
+          <w:rFonts w:ascii="Times New Roman" w:eastAsia="Times New Roman" w:hAnsi="Times New Roman" w:cs="Times New Roman"/>
+          <w:sz w:val="36"/>
+          <w:szCs w:val="36"/>
+        </w:rPr>
+        <w:t>├── src</w:t>
+      </w:r>
+    </w:p>
+    <w:p>
+      <w:pPr>
+        <w:tabs>
+          <w:tab w:val="left" w:pos="916"/>
+          <w:tab w:val="left" w:pos="1832"/>
+          <w:tab w:val="left" w:pos="2748"/>
+          <w:tab w:val="left" w:pos="3664"/>
+          <w:tab w:val="left" w:pos="4580"/>
+          <w:tab w:val="left" w:pos="5496"/>
+          <w:tab w:val="left" w:pos="6412"/>
+          <w:tab w:val="left" w:pos="7328"/>
+          <w:tab w:val="left" w:pos="8244"/>
+          <w:tab w:val="left" w:pos="9160"/>
+          <w:tab w:val="left" w:pos="10076"/>
+          <w:tab w:val="left" w:pos="10992"/>
+          <w:tab w:val="left" w:pos="11908"/>
+          <w:tab w:val="left" w:pos="12824"/>
+          <w:tab w:val="left" w:pos="13740"/>
+          <w:tab w:val="left" w:pos="14656"/>
+        </w:tabs>
+        <w:spacing w:after="0" w:line="240" w:lineRule="auto"/>
+        <w:rPr>
+          <w:rFonts w:ascii="Times New Roman" w:eastAsia="Times New Roman" w:hAnsi="Times New Roman" w:cs="Times New Roman"/>
+          <w:sz w:val="36"/>
+          <w:szCs w:val="36"/>
+        </w:rPr>
+      </w:pPr>
+      <w:r>
+        <w:rPr>
+          <w:rFonts w:ascii="Times New Roman" w:eastAsia="Times New Roman" w:hAnsi="Times New Roman" w:cs="Times New Roman"/>
+          <w:sz w:val="36"/>
+          <w:szCs w:val="36"/>
+        </w:rPr>
+        <w:t>│   ├── main</w:t>
+      </w:r>
+    </w:p>
+    <w:p>
+      <w:pPr>
+        <w:tabs>
+          <w:tab w:val="left" w:pos="916"/>
+          <w:tab w:val="left" w:pos="1832"/>
+          <w:tab w:val="left" w:pos="2748"/>
+          <w:tab w:val="left" w:pos="3664"/>
+          <w:tab w:val="left" w:pos="4580"/>
+          <w:tab w:val="left" w:pos="5496"/>
+          <w:tab w:val="left" w:pos="6412"/>
+          <w:tab w:val="left" w:pos="7328"/>
+          <w:tab w:val="left" w:pos="8244"/>
+          <w:tab w:val="left" w:pos="9160"/>
+          <w:tab w:val="left" w:pos="10076"/>
+          <w:tab w:val="left" w:pos="10992"/>
+          <w:tab w:val="left" w:pos="11908"/>
+          <w:tab w:val="left" w:pos="12824"/>
+          <w:tab w:val="left" w:pos="13740"/>
+          <w:tab w:val="left" w:pos="14656"/>
+        </w:tabs>
+        <w:spacing w:after="0" w:line="240" w:lineRule="auto"/>
+        <w:rPr>
+          <w:rFonts w:ascii="Times New Roman" w:eastAsia="Times New Roman" w:hAnsi="Times New Roman" w:cs="Times New Roman"/>
+          <w:sz w:val="36"/>
+          <w:szCs w:val="36"/>
+        </w:rPr>
+      </w:pPr>
+      <w:r>
+        <w:rPr>
+          <w:rFonts w:ascii="Times New Roman" w:eastAsia="Times New Roman" w:hAnsi="Times New Roman" w:cs="Times New Roman"/>
+          <w:sz w:val="36"/>
+          <w:szCs w:val="36"/>
+        </w:rPr>
+        <w:t>│   └── test</w:t>
+      </w:r>
+    </w:p>
+    <w:p>
+      <w:pPr>
+        <w:tabs>
+          <w:tab w:val="left" w:pos="916"/>
+          <w:tab w:val="left" w:pos="1832"/>
+          <w:tab w:val="left" w:pos="2748"/>
+          <w:tab w:val="left" w:pos="3664"/>
+          <w:tab w:val="left" w:pos="4580"/>
+          <w:tab w:val="left" w:pos="5496"/>
+          <w:tab w:val="left" w:pos="6412"/>
+          <w:tab w:val="left" w:pos="7328"/>
+          <w:tab w:val="left" w:pos="8244"/>
+          <w:tab w:val="left" w:pos="9160"/>
+          <w:tab w:val="left" w:pos="10076"/>
+          <w:tab w:val="left" w:pos="10992"/>
+          <w:tab w:val="left" w:pos="11908"/>
+          <w:tab w:val="left" w:pos="12824"/>
+          <w:tab w:val="left" w:pos="13740"/>
+          <w:tab w:val="left" w:pos="14656"/>
+        </w:tabs>
+        <w:spacing w:after="0" w:line="240" w:lineRule="auto"/>
+        <w:rPr>
+          <w:rFonts w:ascii="Times New Roman" w:eastAsia="Times New Roman" w:hAnsi="Times New Roman" w:cs="Times New Roman"/>
+          <w:sz w:val="36"/>
+          <w:szCs w:val="36"/>
+        </w:rPr>
+      </w:pPr>
+      <w:r>
+        <w:rPr>
+          <w:rFonts w:ascii="Times New Roman" w:eastAsia="Times New Roman" w:hAnsi="Times New Roman" w:cs="Times New Roman"/>
+          <w:sz w:val="36"/>
+          <w:szCs w:val="36"/>
+        </w:rPr>
+        <w:t>│</w:t>
+      </w:r>
+    </w:p>
+    <w:p>
+      <w:pPr>
+        <w:tabs>
+          <w:tab w:val="left" w:pos="916"/>
+          <w:tab w:val="left" w:pos="1832"/>
+          <w:tab w:val="left" w:pos="2748"/>
+          <w:tab w:val="left" w:pos="3664"/>
+          <w:tab w:val="left" w:pos="4580"/>
+          <w:tab w:val="left" w:pos="5496"/>
+          <w:tab w:val="left" w:pos="6412"/>
+          <w:tab w:val="left" w:pos="7328"/>
+          <w:tab w:val="left" w:pos="8244"/>
+          <w:tab w:val="left" w:pos="9160"/>
+          <w:tab w:val="left" w:pos="10076"/>
+          <w:tab w:val="left" w:pos="10992"/>
+          <w:tab w:val="left" w:pos="11908"/>
+          <w:tab w:val="left" w:pos="12824"/>
+          <w:tab w:val="left" w:pos="13740"/>
+          <w:tab w:val="left" w:pos="14656"/>
+        </w:tabs>
+        <w:spacing w:after="0" w:line="240" w:lineRule="auto"/>
+        <w:rPr>
+          <w:rFonts w:ascii="Times New Roman" w:eastAsia="Times New Roman" w:hAnsi="Times New Roman" w:cs="Times New Roman"/>
+          <w:sz w:val="36"/>
+          <w:szCs w:val="36"/>
+        </w:rPr>
+      </w:pPr>
+      <w:r>
+        <w:rPr>
+          <w:rFonts w:ascii="Times New Roman" w:eastAsia="Times New Roman" w:hAnsi="Times New Roman" w:cs="Times New Roman"/>
+          <w:sz w:val="36"/>
+          <w:szCs w:val="36"/>
+        </w:rPr>
+        <w:t>├── SQL</w:t>
+      </w:r>
+    </w:p>
+    <w:p>
+      <w:pPr>
+        <w:tabs>
+          <w:tab w:val="left" w:pos="916"/>
+          <w:tab w:val="left" w:pos="1832"/>
+          <w:tab w:val="left" w:pos="2748"/>
+          <w:tab w:val="left" w:pos="3664"/>
+          <w:tab w:val="left" w:pos="4580"/>
+          <w:tab w:val="left" w:pos="5496"/>
+          <w:tab w:val="left" w:pos="6412"/>
+          <w:tab w:val="left" w:pos="7328"/>
+          <w:tab w:val="left" w:pos="8244"/>
+          <w:tab w:val="left" w:pos="9160"/>
+          <w:tab w:val="left" w:pos="10076"/>
+          <w:tab w:val="left" w:pos="10992"/>
+          <w:tab w:val="left" w:pos="11908"/>
+          <w:tab w:val="left" w:pos="12824"/>
+          <w:tab w:val="left" w:pos="13740"/>
+          <w:tab w:val="left" w:pos="14656"/>
+        </w:tabs>
+        <w:spacing w:after="0" w:line="240" w:lineRule="auto"/>
+        <w:rPr>
+          <w:rFonts w:ascii="Times New Roman" w:eastAsia="Times New Roman" w:hAnsi="Times New Roman" w:cs="Times New Roman"/>
+          <w:sz w:val="36"/>
+          <w:szCs w:val="36"/>
+        </w:rPr>
+      </w:pPr>
+      <w:r>
+        <w:rPr>
+          <w:rFonts w:ascii="Times New Roman" w:eastAsia="Times New Roman" w:hAnsi="Times New Roman" w:cs="Times New Roman"/>
+          <w:sz w:val="36"/>
+          <w:szCs w:val="36"/>
+        </w:rPr>
+        <w:t>├── Word</w:t>
+      </w:r>
+    </w:p>
+    <w:p>
+      <w:pPr>
+        <w:tabs>
+          <w:tab w:val="left" w:pos="916"/>
+          <w:tab w:val="left" w:pos="1832"/>
+          <w:tab w:val="left" w:pos="2748"/>
+          <w:tab w:val="left" w:pos="3664"/>
+          <w:tab w:val="left" w:pos="4580"/>
+          <w:tab w:val="left" w:pos="5496"/>
+          <w:tab w:val="left" w:pos="6412"/>
+          <w:tab w:val="left" w:pos="7328"/>
+          <w:tab w:val="left" w:pos="8244"/>
+          <w:tab w:val="left" w:pos="9160"/>
+          <w:tab w:val="left" w:pos="10076"/>
+          <w:tab w:val="left" w:pos="10992"/>
+          <w:tab w:val="left" w:pos="11908"/>
+          <w:tab w:val="left" w:pos="12824"/>
+          <w:tab w:val="left" w:pos="13740"/>
+          <w:tab w:val="left" w:pos="14656"/>
+        </w:tabs>
+        <w:spacing w:after="0" w:line="240" w:lineRule="auto"/>
+        <w:rPr>
+          <w:rFonts w:ascii="Times New Roman" w:eastAsia="Times New Roman" w:hAnsi="Times New Roman" w:cs="Times New Roman"/>
+          <w:sz w:val="36"/>
+          <w:szCs w:val="36"/>
+        </w:rPr>
+      </w:pPr>
+      <w:r>
+        <w:rPr>
+          <w:rFonts w:ascii="Times New Roman" w:eastAsia="Times New Roman" w:hAnsi="Times New Roman" w:cs="Times New Roman"/>
+          <w:sz w:val="36"/>
+          <w:szCs w:val="36"/>
+        </w:rPr>
+        <w:t>├── uploads</w:t>
+      </w:r>
+    </w:p>
+    <w:p>
+      <w:pPr>
+        <w:tabs>
+          <w:tab w:val="left" w:pos="916"/>
+          <w:tab w:val="left" w:pos="1832"/>
+          <w:tab w:val="left" w:pos="2748"/>
+          <w:tab w:val="left" w:pos="3664"/>
+          <w:tab w:val="left" w:pos="4580"/>
+          <w:tab w:val="left" w:pos="5496"/>
+          <w:tab w:val="left" w:pos="6412"/>
+          <w:tab w:val="left" w:pos="7328"/>
+          <w:tab w:val="left" w:pos="8244"/>
+          <w:tab w:val="left" w:pos="9160"/>
+          <w:tab w:val="left" w:pos="10076"/>
+          <w:tab w:val="left" w:pos="10992"/>
+          <w:tab w:val="left" w:pos="11908"/>
+          <w:tab w:val="left" w:pos="12824"/>
+          <w:tab w:val="left" w:pos="13740"/>
+          <w:tab w:val="left" w:pos="14656"/>
+        </w:tabs>
+        <w:spacing w:after="0" w:line="240" w:lineRule="auto"/>
+        <w:rPr>
+          <w:rFonts w:ascii="Times New Roman" w:eastAsia="Times New Roman" w:hAnsi="Times New Roman" w:cs="Times New Roman"/>
+          <w:sz w:val="36"/>
+          <w:szCs w:val="36"/>
+        </w:rPr>
+      </w:pPr>
+      <w:r>
+        <w:rPr>
+          <w:rFonts w:ascii="Times New Roman" w:eastAsia="Times New Roman" w:hAnsi="Times New Roman" w:cs="Times New Roman"/>
+          <w:sz w:val="36"/>
+          <w:szCs w:val="36"/>
+        </w:rPr>
+        <w:t>│</w:t>
+      </w:r>
+    </w:p>
+    <w:p>
+      <w:pPr>
+        <w:tabs>
+          <w:tab w:val="left" w:pos="916"/>
+          <w:tab w:val="left" w:pos="1832"/>
+          <w:tab w:val="left" w:pos="2748"/>
+          <w:tab w:val="left" w:pos="3664"/>
+          <w:tab w:val="left" w:pos="4580"/>
+          <w:tab w:val="left" w:pos="5496"/>
+          <w:tab w:val="left" w:pos="6412"/>
+          <w:tab w:val="left" w:pos="7328"/>
+          <w:tab w:val="left" w:pos="8244"/>
+          <w:tab w:val="left" w:pos="9160"/>
+          <w:tab w:val="left" w:pos="10076"/>
+          <w:tab w:val="left" w:pos="10992"/>
+          <w:tab w:val="left" w:pos="11908"/>
+          <w:tab w:val="left" w:pos="12824"/>
+          <w:tab w:val="left" w:pos="13740"/>
+          <w:tab w:val="left" w:pos="14656"/>
+        </w:tabs>
+        <w:spacing w:after="0" w:line="240" w:lineRule="auto"/>
+        <w:rPr>
+          <w:rFonts w:ascii="Times New Roman" w:eastAsia="Times New Roman" w:hAnsi="Times New Roman" w:cs="Times New Roman"/>
+          <w:sz w:val="36"/>
+          <w:szCs w:val="36"/>
+        </w:rPr>
+      </w:pPr>
+      <w:r>
+        <w:rPr>
+          <w:rFonts w:ascii="Times New Roman" w:eastAsia="Times New Roman" w:hAnsi="Times New Roman" w:cs="Times New Roman"/>
+          <w:sz w:val="36"/>
+          <w:szCs w:val="36"/>
+        </w:rPr>
+        <w:t>├── pom.xml</w:t>
+      </w:r>
+    </w:p>
+    <w:p>
+      <w:pPr>
+        <w:tabs>
+          <w:tab w:val="left" w:pos="916"/>
+          <w:tab w:val="left" w:pos="1832"/>
+          <w:tab w:val="left" w:pos="2748"/>
+          <w:tab w:val="left" w:pos="3664"/>
+          <w:tab w:val="left" w:pos="4580"/>
+          <w:tab w:val="left" w:pos="5496"/>
+          <w:tab w:val="left" w:pos="6412"/>
+          <w:tab w:val="left" w:pos="7328"/>
+          <w:tab w:val="left" w:pos="8244"/>
+          <w:tab w:val="left" w:pos="9160"/>
+          <w:tab w:val="left" w:pos="10076"/>
+          <w:tab w:val="left" w:pos="10992"/>
+          <w:tab w:val="left" w:pos="11908"/>
+          <w:tab w:val="left" w:pos="12824"/>
+          <w:tab w:val="left" w:pos="13740"/>
+          <w:tab w:val="left" w:pos="14656"/>
+        </w:tabs>
+        <w:spacing w:after="0" w:line="240" w:lineRule="auto"/>
+        <w:rPr>
+          <w:rFonts w:ascii="Times New Roman" w:eastAsia="Times New Roman" w:hAnsi="Times New Roman" w:cs="Times New Roman"/>
+          <w:sz w:val="36"/>
+          <w:szCs w:val="36"/>
+        </w:rPr>
+      </w:pPr>
+      <w:r>
+        <w:rPr>
+          <w:rFonts w:ascii="Times New Roman" w:eastAsia="Times New Roman" w:hAnsi="Times New Roman" w:cs="Times New Roman"/>
+          <w:sz w:val="36"/>
+          <w:szCs w:val="36"/>
+        </w:rPr>
+        <w:t>├── mvnw</w:t>
+      </w:r>
+    </w:p>
+    <w:p>
+      <w:pPr>
+        <w:tabs>
+          <w:tab w:val="left" w:pos="916"/>
+          <w:tab w:val="left" w:pos="1832"/>
+          <w:tab w:val="left" w:pos="2748"/>
+          <w:tab w:val="left" w:pos="3664"/>
+          <w:tab w:val="left" w:pos="4580"/>
+          <w:tab w:val="left" w:pos="5496"/>
+          <w:tab w:val="left" w:pos="6412"/>
+          <w:tab w:val="left" w:pos="7328"/>
+          <w:tab w:val="left" w:pos="8244"/>
+          <w:tab w:val="left" w:pos="9160"/>
+          <w:tab w:val="left" w:pos="10076"/>
+          <w:tab w:val="left" w:pos="10992"/>
+          <w:tab w:val="left" w:pos="11908"/>
+          <w:tab w:val="left" w:pos="12824"/>
+          <w:tab w:val="left" w:pos="13740"/>
+          <w:tab w:val="left" w:pos="14656"/>
+        </w:tabs>
+        <w:spacing w:after="0" w:line="240" w:lineRule="auto"/>
+        <w:rPr>
+          <w:rFonts w:ascii="Times New Roman" w:eastAsia="Times New Roman" w:hAnsi="Times New Roman" w:cs="Times New Roman"/>
+          <w:sz w:val="36"/>
+          <w:szCs w:val="36"/>
+        </w:rPr>
+      </w:pPr>
+      <w:r>
+        <w:rPr>
+          <w:rFonts w:ascii="Times New Roman" w:eastAsia="Times New Roman" w:hAnsi="Times New Roman" w:cs="Times New Roman"/>
+          <w:sz w:val="36"/>
+          <w:szCs w:val="36"/>
+        </w:rPr>
+        <w:t>├── mvnw.cmd</w:t>
+      </w:r>
+    </w:p>
+    <w:p>
+      <w:pPr>
+        <w:tabs>
+          <w:tab w:val="left" w:pos="916"/>
+          <w:tab w:val="left" w:pos="1832"/>
+          <w:tab w:val="left" w:pos="2748"/>
+          <w:tab w:val="left" w:pos="3664"/>
+          <w:tab w:val="left" w:pos="4580"/>
+          <w:tab w:val="left" w:pos="5496"/>
+          <w:tab w:val="left" w:pos="6412"/>
+          <w:tab w:val="left" w:pos="7328"/>
+          <w:tab w:val="left" w:pos="8244"/>
+          <w:tab w:val="left" w:pos="9160"/>
+          <w:tab w:val="left" w:pos="10076"/>
+          <w:tab w:val="left" w:pos="10992"/>
+          <w:tab w:val="left" w:pos="11908"/>
+          <w:tab w:val="left" w:pos="12824"/>
+          <w:tab w:val="left" w:pos="13740"/>
+          <w:tab w:val="left" w:pos="14656"/>
+        </w:tabs>
+        <w:spacing w:after="0" w:line="240" w:lineRule="auto"/>
+        <w:rPr>
+          <w:rFonts w:ascii="Times New Roman" w:eastAsia="Times New Roman" w:hAnsi="Times New Roman" w:cs="Times New Roman"/>
+          <w:sz w:val="36"/>
+          <w:szCs w:val="36"/>
+        </w:rPr>
+      </w:pPr>
+      <w:r>
+        <w:rPr>
+          <w:rFonts w:ascii="Times New Roman" w:eastAsia="Times New Roman" w:hAnsi="Times New Roman" w:cs="Times New Roman"/>
+          <w:sz w:val="36"/>
+          <w:szCs w:val="36"/>
+        </w:rPr>
+        <w:t>├── Dockerfile</w:t>
+      </w:r>
+    </w:p>
+    <w:p>
+      <w:pPr>
+        <w:tabs>
+          <w:tab w:val="left" w:pos="916"/>
+          <w:tab w:val="left" w:pos="1832"/>
+          <w:tab w:val="left" w:pos="2748"/>
+          <w:tab w:val="left" w:pos="3664"/>
+          <w:tab w:val="left" w:pos="4580"/>
+          <w:tab w:val="left" w:pos="5496"/>
+          <w:tab w:val="left" w:pos="6412"/>
+          <w:tab w:val="left" w:pos="7328"/>
+          <w:tab w:val="left" w:pos="8244"/>
+          <w:tab w:val="left" w:pos="9160"/>
+          <w:tab w:val="left" w:pos="10076"/>
+          <w:tab w:val="left" w:pos="10992"/>
+          <w:tab w:val="left" w:pos="11908"/>
+          <w:tab w:val="left" w:pos="12824"/>
+          <w:tab w:val="left" w:pos="13740"/>
+          <w:tab w:val="left" w:pos="14656"/>
+        </w:tabs>
+        <w:spacing w:after="0" w:line="240" w:lineRule="auto"/>
+        <w:rPr>
+          <w:rFonts w:ascii="Times New Roman" w:eastAsia="Times New Roman" w:hAnsi="Times New Roman" w:cs="Times New Roman"/>
+          <w:sz w:val="36"/>
+          <w:szCs w:val="36"/>
+        </w:rPr>
+      </w:pPr>
+      <w:r>
+        <w:rPr>
+          <w:rFonts w:ascii="Times New Roman" w:eastAsia="Times New Roman" w:hAnsi="Times New Roman" w:cs="Times New Roman"/>
+          <w:sz w:val="36"/>
+          <w:szCs w:val="36"/>
+        </w:rPr>
+        <w:t>├── docker-compose.yml       ← CREATE IT HERE</w:t>
+      </w:r>
+    </w:p>
+    <w:p>
+      <w:pPr>
+        <w:tabs>
+          <w:tab w:val="left" w:pos="916"/>
+          <w:tab w:val="left" w:pos="1832"/>
+          <w:tab w:val="left" w:pos="2748"/>
+          <w:tab w:val="left" w:pos="3664"/>
+          <w:tab w:val="left" w:pos="4580"/>
+          <w:tab w:val="left" w:pos="5496"/>
+          <w:tab w:val="left" w:pos="6412"/>
+          <w:tab w:val="left" w:pos="7328"/>
+          <w:tab w:val="left" w:pos="8244"/>
+          <w:tab w:val="left" w:pos="9160"/>
+          <w:tab w:val="left" w:pos="10076"/>
+          <w:tab w:val="left" w:pos="10992"/>
+          <w:tab w:val="left" w:pos="11908"/>
+          <w:tab w:val="left" w:pos="12824"/>
+          <w:tab w:val="left" w:pos="13740"/>
+          <w:tab w:val="left" w:pos="14656"/>
+        </w:tabs>
+        <w:spacing w:after="0" w:line="240" w:lineRule="auto"/>
+        <w:rPr>
+          <w:rFonts w:ascii="Times New Roman" w:eastAsia="Times New Roman" w:hAnsi="Times New Roman" w:cs="Times New Roman"/>
+          <w:sz w:val="36"/>
+          <w:szCs w:val="36"/>
+        </w:rPr>
+      </w:pPr>
+      <w:r>
+        <w:rPr>
+          <w:rFonts w:ascii="Times New Roman" w:eastAsia="Times New Roman" w:hAnsi="Times New Roman" w:cs="Times New Roman"/>
+          <w:sz w:val="36"/>
+          <w:szCs w:val="36"/>
+        </w:rPr>
+        <w:t>└── .gitignore</w:t>
+      </w:r>
+    </w:p>
+    <w:p>
+      <w:pPr>
+        <w:spacing w:before="100" w:beforeAutospacing="1" w:after="100" w:afterAutospacing="1" w:line="240" w:lineRule="auto"/>
+        <w:rPr>
+          <w:rFonts w:ascii="Times New Roman" w:eastAsia="Times New Roman" w:hAnsi="Times New Roman" w:cs="Times New Roman"/>
+          <w:sz w:val="36"/>
+          <w:szCs w:val="36"/>
+        </w:rPr>
+      </w:pPr>
+      <w:r>
+        <w:rPr>
+          <w:rFonts w:ascii="Times New Roman" w:eastAsia="Times New Roman" w:hAnsi="Times New Roman" w:cs="Times New Roman"/>
+          <w:sz w:val="36"/>
+          <w:szCs w:val="36"/>
+        </w:rPr>
+        <w:t>So the two Docker files are side-by-side:</w:t>
+      </w:r>
+    </w:p>
+    <w:p>
+      <w:pPr>
+        <w:tabs>
+          <w:tab w:val="left" w:pos="916"/>
+          <w:tab w:val="left" w:pos="1832"/>
+          <w:tab w:val="left" w:pos="2748"/>
+          <w:tab w:val="left" w:pos="3664"/>
+          <w:tab w:val="left" w:pos="4580"/>
+          <w:tab w:val="left" w:pos="5496"/>
+          <w:tab w:val="left" w:pos="6412"/>
+          <w:tab w:val="left" w:pos="7328"/>
+          <w:tab w:val="left" w:pos="8244"/>
+          <w:tab w:val="left" w:pos="9160"/>
+          <w:tab w:val="left" w:pos="10076"/>
+          <w:tab w:val="left" w:pos="10992"/>
+          <w:tab w:val="left" w:pos="11908"/>
+          <w:tab w:val="left" w:pos="12824"/>
+          <w:tab w:val="left" w:pos="13740"/>
+          <w:tab w:val="left" w:pos="14656"/>
+        </w:tabs>
+        <w:spacing w:after="0" w:line="240" w:lineRule="auto"/>
+        <w:rPr>
+          <w:rFonts w:ascii="Times New Roman" w:eastAsia="Times New Roman" w:hAnsi="Times New Roman" w:cs="Times New Roman"/>
+          <w:sz w:val="36"/>
+          <w:szCs w:val="36"/>
+        </w:rPr>
+      </w:pPr>
+      <w:r>
+        <w:rPr>
+          <w:rFonts w:ascii="Times New Roman" w:eastAsia="Times New Roman" w:hAnsi="Times New Roman" w:cs="Times New Roman"/>
+          <w:sz w:val="36"/>
+          <w:szCs w:val="36"/>
+        </w:rPr>
+        <w:lastRenderedPageBreak/>
+        <w:t>Dockerfile</w:t>
+      </w:r>
+    </w:p>
+    <w:p>
+      <w:pPr>
+        <w:tabs>
+          <w:tab w:val="left" w:pos="916"/>
+          <w:tab w:val="left" w:pos="1832"/>
+          <w:tab w:val="left" w:pos="2748"/>
+          <w:tab w:val="left" w:pos="3664"/>
+          <w:tab w:val="left" w:pos="4580"/>
+          <w:tab w:val="left" w:pos="5496"/>
+          <w:tab w:val="left" w:pos="6412"/>
+          <w:tab w:val="left" w:pos="7328"/>
+          <w:tab w:val="left" w:pos="8244"/>
+          <w:tab w:val="left" w:pos="9160"/>
+          <w:tab w:val="left" w:pos="10076"/>
+          <w:tab w:val="left" w:pos="10992"/>
+          <w:tab w:val="left" w:pos="11908"/>
+          <w:tab w:val="left" w:pos="12824"/>
+          <w:tab w:val="left" w:pos="13740"/>
+          <w:tab w:val="left" w:pos="14656"/>
+        </w:tabs>
+        <w:spacing w:after="0" w:line="240" w:lineRule="auto"/>
+        <w:rPr>
+          <w:rFonts w:ascii="Times New Roman" w:eastAsia="Times New Roman" w:hAnsi="Times New Roman" w:cs="Times New Roman"/>
+          <w:sz w:val="36"/>
+          <w:szCs w:val="36"/>
+        </w:rPr>
+      </w:pPr>
+      <w:r>
+        <w:rPr>
+          <w:rFonts w:ascii="Times New Roman" w:eastAsia="Times New Roman" w:hAnsi="Times New Roman" w:cs="Times New Roman"/>
+          <w:sz w:val="36"/>
+          <w:szCs w:val="36"/>
+        </w:rPr>
+        <w:t>docker-compose.yml</w:t>
+      </w:r>
+    </w:p>
+    <w:p>
+      <w:pPr>
+        <w:rPr>
+          <w:rFonts w:ascii="Times New Roman" w:hAnsi="Times New Roman" w:cs="Times New Roman"/>
+          <w:color w:val="000000" w:themeColor="text1"/>
+          <w:sz w:val="36"/>
+          <w:szCs w:val="36"/>
+        </w:rPr>
+      </w:pPr>
+    </w:p>
+    <w:p>
+      <w:pPr>
+        <w:rPr>
+          <w:rFonts w:ascii="Times New Roman" w:hAnsi="Times New Roman" w:cs="Times New Roman"/>
+          <w:color w:val="000000" w:themeColor="text1"/>
+          <w:sz w:val="36"/>
+          <w:szCs w:val="36"/>
+        </w:rPr>
+      </w:pPr>
+      <w:r>
+        <w:rPr>
+          <w:rFonts w:ascii="Times New Roman" w:hAnsi="Times New Roman" w:cs="Times New Roman"/>
+          <w:b/>
+          <w:bCs/>
+          <w:color w:val="000000" w:themeColor="text1"/>
+          <w:sz w:val="36"/>
+          <w:szCs w:val="36"/>
+        </w:rPr>
+        <w:t>c</w:t>
+      </w:r>
+      <w:r>
+        <w:rPr>
+          <w:rFonts w:ascii="Times New Roman" w:hAnsi="Times New Roman" w:cs="Times New Roman"/>
+          <w:color w:val="000000" w:themeColor="text1"/>
+          <w:sz w:val="36"/>
+          <w:szCs w:val="36"/>
+        </w:rPr>
+        <w:t>.</w:t>
+      </w:r>
+      <w:r>
+        <w:rPr>
+          <w:rFonts w:ascii="Times New Roman" w:hAnsi="Times New Roman" w:cs="Times New Roman"/>
+          <w:color w:val="000000" w:themeColor="text1"/>
+          <w:sz w:val="36"/>
+          <w:szCs w:val="36"/>
+        </w:rPr>
+        <w:t>In my project :</w:t>
+      </w:r>
+    </w:p>
+    <w:p>
+      <w:pPr>
+        <w:rPr>
+          <w:rFonts w:ascii="Times New Roman" w:hAnsi="Times New Roman" w:cs="Times New Roman"/>
+          <w:color w:val="000000" w:themeColor="text1"/>
+          <w:sz w:val="36"/>
+          <w:szCs w:val="36"/>
+        </w:rPr>
+      </w:pPr>
+      <w:r>
+        <w:rPr>
+          <w:rFonts w:ascii="Times New Roman" w:hAnsi="Times New Roman" w:cs="Times New Roman"/>
+          <w:color w:val="000000" w:themeColor="text1"/>
+          <w:sz w:val="36"/>
+          <w:szCs w:val="36"/>
+        </w:rPr>
+        <w:t>F:\IT\IT normal\Java\Projects\API\Test\JavaAPI_DUC_Company1&gt;</w:t>
+      </w:r>
+    </w:p>
+    <w:p>
+      <w:pPr>
+        <w:rPr>
+          <w:rFonts w:ascii="Times New Roman" w:hAnsi="Times New Roman" w:cs="Times New Roman"/>
+          <w:color w:val="000000" w:themeColor="text1"/>
+          <w:sz w:val="36"/>
+          <w:szCs w:val="36"/>
+        </w:rPr>
+      </w:pPr>
+      <w:r>
+        <w:rPr>
+          <w:rFonts w:ascii="Times New Roman" w:hAnsi="Times New Roman" w:cs="Times New Roman"/>
+          <w:color w:val="000000" w:themeColor="text1"/>
+          <w:sz w:val="36"/>
+          <w:szCs w:val="36"/>
+        </w:rPr>
+        <w:t>Run this:</w:t>
+      </w:r>
+    </w:p>
+    <w:p>
+      <w:pPr>
+        <w:rPr>
+          <w:rFonts w:ascii="Times New Roman" w:hAnsi="Times New Roman" w:cs="Times New Roman"/>
+          <w:color w:val="000000" w:themeColor="text1"/>
+          <w:sz w:val="36"/>
+          <w:szCs w:val="36"/>
+        </w:rPr>
+      </w:pPr>
+      <w:r>
+        <w:rPr>
+          <w:rFonts w:ascii="Times New Roman" w:hAnsi="Times New Roman" w:cs="Times New Roman"/>
+          <w:color w:val="000000" w:themeColor="text1"/>
+          <w:sz w:val="36"/>
+          <w:szCs w:val="36"/>
+        </w:rPr>
+        <w:t>mvnw.cmd clean package -DskipTests</w:t>
+      </w:r>
+    </w:p>
+    <w:p>
+      <w:pPr>
+        <w:rPr>
+          <w:rFonts w:ascii="Times New Roman" w:hAnsi="Times New Roman" w:cs="Times New Roman"/>
+          <w:color w:val="000000" w:themeColor="text1"/>
+          <w:sz w:val="36"/>
+          <w:szCs w:val="36"/>
+        </w:rPr>
+      </w:pPr>
+      <w:r>
+        <w:rPr>
+          <w:rFonts w:ascii="Times New Roman" w:hAnsi="Times New Roman" w:cs="Times New Roman"/>
+          <w:color w:val="000000" w:themeColor="text1"/>
+          <w:sz w:val="36"/>
+          <w:szCs w:val="36"/>
+        </w:rPr>
+        <w:t>This command means:</w:t>
+      </w:r>
+    </w:p>
+    <w:p>
+      <w:pPr>
+        <w:spacing w:before="100" w:beforeAutospacing="1" w:after="100" w:afterAutospacing="1" w:line="240" w:lineRule="auto"/>
+        <w:rPr>
+          <w:rFonts w:ascii="Times New Roman" w:eastAsia="Times New Roman" w:hAnsi="Times New Roman" w:cs="Times New Roman"/>
+          <w:sz w:val="36"/>
+          <w:szCs w:val="36"/>
+        </w:rPr>
+      </w:pPr>
+      <w:r>
+        <w:rPr>
+          <w:rFonts w:ascii="Times New Roman" w:eastAsia="Times New Roman" w:hAnsi="Times New Roman" w:cs="Times New Roman"/>
+          <w:sz w:val="36"/>
+          <w:szCs w:val="36"/>
+        </w:rPr>
+        <w:t>  clean deletes the project's Maven build output, usually the target folder.</w:t>
+      </w:r>
+    </w:p>
+    <w:p>
+      <w:pPr>
+        <w:spacing w:before="100" w:beforeAutospacing="1" w:after="100" w:afterAutospacing="1" w:line="240" w:lineRule="auto"/>
+        <w:rPr>
+          <w:rFonts w:ascii="Times New Roman" w:eastAsia="Times New Roman" w:hAnsi="Times New Roman" w:cs="Times New Roman"/>
+          <w:sz w:val="36"/>
+          <w:szCs w:val="36"/>
+        </w:rPr>
+      </w:pPr>
+      <w:r>
+        <w:rPr>
+          <w:rFonts w:ascii="Times New Roman" w:eastAsia="Times New Roman" w:hAnsi="Times New Roman" w:cs="Times New Roman"/>
+          <w:sz w:val="36"/>
+          <w:szCs w:val="36"/>
+        </w:rPr>
+        <w:t>  package compiles your Java code and packages it into a JAR file.</w:t>
+      </w:r>
+    </w:p>
+    <w:p>
+      <w:pPr>
+        <w:spacing w:before="100" w:beforeAutospacing="1" w:after="100" w:afterAutospacing="1" w:line="240" w:lineRule="auto"/>
+        <w:rPr>
+          <w:rFonts w:ascii="Times New Roman" w:eastAsia="Times New Roman" w:hAnsi="Times New Roman" w:cs="Times New Roman"/>
+          <w:sz w:val="36"/>
+          <w:szCs w:val="36"/>
+        </w:rPr>
+      </w:pPr>
+      <w:r>
+        <w:rPr>
+          <w:rFonts w:ascii="Times New Roman" w:eastAsia="Times New Roman" w:hAnsi="Times New Roman" w:cs="Times New Roman"/>
+          <w:sz w:val="36"/>
+          <w:szCs w:val="36"/>
+        </w:rPr>
+        <w:t>  -DskipTests skips running tests.</w:t>
+      </w:r>
+    </w:p>
+    <w:p>
+      <w:pPr>
+        <w:rPr>
+          <w:rFonts w:ascii="Times New Roman" w:hAnsi="Times New Roman" w:cs="Times New Roman"/>
+          <w:color w:val="000000" w:themeColor="text1"/>
+          <w:sz w:val="36"/>
+          <w:szCs w:val="36"/>
+        </w:rPr>
+      </w:pPr>
+      <w:r>
+        <w:rPr>
+          <w:rFonts w:ascii="Times New Roman" w:hAnsi="Times New Roman" w:cs="Times New Roman"/>
+          <w:color w:val="000000" w:themeColor="text1"/>
+          <w:sz w:val="36"/>
+          <w:szCs w:val="36"/>
+        </w:rPr>
+        <w:t>If I see the result:</w:t>
+      </w:r>
+    </w:p>
+    <w:p>
+      <w:pPr>
+        <w:rPr>
+          <w:rFonts w:ascii="Times New Roman" w:hAnsi="Times New Roman" w:cs="Times New Roman"/>
+          <w:color w:val="000000" w:themeColor="text1"/>
+          <w:sz w:val="36"/>
+          <w:szCs w:val="36"/>
+        </w:rPr>
+      </w:pPr>
+      <w:r>
+        <w:rPr>
+          <w:rFonts w:ascii="Times New Roman" w:hAnsi="Times New Roman" w:cs="Times New Roman"/>
+          <w:color w:val="000000" w:themeColor="text1"/>
+          <w:sz w:val="36"/>
+          <w:szCs w:val="36"/>
+        </w:rPr>
+        <w:t>BUILD SUCCESS</w:t>
+      </w:r>
+    </w:p>
+    <w:p>
+      <w:pPr>
+        <w:rPr>
+          <w:rFonts w:ascii="Times New Roman" w:hAnsi="Times New Roman" w:cs="Times New Roman"/>
+          <w:color w:val="000000" w:themeColor="text1"/>
+          <w:sz w:val="36"/>
+          <w:szCs w:val="36"/>
+        </w:rPr>
+      </w:pPr>
+      <w:r>
+        <w:rPr>
+          <w:rFonts w:ascii="Times New Roman" w:hAnsi="Times New Roman" w:cs="Times New Roman"/>
+          <w:color w:val="000000" w:themeColor="text1"/>
+          <w:sz w:val="36"/>
+          <w:szCs w:val="36"/>
+        </w:rPr>
+        <w:t>……….</w:t>
+      </w:r>
+    </w:p>
+    <w:p>
+      <w:pPr>
+        <w:rPr>
+          <w:rFonts w:ascii="Times New Roman" w:hAnsi="Times New Roman" w:cs="Times New Roman"/>
+          <w:color w:val="000000" w:themeColor="text1"/>
+          <w:sz w:val="36"/>
+          <w:szCs w:val="36"/>
+        </w:rPr>
+      </w:pPr>
+      <w:r>
+        <w:rPr>
+          <w:rFonts w:ascii="Times New Roman" w:hAnsi="Times New Roman" w:cs="Times New Roman"/>
+          <w:color w:val="000000" w:themeColor="text1"/>
+          <w:sz w:val="36"/>
+          <w:szCs w:val="36"/>
+        </w:rPr>
+        <w:t xml:space="preserve">It means that it was </w:t>
+      </w:r>
+      <w:r>
+        <w:rPr>
+          <w:rFonts w:ascii="Times New Roman" w:hAnsi="Times New Roman" w:cs="Times New Roman"/>
+          <w:color w:val="000000" w:themeColor="text1"/>
+          <w:sz w:val="36"/>
+          <w:szCs w:val="36"/>
+        </w:rPr>
+        <w:t xml:space="preserve">successfully </w:t>
+      </w:r>
+      <w:r>
+        <w:rPr>
+          <w:rFonts w:ascii="Times New Roman" w:hAnsi="Times New Roman" w:cs="Times New Roman"/>
+          <w:color w:val="000000" w:themeColor="text1"/>
+          <w:sz w:val="36"/>
+          <w:szCs w:val="36"/>
+        </w:rPr>
+        <w:t>built.</w:t>
+      </w:r>
+    </w:p>
+    <w:p>
+      <w:pPr>
+        <w:rPr>
+          <w:rFonts w:ascii="Times New Roman" w:hAnsi="Times New Roman" w:cs="Times New Roman"/>
+          <w:color w:val="000000" w:themeColor="text1"/>
+          <w:sz w:val="36"/>
+          <w:szCs w:val="36"/>
+        </w:rPr>
+      </w:pPr>
+      <w:r>
+        <w:rPr>
+          <w:rFonts w:ascii="Times New Roman" w:hAnsi="Times New Roman" w:cs="Times New Roman"/>
+          <w:b/>
+          <w:bCs/>
+          <w:color w:val="000000" w:themeColor="text1"/>
+          <w:sz w:val="36"/>
+          <w:szCs w:val="36"/>
+        </w:rPr>
+        <w:t>d</w:t>
+      </w:r>
+      <w:r>
+        <w:rPr>
+          <w:rFonts w:ascii="Times New Roman" w:hAnsi="Times New Roman" w:cs="Times New Roman"/>
+          <w:b/>
+          <w:bCs/>
+          <w:color w:val="000000" w:themeColor="text1"/>
+          <w:sz w:val="36"/>
+          <w:szCs w:val="36"/>
+        </w:rPr>
+        <w:t>.</w:t>
+      </w:r>
+      <w:r>
+        <w:rPr>
+          <w:rFonts w:ascii="Times New Roman" w:hAnsi="Times New Roman" w:cs="Times New Roman"/>
+          <w:color w:val="000000" w:themeColor="text1"/>
+          <w:sz w:val="36"/>
+          <w:szCs w:val="36"/>
+        </w:rPr>
+        <w:t xml:space="preserve"> In my project :</w:t>
+      </w:r>
+    </w:p>
+    <w:p>
+      <w:pPr>
+        <w:rPr>
+          <w:rFonts w:ascii="Times New Roman" w:hAnsi="Times New Roman" w:cs="Times New Roman"/>
+          <w:color w:val="000000" w:themeColor="text1"/>
+          <w:sz w:val="36"/>
+          <w:szCs w:val="36"/>
+        </w:rPr>
+      </w:pPr>
+      <w:r>
+        <w:rPr>
+          <w:rFonts w:ascii="Times New Roman" w:hAnsi="Times New Roman" w:cs="Times New Roman"/>
+          <w:color w:val="000000" w:themeColor="text1"/>
+          <w:sz w:val="36"/>
+          <w:szCs w:val="36"/>
+        </w:rPr>
+        <w:t>F:\IT\IT normal\Java\Projects\API\Test\JavaAPI_DUC_Company1&gt;</w:t>
+      </w:r>
+    </w:p>
+    <w:p>
+      <w:pPr>
+        <w:rPr>
+          <w:rFonts w:ascii="Times New Roman" w:hAnsi="Times New Roman" w:cs="Times New Roman"/>
+          <w:color w:val="000000" w:themeColor="text1"/>
+          <w:sz w:val="36"/>
+          <w:szCs w:val="36"/>
+        </w:rPr>
+      </w:pPr>
+      <w:r>
+        <w:rPr>
+          <w:rFonts w:ascii="Times New Roman" w:hAnsi="Times New Roman" w:cs="Times New Roman"/>
+          <w:color w:val="000000" w:themeColor="text1"/>
+          <w:sz w:val="36"/>
+          <w:szCs w:val="36"/>
+        </w:rPr>
+        <w:t>Run this:</w:t>
+      </w:r>
+    </w:p>
+    <w:p>
+      <w:pPr>
+        <w:rPr>
+          <w:rFonts w:ascii="Times New Roman" w:hAnsi="Times New Roman" w:cs="Times New Roman"/>
+          <w:color w:val="000000" w:themeColor="text1"/>
+          <w:sz w:val="36"/>
+          <w:szCs w:val="36"/>
+        </w:rPr>
+      </w:pPr>
+      <w:r>
+        <w:rPr>
+          <w:rFonts w:ascii="Times New Roman" w:hAnsi="Times New Roman" w:cs="Times New Roman"/>
+          <w:color w:val="000000" w:themeColor="text1"/>
+          <w:sz w:val="36"/>
+          <w:szCs w:val="36"/>
+        </w:rPr>
+        <w:lastRenderedPageBreak/>
+        <w:t>docker compose up -d</w:t>
+      </w:r>
+    </w:p>
+    <w:p>
+      <w:pPr>
+        <w:rPr>
+          <w:rFonts w:ascii="Times New Roman" w:hAnsi="Times New Roman" w:cs="Times New Roman"/>
+          <w:color w:val="000000" w:themeColor="text1"/>
+          <w:sz w:val="36"/>
+          <w:szCs w:val="36"/>
+        </w:rPr>
+      </w:pPr>
+      <w:r>
+        <w:rPr>
+          <w:rFonts w:ascii="Times New Roman" w:hAnsi="Times New Roman" w:cs="Times New Roman"/>
+          <w:color w:val="000000" w:themeColor="text1"/>
+          <w:sz w:val="36"/>
+          <w:szCs w:val="36"/>
+        </w:rPr>
+        <w:t>Whenever I want to run my docker containers , run :</w:t>
+      </w:r>
+    </w:p>
+    <w:p>
+      <w:pPr>
+        <w:rPr>
+          <w:rFonts w:ascii="Times New Roman" w:hAnsi="Times New Roman" w:cs="Times New Roman"/>
+          <w:color w:val="000000" w:themeColor="text1"/>
+          <w:sz w:val="36"/>
+          <w:szCs w:val="36"/>
+        </w:rPr>
+      </w:pPr>
+      <w:r>
+        <w:rPr>
+          <w:rFonts w:ascii="Times New Roman" w:hAnsi="Times New Roman" w:cs="Times New Roman"/>
+          <w:color w:val="000000" w:themeColor="text1"/>
+          <w:sz w:val="36"/>
+          <w:szCs w:val="36"/>
+        </w:rPr>
+        <w:t>docker compose up -d</w:t>
+      </w:r>
+    </w:p>
+    <w:p>
+      <w:pPr>
+        <w:rPr>
+          <w:rFonts w:ascii="Times New Roman" w:hAnsi="Times New Roman" w:cs="Times New Roman"/>
+          <w:color w:val="000000" w:themeColor="text1"/>
+          <w:sz w:val="36"/>
+          <w:szCs w:val="36"/>
+        </w:rPr>
+      </w:pPr>
+      <w:r>
+        <w:rPr>
+          <w:rFonts w:ascii="Times New Roman" w:hAnsi="Times New Roman" w:cs="Times New Roman"/>
+          <w:color w:val="000000" w:themeColor="text1"/>
+          <w:sz w:val="36"/>
+          <w:szCs w:val="36"/>
+        </w:rPr>
+        <w:t>I can check by: in “Command Prompt”,run this:</w:t>
+      </w:r>
+    </w:p>
+    <w:p>
+      <w:pPr>
+        <w:rPr>
+          <w:rFonts w:ascii="Times New Roman" w:hAnsi="Times New Roman" w:cs="Times New Roman"/>
+          <w:color w:val="000000" w:themeColor="text1"/>
+          <w:sz w:val="36"/>
+          <w:szCs w:val="36"/>
+        </w:rPr>
+      </w:pPr>
+      <w:r>
+        <w:rPr>
+          <w:rFonts w:ascii="Times New Roman" w:hAnsi="Times New Roman" w:cs="Times New Roman"/>
+          <w:color w:val="000000" w:themeColor="text1"/>
+          <w:sz w:val="36"/>
+          <w:szCs w:val="36"/>
+        </w:rPr>
+        <w:t>docker images</w:t>
+      </w:r>
+    </w:p>
+    <w:p>
+      <w:pPr>
+        <w:rPr>
+          <w:rFonts w:ascii="Times New Roman" w:hAnsi="Times New Roman" w:cs="Times New Roman"/>
+          <w:color w:val="000000" w:themeColor="text1"/>
+          <w:sz w:val="36"/>
+          <w:szCs w:val="36"/>
+        </w:rPr>
+      </w:pPr>
+      <w:r>
+        <w:rPr>
+          <w:rFonts w:ascii="Times New Roman" w:hAnsi="Times New Roman" w:cs="Times New Roman"/>
+          <w:color w:val="000000" w:themeColor="text1"/>
+          <w:sz w:val="36"/>
+          <w:szCs w:val="36"/>
+        </w:rPr>
+        <w:t>to see images</w:t>
+      </w:r>
+    </w:p>
+    <w:p>
+      <w:pPr>
+        <w:rPr>
+          <w:rFonts w:ascii="Times New Roman" w:hAnsi="Times New Roman" w:cs="Times New Roman"/>
+          <w:color w:val="000000" w:themeColor="text1"/>
+          <w:sz w:val="36"/>
+          <w:szCs w:val="36"/>
+        </w:rPr>
+      </w:pPr>
+      <w:r>
+        <w:rPr>
+          <w:rFonts w:ascii="Times New Roman" w:hAnsi="Times New Roman" w:cs="Times New Roman"/>
+          <w:color w:val="000000" w:themeColor="text1"/>
+          <w:sz w:val="36"/>
+          <w:szCs w:val="36"/>
+        </w:rPr>
+        <w:t xml:space="preserve">then </w:t>
+      </w:r>
+    </w:p>
+    <w:p>
+      <w:pPr>
+        <w:rPr>
+          <w:rFonts w:ascii="Times New Roman" w:hAnsi="Times New Roman" w:cs="Times New Roman"/>
+          <w:color w:val="000000" w:themeColor="text1"/>
+          <w:sz w:val="36"/>
+          <w:szCs w:val="36"/>
+        </w:rPr>
+      </w:pPr>
+      <w:r>
+        <w:rPr>
+          <w:rFonts w:ascii="Times New Roman" w:hAnsi="Times New Roman" w:cs="Times New Roman"/>
+          <w:color w:val="000000" w:themeColor="text1"/>
+          <w:sz w:val="36"/>
+          <w:szCs w:val="36"/>
+        </w:rPr>
+        <w:t>docker ps</w:t>
+      </w:r>
+    </w:p>
+    <w:p>
+      <w:pPr>
+        <w:rPr>
+          <w:rFonts w:ascii="Times New Roman" w:hAnsi="Times New Roman" w:cs="Times New Roman"/>
+          <w:color w:val="000000" w:themeColor="text1"/>
+          <w:sz w:val="36"/>
+          <w:szCs w:val="36"/>
+        </w:rPr>
+      </w:pPr>
+      <w:r>
+        <w:rPr>
+          <w:rFonts w:ascii="Times New Roman" w:hAnsi="Times New Roman" w:cs="Times New Roman"/>
+          <w:color w:val="000000" w:themeColor="text1"/>
+          <w:sz w:val="36"/>
+          <w:szCs w:val="36"/>
+        </w:rPr>
+        <w:t>to see running containers.</w:t>
+      </w:r>
+    </w:p>
+    <w:p>
+      <w:pPr>
+        <w:rPr>
+          <w:rFonts w:ascii="Times New Roman" w:hAnsi="Times New Roman" w:cs="Times New Roman"/>
+          <w:color w:val="000000" w:themeColor="text1"/>
+          <w:sz w:val="36"/>
+          <w:szCs w:val="36"/>
+        </w:rPr>
+      </w:pPr>
+      <w:r>
+        <w:rPr>
+          <w:rFonts w:ascii="Times New Roman" w:hAnsi="Times New Roman" w:cs="Times New Roman"/>
+          <w:color w:val="000000" w:themeColor="text1"/>
+          <w:sz w:val="36"/>
+          <w:szCs w:val="36"/>
+        </w:rPr>
+        <w:t xml:space="preserve"> </w:t>
+      </w:r>
+    </w:p>
+    <w:p>
+      <w:pPr>
+        <w:rPr>
+          <w:rFonts w:ascii="Times New Roman" w:hAnsi="Times New Roman" w:cs="Times New Roman"/>
+          <w:color w:val="000000" w:themeColor="text1"/>
+          <w:sz w:val="36"/>
+          <w:szCs w:val="36"/>
+        </w:rPr>
+      </w:pPr>
+      <w:r>
+        <w:rPr>
+          <w:rFonts w:ascii="Times New Roman" w:hAnsi="Times New Roman" w:cs="Times New Roman"/>
+          <w:b/>
+          <w:bCs/>
+          <w:color w:val="000000" w:themeColor="text1"/>
+          <w:sz w:val="36"/>
+          <w:szCs w:val="36"/>
+        </w:rPr>
+        <w:t>e</w:t>
+      </w:r>
+      <w:r>
+        <w:rPr>
+          <w:rFonts w:ascii="Times New Roman" w:hAnsi="Times New Roman" w:cs="Times New Roman"/>
+          <w:b/>
+          <w:bCs/>
+          <w:color w:val="000000" w:themeColor="text1"/>
+          <w:sz w:val="36"/>
+          <w:szCs w:val="36"/>
+        </w:rPr>
+        <w:t>.</w:t>
+      </w:r>
+      <w:r>
+        <w:rPr>
+          <w:rFonts w:ascii="Times New Roman" w:hAnsi="Times New Roman" w:cs="Times New Roman"/>
+          <w:color w:val="000000" w:themeColor="text1"/>
+          <w:sz w:val="36"/>
+          <w:szCs w:val="36"/>
+        </w:rPr>
+        <w:t xml:space="preserve"> In my project :</w:t>
+      </w:r>
+    </w:p>
+    <w:p>
+      <w:pPr>
+        <w:rPr>
+          <w:rFonts w:ascii="Times New Roman" w:hAnsi="Times New Roman" w:cs="Times New Roman"/>
+          <w:color w:val="000000" w:themeColor="text1"/>
+          <w:sz w:val="36"/>
+          <w:szCs w:val="36"/>
+        </w:rPr>
+      </w:pPr>
+      <w:r>
+        <w:rPr>
+          <w:rFonts w:ascii="Times New Roman" w:hAnsi="Times New Roman" w:cs="Times New Roman"/>
+          <w:color w:val="000000" w:themeColor="text1"/>
+          <w:sz w:val="36"/>
+          <w:szCs w:val="36"/>
+        </w:rPr>
+        <w:t>F:\IT\IT normal\Java\Projects\API\Test\JavaAPI_DUC_Company1&gt;</w:t>
+      </w:r>
+    </w:p>
+    <w:p>
+      <w:pPr>
+        <w:rPr>
+          <w:rFonts w:ascii="Times New Roman" w:hAnsi="Times New Roman" w:cs="Times New Roman"/>
+          <w:color w:val="000000" w:themeColor="text1"/>
+          <w:sz w:val="36"/>
+          <w:szCs w:val="36"/>
+        </w:rPr>
+      </w:pPr>
+      <w:r>
+        <w:rPr>
+          <w:rFonts w:ascii="Times New Roman" w:hAnsi="Times New Roman" w:cs="Times New Roman"/>
+          <w:color w:val="000000" w:themeColor="text1"/>
+          <w:sz w:val="36"/>
+          <w:szCs w:val="36"/>
+        </w:rPr>
+        <w:t>Run this:</w:t>
+      </w:r>
+    </w:p>
+    <w:p>
+      <w:pPr>
+        <w:rPr>
+          <w:rFonts w:ascii="Times New Roman" w:hAnsi="Times New Roman" w:cs="Times New Roman"/>
+          <w:color w:val="000000" w:themeColor="text1"/>
+          <w:sz w:val="36"/>
+          <w:szCs w:val="36"/>
+        </w:rPr>
+      </w:pPr>
+      <w:r>
+        <w:rPr>
+          <w:rFonts w:ascii="Times New Roman" w:hAnsi="Times New Roman" w:cs="Times New Roman"/>
+          <w:color w:val="000000" w:themeColor="text1"/>
+          <w:sz w:val="36"/>
+          <w:szCs w:val="36"/>
+        </w:rPr>
+        <w:t>docker compose up -d --build</w:t>
+      </w:r>
+    </w:p>
+    <w:p>
+      <w:pPr>
+        <w:rPr>
+          <w:rFonts w:ascii="Times New Roman" w:hAnsi="Times New Roman" w:cs="Times New Roman"/>
+          <w:color w:val="000000" w:themeColor="text1"/>
+          <w:sz w:val="36"/>
+          <w:szCs w:val="36"/>
+        </w:rPr>
+      </w:pPr>
+      <w:r>
+        <w:rPr>
+          <w:rFonts w:ascii="Times New Roman" w:hAnsi="Times New Roman" w:cs="Times New Roman"/>
+          <w:color w:val="000000" w:themeColor="text1"/>
+          <w:sz w:val="36"/>
+          <w:szCs w:val="36"/>
+        </w:rPr>
+        <w:t>This command means:</w:t>
+      </w:r>
+    </w:p>
+    <w:p>
+      <w:pPr>
+        <w:pStyle w:val="NormalWeb"/>
+        <w:numPr>
+          <w:ilvl w:val="0"/>
+          <w:numId w:val="43"/>
+        </w:numPr>
+        <w:rPr>
+          <w:sz w:val="36"/>
+          <w:szCs w:val="36"/>
+        </w:rPr>
+      </w:pPr>
+      <w:r>
+        <w:rPr>
+          <w:rStyle w:val="HTMLCode"/>
+          <w:rFonts w:ascii="Times New Roman" w:hAnsi="Times New Roman" w:cs="Times New Roman"/>
+          <w:sz w:val="36"/>
+          <w:szCs w:val="36"/>
+        </w:rPr>
+        <w:t>--build</w:t>
+      </w:r>
+      <w:r>
+        <w:rPr>
+          <w:sz w:val="36"/>
+          <w:szCs w:val="36"/>
+        </w:rPr>
+        <w:t xml:space="preserve"> rebuilds your Spring Boot Docker image.</w:t>
+      </w:r>
+    </w:p>
+    <w:p>
+      <w:pPr>
+        <w:pStyle w:val="NormalWeb"/>
+        <w:numPr>
+          <w:ilvl w:val="0"/>
+          <w:numId w:val="43"/>
+        </w:numPr>
+        <w:rPr>
+          <w:sz w:val="36"/>
+          <w:szCs w:val="36"/>
+        </w:rPr>
+      </w:pPr>
+      <w:r>
+        <w:rPr>
+          <w:rStyle w:val="HTMLCode"/>
+          <w:rFonts w:ascii="Times New Roman" w:hAnsi="Times New Roman" w:cs="Times New Roman"/>
+          <w:sz w:val="36"/>
+          <w:szCs w:val="36"/>
+        </w:rPr>
+        <w:t>up -d</w:t>
+      </w:r>
+      <w:r>
+        <w:rPr>
+          <w:sz w:val="36"/>
+          <w:szCs w:val="36"/>
+        </w:rPr>
+        <w:t xml:space="preserve"> starts or recreates containers as necessary.</w:t>
+      </w:r>
+    </w:p>
+    <w:p>
+      <w:pPr>
+        <w:pStyle w:val="NormalWeb"/>
+        <w:numPr>
+          <w:ilvl w:val="0"/>
+          <w:numId w:val="43"/>
+        </w:numPr>
+        <w:rPr>
+          <w:sz w:val="36"/>
+          <w:szCs w:val="36"/>
+        </w:rPr>
+      </w:pPr>
+      <w:r>
+        <w:rPr>
+          <w:sz w:val="36"/>
+          <w:szCs w:val="36"/>
+        </w:rPr>
+        <w:t>Your app container may be recreated, but the database records should remain in the MySQL volume.</w:t>
+      </w:r>
+    </w:p>
+    <w:p>
+      <w:pPr>
+        <w:pStyle w:val="NormalWeb"/>
+        <w:rPr>
+          <w:sz w:val="36"/>
+          <w:szCs w:val="36"/>
+        </w:rPr>
+      </w:pPr>
+      <w:r>
+        <w:rPr>
+          <w:sz w:val="36"/>
+          <w:szCs w:val="36"/>
+        </w:rPr>
+        <w:t>Rebuilding the app does not automatically erase your database records.</w:t>
+      </w:r>
+    </w:p>
+    <w:p>
+      <w:pPr>
+        <w:rPr>
+          <w:rFonts w:ascii="Times New Roman" w:hAnsi="Times New Roman" w:cs="Times New Roman"/>
+          <w:color w:val="000000" w:themeColor="text1"/>
+          <w:sz w:val="36"/>
+          <w:szCs w:val="36"/>
+        </w:rPr>
+      </w:pPr>
+      <w:r>
+        <w:rPr>
+          <w:rFonts w:ascii="Times New Roman" w:hAnsi="Times New Roman" w:cs="Times New Roman"/>
+          <w:color w:val="000000" w:themeColor="text1"/>
+          <w:sz w:val="36"/>
+          <w:szCs w:val="36"/>
+        </w:rPr>
+        <w:lastRenderedPageBreak/>
+        <w:t>If I see these:</w:t>
+      </w:r>
+    </w:p>
+    <w:p>
+      <w:pPr>
+        <w:rPr>
+          <w:rFonts w:ascii="Times New Roman" w:hAnsi="Times New Roman" w:cs="Times New Roman"/>
+          <w:color w:val="000000" w:themeColor="text1"/>
+          <w:sz w:val="36"/>
+          <w:szCs w:val="36"/>
+        </w:rPr>
+      </w:pPr>
+      <w:r>
+        <w:rPr>
+          <w:rFonts w:ascii="Segoe UI Emoji" w:hAnsi="Segoe UI Emoji" w:cs="Segoe UI Emoji"/>
+          <w:color w:val="000000" w:themeColor="text1"/>
+          <w:sz w:val="36"/>
+          <w:szCs w:val="36"/>
+        </w:rPr>
+        <w:t>✔</w:t>
+      </w:r>
+      <w:r>
+        <w:rPr>
+          <w:rFonts w:ascii="Times New Roman" w:hAnsi="Times New Roman" w:cs="Times New Roman"/>
+          <w:color w:val="000000" w:themeColor="text1"/>
+          <w:sz w:val="36"/>
+          <w:szCs w:val="36"/>
+        </w:rPr>
+        <w:t xml:space="preserve"> Container javaapi-duc-company1-redis  …</w:t>
+      </w:r>
+    </w:p>
+    <w:p>
+      <w:pPr>
+        <w:rPr>
+          <w:rFonts w:ascii="Times New Roman" w:hAnsi="Times New Roman" w:cs="Times New Roman"/>
+          <w:color w:val="000000" w:themeColor="text1"/>
+          <w:sz w:val="36"/>
+          <w:szCs w:val="36"/>
+        </w:rPr>
+      </w:pPr>
+      <w:r>
+        <w:rPr>
+          <w:rFonts w:ascii="Times New Roman" w:hAnsi="Times New Roman" w:cs="Times New Roman"/>
+          <w:color w:val="000000" w:themeColor="text1"/>
+          <w:sz w:val="36"/>
+          <w:szCs w:val="36"/>
+        </w:rPr>
+        <w:t xml:space="preserve"> </w:t>
+      </w:r>
+      <w:r>
+        <w:rPr>
+          <w:rFonts w:ascii="Segoe UI Emoji" w:hAnsi="Segoe UI Emoji" w:cs="Segoe UI Emoji"/>
+          <w:color w:val="000000" w:themeColor="text1"/>
+          <w:sz w:val="36"/>
+          <w:szCs w:val="36"/>
+        </w:rPr>
+        <w:t>✔</w:t>
+      </w:r>
+      <w:r>
+        <w:rPr>
+          <w:rFonts w:ascii="Times New Roman" w:hAnsi="Times New Roman" w:cs="Times New Roman"/>
+          <w:color w:val="000000" w:themeColor="text1"/>
+          <w:sz w:val="36"/>
+          <w:szCs w:val="36"/>
+        </w:rPr>
+        <w:t xml:space="preserve"> Container javaapi-duc-company1-mysql  …</w:t>
+      </w:r>
+    </w:p>
+    <w:p>
+      <w:pPr>
+        <w:rPr>
+          <w:rFonts w:ascii="Times New Roman" w:hAnsi="Times New Roman" w:cs="Times New Roman"/>
+          <w:color w:val="000000" w:themeColor="text1"/>
+          <w:sz w:val="36"/>
+          <w:szCs w:val="36"/>
+        </w:rPr>
+      </w:pPr>
+      <w:r>
+        <w:rPr>
+          <w:rFonts w:ascii="Times New Roman" w:hAnsi="Times New Roman" w:cs="Times New Roman"/>
+          <w:color w:val="000000" w:themeColor="text1"/>
+          <w:sz w:val="36"/>
+          <w:szCs w:val="36"/>
+        </w:rPr>
+        <w:t xml:space="preserve"> </w:t>
+      </w:r>
+      <w:r>
+        <w:rPr>
+          <w:rFonts w:ascii="Segoe UI Emoji" w:hAnsi="Segoe UI Emoji" w:cs="Segoe UI Emoji"/>
+          <w:color w:val="000000" w:themeColor="text1"/>
+          <w:sz w:val="36"/>
+          <w:szCs w:val="36"/>
+        </w:rPr>
+        <w:t>✔</w:t>
+      </w:r>
+      <w:r>
+        <w:rPr>
+          <w:rFonts w:ascii="Times New Roman" w:hAnsi="Times New Roman" w:cs="Times New Roman"/>
+          <w:color w:val="000000" w:themeColor="text1"/>
+          <w:sz w:val="36"/>
+          <w:szCs w:val="36"/>
+        </w:rPr>
+        <w:t xml:space="preserve"> Container javaapi-duc-company1-app  …</w:t>
+      </w:r>
+    </w:p>
+    <w:p>
+      <w:pPr>
+        <w:rPr>
+          <w:rFonts w:ascii="Times New Roman" w:hAnsi="Times New Roman" w:cs="Times New Roman"/>
+          <w:color w:val="000000" w:themeColor="text1"/>
+          <w:sz w:val="36"/>
+          <w:szCs w:val="36"/>
+        </w:rPr>
+      </w:pPr>
+      <w:r>
+        <w:rPr>
+          <w:rFonts w:ascii="Times New Roman" w:hAnsi="Times New Roman" w:cs="Times New Roman"/>
+          <w:color w:val="000000" w:themeColor="text1"/>
+          <w:sz w:val="36"/>
+          <w:szCs w:val="36"/>
+        </w:rPr>
+        <w:t>……..</w:t>
+      </w:r>
+    </w:p>
+    <w:p>
+      <w:pPr>
+        <w:rPr>
+          <w:rFonts w:ascii="Times New Roman" w:hAnsi="Times New Roman" w:cs="Times New Roman"/>
+          <w:color w:val="000000" w:themeColor="text1"/>
+          <w:sz w:val="36"/>
+          <w:szCs w:val="36"/>
+        </w:rPr>
+      </w:pPr>
+      <w:r>
+        <w:rPr>
+          <w:rFonts w:ascii="Times New Roman" w:hAnsi="Times New Roman" w:cs="Times New Roman"/>
+          <w:color w:val="000000" w:themeColor="text1"/>
+          <w:sz w:val="36"/>
+          <w:szCs w:val="36"/>
+        </w:rPr>
+        <w:t>It means that I was successful.</w:t>
+      </w:r>
+    </w:p>
+    <w:p>
+      <w:pPr>
+        <w:rPr>
+          <w:rFonts w:ascii="Times New Roman" w:hAnsi="Times New Roman" w:cs="Times New Roman"/>
+          <w:color w:val="000000" w:themeColor="text1"/>
+          <w:sz w:val="36"/>
+          <w:szCs w:val="36"/>
+        </w:rPr>
+      </w:pPr>
+      <w:r>
+        <w:rPr>
+          <w:rFonts w:ascii="Times New Roman" w:hAnsi="Times New Roman" w:cs="Times New Roman"/>
+          <w:color w:val="000000" w:themeColor="text1"/>
+          <w:sz w:val="36"/>
+          <w:szCs w:val="36"/>
+        </w:rPr>
+        <w:t>I can check by: in “Command Prompt”,run this:</w:t>
+      </w:r>
+    </w:p>
+    <w:p>
+      <w:pPr>
+        <w:rPr>
+          <w:rFonts w:ascii="Times New Roman" w:hAnsi="Times New Roman" w:cs="Times New Roman"/>
+          <w:color w:val="000000" w:themeColor="text1"/>
+          <w:sz w:val="36"/>
+          <w:szCs w:val="36"/>
+        </w:rPr>
+      </w:pPr>
+      <w:r>
+        <w:rPr>
+          <w:rFonts w:ascii="Times New Roman" w:hAnsi="Times New Roman" w:cs="Times New Roman"/>
+          <w:color w:val="000000" w:themeColor="text1"/>
+          <w:sz w:val="36"/>
+          <w:szCs w:val="36"/>
+        </w:rPr>
+        <w:t>docker images</w:t>
+      </w:r>
+    </w:p>
+    <w:p>
+      <w:pPr>
+        <w:rPr>
+          <w:rFonts w:ascii="Times New Roman" w:hAnsi="Times New Roman" w:cs="Times New Roman"/>
+          <w:color w:val="000000" w:themeColor="text1"/>
+          <w:sz w:val="36"/>
+          <w:szCs w:val="36"/>
+        </w:rPr>
+      </w:pPr>
+      <w:r>
+        <w:rPr>
+          <w:rFonts w:ascii="Times New Roman" w:hAnsi="Times New Roman" w:cs="Times New Roman"/>
+          <w:color w:val="000000" w:themeColor="text1"/>
+          <w:sz w:val="36"/>
+          <w:szCs w:val="36"/>
+        </w:rPr>
+        <w:t>to see images</w:t>
+      </w:r>
+    </w:p>
+    <w:p>
+      <w:pPr>
+        <w:rPr>
+          <w:rFonts w:ascii="Times New Roman" w:hAnsi="Times New Roman" w:cs="Times New Roman"/>
+          <w:color w:val="000000" w:themeColor="text1"/>
+          <w:sz w:val="36"/>
+          <w:szCs w:val="36"/>
+        </w:rPr>
+      </w:pPr>
+      <w:r>
+        <w:rPr>
+          <w:rFonts w:ascii="Times New Roman" w:hAnsi="Times New Roman" w:cs="Times New Roman"/>
+          <w:color w:val="000000" w:themeColor="text1"/>
+          <w:sz w:val="36"/>
+          <w:szCs w:val="36"/>
+        </w:rPr>
+        <w:t xml:space="preserve">then </w:t>
+      </w:r>
+    </w:p>
+    <w:p>
+      <w:pPr>
+        <w:rPr>
+          <w:rFonts w:ascii="Times New Roman" w:hAnsi="Times New Roman" w:cs="Times New Roman"/>
+          <w:color w:val="000000" w:themeColor="text1"/>
+          <w:sz w:val="36"/>
+          <w:szCs w:val="36"/>
+        </w:rPr>
+      </w:pPr>
+      <w:r>
+        <w:rPr>
+          <w:rFonts w:ascii="Times New Roman" w:hAnsi="Times New Roman" w:cs="Times New Roman"/>
+          <w:color w:val="000000" w:themeColor="text1"/>
+          <w:sz w:val="36"/>
+          <w:szCs w:val="36"/>
+        </w:rPr>
+        <w:t>docker ps</w:t>
+      </w:r>
+    </w:p>
+    <w:p>
+      <w:pPr>
+        <w:rPr>
+          <w:rFonts w:ascii="Times New Roman" w:hAnsi="Times New Roman" w:cs="Times New Roman"/>
+          <w:color w:val="000000" w:themeColor="text1"/>
+          <w:sz w:val="36"/>
+          <w:szCs w:val="36"/>
+        </w:rPr>
+      </w:pPr>
+      <w:r>
+        <w:rPr>
+          <w:rFonts w:ascii="Times New Roman" w:hAnsi="Times New Roman" w:cs="Times New Roman"/>
+          <w:color w:val="000000" w:themeColor="text1"/>
+          <w:sz w:val="36"/>
+          <w:szCs w:val="36"/>
+        </w:rPr>
+        <w:t>to see running containers.</w:t>
+      </w:r>
+    </w:p>
+    <w:p>
+      <w:pPr>
+        <w:rPr>
+          <w:rFonts w:ascii="Times New Roman" w:hAnsi="Times New Roman" w:cs="Times New Roman"/>
+          <w:b/>
+          <w:bCs/>
+          <w:color w:val="000000" w:themeColor="text1"/>
+          <w:sz w:val="36"/>
+          <w:szCs w:val="36"/>
+        </w:rPr>
+      </w:pPr>
+    </w:p>
+    <w:p>
+      <w:pPr>
+        <w:rPr>
+          <w:rFonts w:ascii="Times New Roman" w:hAnsi="Times New Roman" w:cs="Times New Roman"/>
+          <w:b/>
+          <w:bCs/>
+          <w:color w:val="000000" w:themeColor="text1"/>
+          <w:sz w:val="36"/>
+          <w:szCs w:val="36"/>
+        </w:rPr>
+      </w:pPr>
+      <w:r>
+        <w:rPr>
+          <w:rFonts w:ascii="Times New Roman" w:hAnsi="Times New Roman" w:cs="Times New Roman"/>
+          <w:b/>
+          <w:bCs/>
+          <w:color w:val="000000" w:themeColor="text1"/>
+          <w:sz w:val="36"/>
+          <w:szCs w:val="36"/>
+        </w:rPr>
+        <w:t>f</w:t>
+      </w:r>
+      <w:r>
+        <w:rPr>
+          <w:rFonts w:ascii="Times New Roman" w:hAnsi="Times New Roman" w:cs="Times New Roman"/>
+          <w:b/>
+          <w:bCs/>
+          <w:color w:val="000000" w:themeColor="text1"/>
+          <w:sz w:val="36"/>
+          <w:szCs w:val="36"/>
+        </w:rPr>
+        <w:t>.Note:</w:t>
+      </w:r>
+    </w:p>
+    <w:p>
+      <w:pPr>
+        <w:spacing w:before="100" w:beforeAutospacing="1" w:after="100" w:afterAutospacing="1" w:line="240" w:lineRule="auto"/>
+        <w:rPr>
+          <w:rFonts w:ascii="Times New Roman" w:eastAsia="Times New Roman" w:hAnsi="Times New Roman" w:cs="Times New Roman"/>
+          <w:sz w:val="36"/>
+          <w:szCs w:val="36"/>
+        </w:rPr>
+      </w:pPr>
+      <w:r>
+        <w:rPr>
+          <w:rFonts w:ascii="Times New Roman" w:eastAsia="Times New Roman" w:hAnsi="Times New Roman" w:cs="Times New Roman"/>
+          <w:sz w:val="36"/>
+          <w:szCs w:val="36"/>
+        </w:rPr>
+        <w:t xml:space="preserve">For </w:t>
+      </w:r>
+      <w:r>
+        <w:rPr>
+          <w:rFonts w:ascii="Times New Roman" w:eastAsia="Times New Roman" w:hAnsi="Times New Roman" w:cs="Times New Roman"/>
+          <w:sz w:val="36"/>
+          <w:szCs w:val="36"/>
+        </w:rPr>
+        <w:t xml:space="preserve">this </w:t>
+      </w:r>
+      <w:r>
+        <w:rPr>
+          <w:rFonts w:ascii="Times New Roman" w:eastAsia="Times New Roman" w:hAnsi="Times New Roman" w:cs="Times New Roman"/>
+          <w:sz w:val="36"/>
+          <w:szCs w:val="36"/>
+        </w:rPr>
+        <w:t xml:space="preserve">project, whenever </w:t>
+      </w:r>
+      <w:r>
+        <w:rPr>
+          <w:rFonts w:ascii="Times New Roman" w:eastAsia="Times New Roman" w:hAnsi="Times New Roman" w:cs="Times New Roman"/>
+          <w:sz w:val="36"/>
+          <w:szCs w:val="36"/>
+        </w:rPr>
+        <w:t xml:space="preserve">I </w:t>
+      </w:r>
+      <w:r>
+        <w:rPr>
+          <w:rFonts w:ascii="Times New Roman" w:eastAsia="Times New Roman" w:hAnsi="Times New Roman" w:cs="Times New Roman"/>
+          <w:sz w:val="36"/>
+          <w:szCs w:val="36"/>
+        </w:rPr>
+        <w:t>change Java code and want to test it in Docker, use:</w:t>
+      </w:r>
+    </w:p>
+    <w:p>
+      <w:pPr>
+        <w:tabs>
+          <w:tab w:val="left" w:pos="916"/>
+          <w:tab w:val="left" w:pos="1832"/>
+          <w:tab w:val="left" w:pos="2748"/>
+          <w:tab w:val="left" w:pos="3664"/>
+          <w:tab w:val="left" w:pos="4580"/>
+          <w:tab w:val="left" w:pos="5496"/>
+          <w:tab w:val="left" w:pos="6412"/>
+          <w:tab w:val="left" w:pos="7328"/>
+          <w:tab w:val="left" w:pos="8244"/>
+          <w:tab w:val="left" w:pos="9160"/>
+          <w:tab w:val="left" w:pos="10076"/>
+          <w:tab w:val="left" w:pos="10992"/>
+          <w:tab w:val="left" w:pos="11908"/>
+          <w:tab w:val="left" w:pos="12824"/>
+          <w:tab w:val="left" w:pos="13740"/>
+          <w:tab w:val="left" w:pos="14656"/>
+        </w:tabs>
+        <w:spacing w:after="0" w:line="240" w:lineRule="auto"/>
+        <w:rPr>
+          <w:rFonts w:ascii="Times New Roman" w:eastAsia="Times New Roman" w:hAnsi="Times New Roman" w:cs="Times New Roman"/>
+          <w:sz w:val="36"/>
+          <w:szCs w:val="36"/>
+        </w:rPr>
+      </w:pPr>
+      <w:r>
+        <w:rPr>
+          <w:rFonts w:ascii="Times New Roman" w:eastAsia="Times New Roman" w:hAnsi="Times New Roman" w:cs="Times New Roman"/>
+          <w:sz w:val="36"/>
+          <w:szCs w:val="36"/>
+        </w:rPr>
+        <w:t>mvnw.cmd clean package -DskipTests</w:t>
+      </w:r>
+    </w:p>
+    <w:p>
+      <w:pPr>
+        <w:tabs>
+          <w:tab w:val="left" w:pos="916"/>
+          <w:tab w:val="left" w:pos="1832"/>
+          <w:tab w:val="left" w:pos="2748"/>
+          <w:tab w:val="left" w:pos="3664"/>
+          <w:tab w:val="left" w:pos="4580"/>
+          <w:tab w:val="left" w:pos="5496"/>
+          <w:tab w:val="left" w:pos="6412"/>
+          <w:tab w:val="left" w:pos="7328"/>
+          <w:tab w:val="left" w:pos="8244"/>
+          <w:tab w:val="left" w:pos="9160"/>
+          <w:tab w:val="left" w:pos="10076"/>
+          <w:tab w:val="left" w:pos="10992"/>
+          <w:tab w:val="left" w:pos="11908"/>
+          <w:tab w:val="left" w:pos="12824"/>
+          <w:tab w:val="left" w:pos="13740"/>
+          <w:tab w:val="left" w:pos="14656"/>
+        </w:tabs>
+        <w:spacing w:after="0" w:line="240" w:lineRule="auto"/>
+        <w:rPr>
+          <w:rFonts w:ascii="Times New Roman" w:eastAsia="Times New Roman" w:hAnsi="Times New Roman" w:cs="Times New Roman"/>
+          <w:sz w:val="36"/>
+          <w:szCs w:val="36"/>
+        </w:rPr>
+      </w:pPr>
+      <w:r>
+        <w:rPr>
+          <w:rFonts w:ascii="Times New Roman" w:eastAsia="Times New Roman" w:hAnsi="Times New Roman" w:cs="Times New Roman"/>
+          <w:sz w:val="36"/>
+          <w:szCs w:val="36"/>
+        </w:rPr>
+        <w:t>docker compose up -d --build</w:t>
+      </w:r>
+    </w:p>
+    <w:p>
+      <w:pPr>
+        <w:tabs>
+          <w:tab w:val="left" w:pos="916"/>
+          <w:tab w:val="left" w:pos="1832"/>
+          <w:tab w:val="left" w:pos="2748"/>
+          <w:tab w:val="left" w:pos="3664"/>
+          <w:tab w:val="left" w:pos="4580"/>
+          <w:tab w:val="left" w:pos="5496"/>
+          <w:tab w:val="left" w:pos="6412"/>
+          <w:tab w:val="left" w:pos="7328"/>
+          <w:tab w:val="left" w:pos="8244"/>
+          <w:tab w:val="left" w:pos="9160"/>
+          <w:tab w:val="left" w:pos="10076"/>
+          <w:tab w:val="left" w:pos="10992"/>
+          <w:tab w:val="left" w:pos="11908"/>
+          <w:tab w:val="left" w:pos="12824"/>
+          <w:tab w:val="left" w:pos="13740"/>
+          <w:tab w:val="left" w:pos="14656"/>
+        </w:tabs>
+        <w:spacing w:after="0" w:line="240" w:lineRule="auto"/>
+        <w:rPr>
+          <w:rFonts w:ascii="Times New Roman" w:eastAsia="Times New Roman" w:hAnsi="Times New Roman" w:cs="Times New Roman"/>
+          <w:sz w:val="36"/>
+          <w:szCs w:val="36"/>
+        </w:rPr>
+      </w:pPr>
+      <w:r>
+        <w:rPr>
+          <w:rFonts w:ascii="Times New Roman" w:eastAsia="Times New Roman" w:hAnsi="Times New Roman" w:cs="Times New Roman"/>
+          <w:sz w:val="36"/>
+          <w:szCs w:val="36"/>
+        </w:rPr>
+        <w:t>docker logs -f javaapi-duc-company1-app</w:t>
+      </w:r>
+    </w:p>
+    <w:p>
+      <w:pPr>
+        <w:rPr>
+          <w:rFonts w:ascii="Times New Roman" w:hAnsi="Times New Roman" w:cs="Times New Roman"/>
+          <w:b/>
+          <w:bCs/>
+          <w:color w:val="000000" w:themeColor="text1"/>
+          <w:sz w:val="36"/>
+          <w:szCs w:val="36"/>
+        </w:rPr>
+      </w:pPr>
+    </w:p>
+    <w:p>
+      <w:pPr>
+        <w:rPr>
+          <w:rFonts w:ascii="Times New Roman" w:hAnsi="Times New Roman" w:cs="Times New Roman"/>
+          <w:b/>
+          <w:bCs/>
+          <w:color w:val="000000" w:themeColor="text1"/>
+          <w:sz w:val="36"/>
+          <w:szCs w:val="36"/>
+        </w:rPr>
+      </w:pPr>
+      <w:r>
+        <w:rPr>
+          <w:rFonts w:ascii="Times New Roman" w:hAnsi="Times New Roman" w:cs="Times New Roman"/>
+          <w:b/>
+          <w:bCs/>
+          <w:color w:val="000000" w:themeColor="text1"/>
+          <w:sz w:val="36"/>
+          <w:szCs w:val="36"/>
+        </w:rPr>
+        <w:t>g</w:t>
+      </w:r>
+      <w:r>
+        <w:rPr>
+          <w:rFonts w:ascii="Times New Roman" w:hAnsi="Times New Roman" w:cs="Times New Roman"/>
+          <w:b/>
+          <w:bCs/>
+          <w:color w:val="000000" w:themeColor="text1"/>
+          <w:sz w:val="36"/>
+          <w:szCs w:val="36"/>
+        </w:rPr>
+        <w:t>.Insert data :</w:t>
+      </w:r>
+    </w:p>
+    <w:p>
+      <w:pPr>
+        <w:rPr>
+          <w:rFonts w:ascii="Times New Roman" w:hAnsi="Times New Roman" w:cs="Times New Roman"/>
+          <w:color w:val="000000" w:themeColor="text1"/>
+          <w:sz w:val="36"/>
+          <w:szCs w:val="36"/>
+        </w:rPr>
+      </w:pPr>
+      <w:r>
+        <w:rPr>
+          <w:rFonts w:ascii="Times New Roman" w:hAnsi="Times New Roman" w:cs="Times New Roman"/>
+          <w:color w:val="000000" w:themeColor="text1"/>
+          <w:sz w:val="36"/>
+          <w:szCs w:val="36"/>
+        </w:rPr>
+        <w:t xml:space="preserve">In “Command Prompt”,run this: </w:t>
+      </w:r>
+    </w:p>
+    <w:p>
+      <w:pPr>
+        <w:rPr>
+          <w:rFonts w:ascii="Times New Roman" w:hAnsi="Times New Roman" w:cs="Times New Roman"/>
+          <w:color w:val="000000" w:themeColor="text1"/>
+          <w:sz w:val="36"/>
+          <w:szCs w:val="36"/>
+        </w:rPr>
+      </w:pPr>
+      <w:r>
+        <w:rPr>
+          <w:rFonts w:ascii="Times New Roman" w:hAnsi="Times New Roman" w:cs="Times New Roman"/>
+          <w:color w:val="000000" w:themeColor="text1"/>
+          <w:sz w:val="36"/>
+          <w:szCs w:val="36"/>
+        </w:rPr>
+        <w:lastRenderedPageBreak/>
+        <w:t>docker exec -it javaapi-duc-company1-mysql mysql -uroot -pabcxyz -D javaapi_duc_company1</w:t>
+      </w:r>
+    </w:p>
+    <w:p>
+      <w:pPr>
+        <w:rPr>
+          <w:rFonts w:ascii="Times New Roman" w:hAnsi="Times New Roman" w:cs="Times New Roman"/>
+          <w:sz w:val="36"/>
+          <w:szCs w:val="36"/>
+        </w:rPr>
+      </w:pPr>
+      <w:r>
+        <w:rPr>
+          <w:rFonts w:ascii="Times New Roman" w:hAnsi="Times New Roman" w:cs="Times New Roman"/>
+          <w:color w:val="000000" w:themeColor="text1"/>
+          <w:sz w:val="36"/>
+          <w:szCs w:val="36"/>
+        </w:rPr>
+        <w:t xml:space="preserve">When I see </w:t>
+      </w:r>
+      <w:r>
+        <w:rPr>
+          <w:rFonts w:ascii="Times New Roman" w:hAnsi="Times New Roman" w:cs="Times New Roman"/>
+          <w:sz w:val="36"/>
+          <w:szCs w:val="36"/>
+        </w:rPr>
+        <w:t>mysql&gt; , paste:</w:t>
+      </w:r>
+    </w:p>
+    <w:p>
+      <w:pPr>
+        <w:pStyle w:val="NormalWeb"/>
+        <w:rPr>
+          <w:sz w:val="36"/>
+          <w:szCs w:val="36"/>
+        </w:rPr>
+      </w:pPr>
+      <w:r>
+        <w:rPr>
+          <w:sz w:val="36"/>
+          <w:szCs w:val="36"/>
+        </w:rPr>
+        <w:t>INSERT INTO districts (id, name, province_city_id)</w:t>
+      </w:r>
+      <w:r>
+        <w:rPr>
+          <w:sz w:val="36"/>
+          <w:szCs w:val="36"/>
+        </w:rPr>
+        <w:br/>
+        <w:t>VALUES</w:t>
+      </w:r>
+      <w:r>
+        <w:rPr>
+          <w:sz w:val="36"/>
+          <w:szCs w:val="36"/>
+        </w:rPr>
+        <w:br/>
+        <w:t>(1, 'Ba Dinh', 1),</w:t>
+      </w:r>
+      <w:r>
+        <w:rPr>
+          <w:sz w:val="36"/>
+          <w:szCs w:val="36"/>
+        </w:rPr>
+        <w:br/>
+        <w:t>(2, 'Cau Giay', 1),</w:t>
+      </w:r>
+      <w:r>
+        <w:rPr>
+          <w:sz w:val="36"/>
+          <w:szCs w:val="36"/>
+        </w:rPr>
+        <w:br/>
+        <w:t>(3, 'Hoan Kiem', 1),</w:t>
+      </w:r>
+      <w:r>
+        <w:rPr>
+          <w:sz w:val="36"/>
+          <w:szCs w:val="36"/>
+        </w:rPr>
+        <w:br/>
+        <w:t>(4, 'Go Vap', 2),</w:t>
+      </w:r>
+      <w:r>
+        <w:rPr>
+          <w:sz w:val="36"/>
+          <w:szCs w:val="36"/>
+        </w:rPr>
+        <w:br/>
+        <w:t>(5, 'Phu Nhuan', 2),</w:t>
+      </w:r>
+      <w:r>
+        <w:rPr>
+          <w:sz w:val="36"/>
+          <w:szCs w:val="36"/>
+        </w:rPr>
+        <w:br/>
+        <w:t>(6, 'Tan Binh', 2),</w:t>
+      </w:r>
+      <w:r>
+        <w:rPr>
+          <w:sz w:val="36"/>
+          <w:szCs w:val="36"/>
+        </w:rPr>
+        <w:br/>
+        <w:t>(7, 'Do Son', 3),</w:t>
+      </w:r>
+      <w:r>
+        <w:rPr>
+          <w:sz w:val="36"/>
+          <w:szCs w:val="36"/>
+        </w:rPr>
+        <w:br/>
+        <w:t>(8, 'Hong Bang', 3),</w:t>
+      </w:r>
+      <w:r>
+        <w:rPr>
+          <w:sz w:val="36"/>
+          <w:szCs w:val="36"/>
+        </w:rPr>
+        <w:br/>
+        <w:t>(9, 'Le Chan', 3),</w:t>
+      </w:r>
+      <w:r>
+        <w:rPr>
+          <w:sz w:val="36"/>
+          <w:szCs w:val="36"/>
+        </w:rPr>
+        <w:br/>
+        <w:t>(10, 'Ngo Quyen', 3);</w:t>
+      </w:r>
+    </w:p>
+    <w:p>
+      <w:pPr>
+        <w:rPr>
+          <w:rFonts w:ascii="Times New Roman" w:hAnsi="Times New Roman" w:cs="Times New Roman"/>
+          <w:sz w:val="36"/>
+          <w:szCs w:val="36"/>
+        </w:rPr>
+      </w:pPr>
+      <w:r>
+        <w:rPr>
+          <w:rFonts w:ascii="Times New Roman" w:hAnsi="Times New Roman" w:cs="Times New Roman"/>
+          <w:sz w:val="36"/>
+          <w:szCs w:val="36"/>
+        </w:rPr>
+        <w:t>Insert into products (id, name,description,price, product_category_id,province_city_id, district_id ,image_url ,stock_quantity)</w:t>
+      </w:r>
+    </w:p>
+    <w:p>
+      <w:pPr>
+        <w:rPr>
+          <w:rFonts w:ascii="Times New Roman" w:hAnsi="Times New Roman" w:cs="Times New Roman"/>
+          <w:sz w:val="36"/>
+          <w:szCs w:val="36"/>
+        </w:rPr>
+      </w:pPr>
+      <w:r>
+        <w:rPr>
+          <w:rFonts w:ascii="Times New Roman" w:hAnsi="Times New Roman" w:cs="Times New Roman"/>
+          <w:sz w:val="36"/>
+          <w:szCs w:val="36"/>
+        </w:rPr>
+        <w:t xml:space="preserve">VALUES </w:t>
+      </w:r>
+    </w:p>
+    <w:p>
+      <w:pPr>
+        <w:rPr>
+          <w:rFonts w:ascii="Times New Roman" w:hAnsi="Times New Roman" w:cs="Times New Roman"/>
+          <w:sz w:val="36"/>
+          <w:szCs w:val="36"/>
+        </w:rPr>
+      </w:pPr>
+      <w:r>
+        <w:rPr>
+          <w:rFonts w:ascii="Times New Roman" w:hAnsi="Times New Roman" w:cs="Times New Roman"/>
+          <w:sz w:val="36"/>
+          <w:szCs w:val="36"/>
+        </w:rPr>
+        <w:t>(1, 'Apple 1', 'Sweet.Made in Germany', 3, 1,1, 1, 'Apple1.jpg',1000),</w:t>
+      </w:r>
+    </w:p>
+    <w:p>
+      <w:pPr>
+        <w:rPr>
+          <w:rFonts w:ascii="Times New Roman" w:hAnsi="Times New Roman" w:cs="Times New Roman"/>
+          <w:sz w:val="36"/>
+          <w:szCs w:val="36"/>
+        </w:rPr>
+      </w:pPr>
+      <w:r>
+        <w:rPr>
+          <w:rFonts w:ascii="Times New Roman" w:hAnsi="Times New Roman" w:cs="Times New Roman"/>
+          <w:sz w:val="36"/>
+          <w:szCs w:val="36"/>
+        </w:rPr>
+        <w:t>(2, 'Apple 2', 'Good.Made in Sweden', 8, 1, 1,2, 'Apple2.jpg',1000),</w:t>
+      </w:r>
+    </w:p>
+    <w:p>
+      <w:pPr>
+        <w:rPr>
+          <w:rFonts w:ascii="Times New Roman" w:hAnsi="Times New Roman" w:cs="Times New Roman"/>
+          <w:sz w:val="36"/>
+          <w:szCs w:val="36"/>
+        </w:rPr>
+      </w:pPr>
+      <w:r>
+        <w:rPr>
+          <w:rFonts w:ascii="Times New Roman" w:hAnsi="Times New Roman" w:cs="Times New Roman"/>
+          <w:sz w:val="36"/>
+          <w:szCs w:val="36"/>
+        </w:rPr>
+        <w:t>(3, 'Apricot', 'Sweet.Made in Vietnam', 6, 1,1, 3, 'Apricot.jpg',1000),</w:t>
+      </w:r>
+    </w:p>
+    <w:p>
+      <w:pPr>
+        <w:rPr>
+          <w:rFonts w:ascii="Times New Roman" w:hAnsi="Times New Roman" w:cs="Times New Roman"/>
+          <w:sz w:val="36"/>
+          <w:szCs w:val="36"/>
+        </w:rPr>
+      </w:pPr>
+      <w:r>
+        <w:rPr>
+          <w:rFonts w:ascii="Times New Roman" w:hAnsi="Times New Roman" w:cs="Times New Roman"/>
+          <w:sz w:val="36"/>
+          <w:szCs w:val="36"/>
+        </w:rPr>
+        <w:lastRenderedPageBreak/>
+        <w:t>(4, 'Banana', 'Sweet.Made in Vietnam', 2, 1, 2,4, 'Banana.jpg',1000),</w:t>
+      </w:r>
+    </w:p>
+    <w:p>
+      <w:pPr>
+        <w:rPr>
+          <w:rFonts w:ascii="Times New Roman" w:hAnsi="Times New Roman" w:cs="Times New Roman"/>
+          <w:sz w:val="36"/>
+          <w:szCs w:val="36"/>
+        </w:rPr>
+      </w:pPr>
+      <w:r>
+        <w:rPr>
+          <w:rFonts w:ascii="Times New Roman" w:hAnsi="Times New Roman" w:cs="Times New Roman"/>
+          <w:sz w:val="36"/>
+          <w:szCs w:val="36"/>
+        </w:rPr>
+        <w:t>(5, 'Bell Pepper', 'Made in Vietnam', 5, 1, 2,5, 'Bell Pepper.jpg',1000),</w:t>
+      </w:r>
+    </w:p>
+    <w:p>
+      <w:pPr>
+        <w:rPr>
+          <w:rFonts w:ascii="Times New Roman" w:hAnsi="Times New Roman" w:cs="Times New Roman"/>
+          <w:sz w:val="36"/>
+          <w:szCs w:val="36"/>
+        </w:rPr>
+      </w:pPr>
+      <w:r>
+        <w:rPr>
+          <w:rFonts w:ascii="Times New Roman" w:hAnsi="Times New Roman" w:cs="Times New Roman"/>
+          <w:sz w:val="36"/>
+          <w:szCs w:val="36"/>
+        </w:rPr>
+        <w:t>(6, 'Bread 1', 'Sweet.Made in Germany', 4, 2,2, 6, 'Bread1.jpg',1000),</w:t>
+      </w:r>
+    </w:p>
+    <w:p>
+      <w:pPr>
+        <w:rPr>
+          <w:rFonts w:ascii="Times New Roman" w:hAnsi="Times New Roman" w:cs="Times New Roman"/>
+          <w:sz w:val="36"/>
+          <w:szCs w:val="36"/>
+        </w:rPr>
+      </w:pPr>
+      <w:r>
+        <w:rPr>
+          <w:rFonts w:ascii="Times New Roman" w:hAnsi="Times New Roman" w:cs="Times New Roman"/>
+          <w:sz w:val="36"/>
+          <w:szCs w:val="36"/>
+        </w:rPr>
+        <w:t>(7, 'Broccoli', 'Made in Vietnam', 6, 1, 3,7, 'Broccoli.jpg',1000),</w:t>
+      </w:r>
+    </w:p>
+    <w:p>
+      <w:pPr>
+        <w:rPr>
+          <w:rFonts w:ascii="Times New Roman" w:hAnsi="Times New Roman" w:cs="Times New Roman"/>
+          <w:sz w:val="36"/>
+          <w:szCs w:val="36"/>
+        </w:rPr>
+      </w:pPr>
+      <w:r>
+        <w:rPr>
+          <w:rFonts w:ascii="Times New Roman" w:hAnsi="Times New Roman" w:cs="Times New Roman"/>
+          <w:sz w:val="36"/>
+          <w:szCs w:val="36"/>
+        </w:rPr>
+        <w:t>(8, 'Cabbage', 'High quality, made in Germany', 9, 1, 3, 8, 'Cabbage.jpg',1000),</w:t>
+      </w:r>
+    </w:p>
+    <w:p>
+      <w:pPr>
+        <w:rPr>
+          <w:rFonts w:ascii="Times New Roman" w:hAnsi="Times New Roman" w:cs="Times New Roman"/>
+          <w:sz w:val="36"/>
+          <w:szCs w:val="36"/>
+        </w:rPr>
+      </w:pPr>
+      <w:r>
+        <w:rPr>
+          <w:rFonts w:ascii="Times New Roman" w:hAnsi="Times New Roman" w:cs="Times New Roman"/>
+          <w:sz w:val="36"/>
+          <w:szCs w:val="36"/>
+        </w:rPr>
+        <w:t>(9, 'Carrot', 'Delicious, made in Britain', 2, 1, 3, 9, 'Carrot.jpg',1000),</w:t>
+      </w:r>
+    </w:p>
+    <w:p>
+      <w:pPr>
+        <w:rPr>
+          <w:rFonts w:ascii="Times New Roman" w:hAnsi="Times New Roman" w:cs="Times New Roman"/>
+          <w:sz w:val="36"/>
+          <w:szCs w:val="36"/>
+        </w:rPr>
+      </w:pPr>
+      <w:r>
+        <w:rPr>
+          <w:rFonts w:ascii="Times New Roman" w:hAnsi="Times New Roman" w:cs="Times New Roman"/>
+          <w:sz w:val="36"/>
+          <w:szCs w:val="36"/>
+        </w:rPr>
+        <w:t>(10, 'Cauliflower', 'High quality, made in Denmark', 11, 1,3, 10, 'Cauliflower.jpg',1000),</w:t>
+      </w:r>
+    </w:p>
+    <w:p>
+      <w:pPr>
+        <w:rPr>
+          <w:rFonts w:ascii="Times New Roman" w:hAnsi="Times New Roman" w:cs="Times New Roman"/>
+          <w:sz w:val="36"/>
+          <w:szCs w:val="36"/>
+        </w:rPr>
+      </w:pPr>
+      <w:r>
+        <w:rPr>
+          <w:rFonts w:ascii="Times New Roman" w:hAnsi="Times New Roman" w:cs="Times New Roman"/>
+          <w:sz w:val="36"/>
+          <w:szCs w:val="36"/>
+        </w:rPr>
+        <w:t>(11, 'Cherry', 'High quality.Made in Denmark', 12, 1, 1, 1, 'Cherry.jpg',1000),</w:t>
+      </w:r>
+    </w:p>
+    <w:p>
+      <w:pPr>
+        <w:rPr>
+          <w:rFonts w:ascii="Times New Roman" w:hAnsi="Times New Roman" w:cs="Times New Roman"/>
+          <w:sz w:val="36"/>
+          <w:szCs w:val="36"/>
+        </w:rPr>
+      </w:pPr>
+      <w:r>
+        <w:rPr>
+          <w:rFonts w:ascii="Times New Roman" w:hAnsi="Times New Roman" w:cs="Times New Roman"/>
+          <w:sz w:val="36"/>
+          <w:szCs w:val="36"/>
+        </w:rPr>
+        <w:t>(12, 'Cow Milk', 'With sugar.Made in Germany', 8, 3, 1, 2, 'Cow Milk.jpg',1000),</w:t>
+      </w:r>
+    </w:p>
+    <w:p>
+      <w:pPr>
+        <w:rPr>
+          <w:rFonts w:ascii="Times New Roman" w:hAnsi="Times New Roman" w:cs="Times New Roman"/>
+          <w:sz w:val="36"/>
+          <w:szCs w:val="36"/>
+        </w:rPr>
+      </w:pPr>
+      <w:r>
+        <w:rPr>
+          <w:rFonts w:ascii="Times New Roman" w:hAnsi="Times New Roman" w:cs="Times New Roman"/>
+          <w:sz w:val="36"/>
+          <w:szCs w:val="36"/>
+        </w:rPr>
+        <w:t>(13, 'Croissant', 'Made in Finland', 3, 2, 1, 3, 'Croissant.jpg',1000),</w:t>
+      </w:r>
+    </w:p>
+    <w:p>
+      <w:pPr>
+        <w:rPr>
+          <w:rFonts w:ascii="Times New Roman" w:hAnsi="Times New Roman" w:cs="Times New Roman"/>
+          <w:sz w:val="36"/>
+          <w:szCs w:val="36"/>
+        </w:rPr>
+      </w:pPr>
+      <w:r>
+        <w:rPr>
+          <w:rFonts w:ascii="Times New Roman" w:hAnsi="Times New Roman" w:cs="Times New Roman"/>
+          <w:sz w:val="36"/>
+          <w:szCs w:val="36"/>
+        </w:rPr>
+        <w:t>(14, 'Cucumber 1', 'Made in Germany', 2, 1, 2, 4, 'Cucumber1.jpg',1000),</w:t>
+      </w:r>
+    </w:p>
+    <w:p>
+      <w:pPr>
+        <w:rPr>
+          <w:rFonts w:ascii="Times New Roman" w:hAnsi="Times New Roman" w:cs="Times New Roman"/>
+          <w:sz w:val="36"/>
+          <w:szCs w:val="36"/>
+        </w:rPr>
+      </w:pPr>
+      <w:r>
+        <w:rPr>
+          <w:rFonts w:ascii="Times New Roman" w:hAnsi="Times New Roman" w:cs="Times New Roman"/>
+          <w:sz w:val="36"/>
+          <w:szCs w:val="36"/>
+        </w:rPr>
+        <w:t>(15, 'Cucumber 2', 'Made in Laos', 4, 1,2, 5, 'Cucumber2.jpg',1000),</w:t>
+      </w:r>
+    </w:p>
+    <w:p>
+      <w:pPr>
+        <w:rPr>
+          <w:rFonts w:ascii="Times New Roman" w:hAnsi="Times New Roman" w:cs="Times New Roman"/>
+          <w:sz w:val="36"/>
+          <w:szCs w:val="36"/>
+        </w:rPr>
+      </w:pPr>
+      <w:r>
+        <w:rPr>
+          <w:rFonts w:ascii="Times New Roman" w:hAnsi="Times New Roman" w:cs="Times New Roman"/>
+          <w:sz w:val="36"/>
+          <w:szCs w:val="36"/>
+        </w:rPr>
+        <w:lastRenderedPageBreak/>
+        <w:t>(16, 'French loaf', 'Made in Vietnam', 5, 2,2, 6, 'French loaf.jpg',1000),</w:t>
+      </w:r>
+    </w:p>
+    <w:p>
+      <w:pPr>
+        <w:rPr>
+          <w:rFonts w:ascii="Times New Roman" w:hAnsi="Times New Roman" w:cs="Times New Roman"/>
+          <w:sz w:val="36"/>
+          <w:szCs w:val="36"/>
+        </w:rPr>
+      </w:pPr>
+      <w:r>
+        <w:rPr>
+          <w:rFonts w:ascii="Times New Roman" w:hAnsi="Times New Roman" w:cs="Times New Roman"/>
+          <w:sz w:val="36"/>
+          <w:szCs w:val="36"/>
+        </w:rPr>
+        <w:t>(17, 'Ginger', 'Made in Poland', 1, 1, 3, 7, 'Ginger.jpg',1000),</w:t>
+      </w:r>
+    </w:p>
+    <w:p>
+      <w:pPr>
+        <w:rPr>
+          <w:rFonts w:ascii="Times New Roman" w:hAnsi="Times New Roman" w:cs="Times New Roman"/>
+          <w:sz w:val="36"/>
+          <w:szCs w:val="36"/>
+        </w:rPr>
+      </w:pPr>
+      <w:r>
+        <w:rPr>
+          <w:rFonts w:ascii="Times New Roman" w:hAnsi="Times New Roman" w:cs="Times New Roman"/>
+          <w:sz w:val="36"/>
+          <w:szCs w:val="36"/>
+        </w:rPr>
+        <w:t>(18, 'Grapefruit', 'High quality, made in Sweden', 4, 1,3, 8, 'Grapefruit.jpg',1000),</w:t>
+      </w:r>
+    </w:p>
+    <w:p>
+      <w:pPr>
+        <w:rPr>
+          <w:rFonts w:ascii="Times New Roman" w:hAnsi="Times New Roman" w:cs="Times New Roman"/>
+          <w:sz w:val="36"/>
+          <w:szCs w:val="36"/>
+        </w:rPr>
+      </w:pPr>
+      <w:r>
+        <w:rPr>
+          <w:rFonts w:ascii="Times New Roman" w:hAnsi="Times New Roman" w:cs="Times New Roman"/>
+          <w:sz w:val="36"/>
+          <w:szCs w:val="36"/>
+        </w:rPr>
+        <w:t>(19, 'Grapes 1', 'Good.Made in Finland', 3, 1,3, 9, 'Grapes1.jpg',1000),</w:t>
+      </w:r>
+    </w:p>
+    <w:p>
+      <w:pPr>
+        <w:rPr>
+          <w:rFonts w:ascii="Times New Roman" w:hAnsi="Times New Roman" w:cs="Times New Roman"/>
+          <w:sz w:val="36"/>
+          <w:szCs w:val="36"/>
+        </w:rPr>
+      </w:pPr>
+      <w:r>
+        <w:rPr>
+          <w:rFonts w:ascii="Times New Roman" w:hAnsi="Times New Roman" w:cs="Times New Roman"/>
+          <w:sz w:val="36"/>
+          <w:szCs w:val="36"/>
+        </w:rPr>
+        <w:t>(20, 'Grapes 2', 'Good.Made in Norway', 7, 1,3, 10, 'Grapes2.jpg',1000),</w:t>
+      </w:r>
+    </w:p>
+    <w:p>
+      <w:pPr>
+        <w:rPr>
+          <w:rFonts w:ascii="Times New Roman" w:hAnsi="Times New Roman" w:cs="Times New Roman"/>
+          <w:sz w:val="36"/>
+          <w:szCs w:val="36"/>
+        </w:rPr>
+      </w:pPr>
+      <w:r>
+        <w:rPr>
+          <w:rFonts w:ascii="Times New Roman" w:hAnsi="Times New Roman" w:cs="Times New Roman"/>
+          <w:sz w:val="36"/>
+          <w:szCs w:val="36"/>
+        </w:rPr>
+        <w:t>(21, 'Soy Milk', 'Good.Made in Poland', 5, 3,1, 1, 'Soy Milk.jpg',1000),</w:t>
+      </w:r>
+    </w:p>
+    <w:p>
+      <w:pPr>
+        <w:rPr>
+          <w:rFonts w:ascii="Times New Roman" w:hAnsi="Times New Roman" w:cs="Times New Roman"/>
+          <w:sz w:val="36"/>
+          <w:szCs w:val="36"/>
+        </w:rPr>
+      </w:pPr>
+      <w:r>
+        <w:rPr>
+          <w:rFonts w:ascii="Times New Roman" w:hAnsi="Times New Roman" w:cs="Times New Roman"/>
+          <w:sz w:val="36"/>
+          <w:szCs w:val="36"/>
+        </w:rPr>
+        <w:t xml:space="preserve">(22, 'Tommaso', 'Good.Made in Norway', 2, 2,1, 2, 'Tommaso.jpg',1000);  </w:t>
+      </w:r>
+    </w:p>
+    <w:p>
+      <w:pPr>
+        <w:rPr>
+          <w:rFonts w:ascii="Times New Roman" w:hAnsi="Times New Roman" w:cs="Times New Roman"/>
+          <w:sz w:val="36"/>
+          <w:szCs w:val="36"/>
+        </w:rPr>
+      </w:pPr>
+      <w:r>
+        <w:rPr>
+          <w:rFonts w:ascii="Times New Roman" w:hAnsi="Times New Roman" w:cs="Times New Roman"/>
+          <w:sz w:val="36"/>
+          <w:szCs w:val="36"/>
+        </w:rPr>
+        <w:t>………..</w:t>
+      </w:r>
+    </w:p>
+    <w:p>
+      <w:pPr>
+        <w:rPr>
+          <w:rFonts w:ascii="Times New Roman" w:hAnsi="Times New Roman" w:cs="Times New Roman"/>
+          <w:color w:val="000000" w:themeColor="text1"/>
+          <w:sz w:val="36"/>
+          <w:szCs w:val="36"/>
+        </w:rPr>
+      </w:pPr>
+      <w:r>
+        <w:rPr>
+          <w:rFonts w:ascii="Times New Roman" w:hAnsi="Times New Roman" w:cs="Times New Roman"/>
+          <w:color w:val="000000" w:themeColor="text1"/>
+          <w:sz w:val="36"/>
+          <w:szCs w:val="36"/>
+        </w:rPr>
+        <w:t xml:space="preserve">In “Command Prompt”, </w:t>
+      </w:r>
+    </w:p>
+    <w:p>
+      <w:pPr>
+        <w:rPr>
+          <w:rFonts w:ascii="Times New Roman" w:hAnsi="Times New Roman" w:cs="Times New Roman"/>
+          <w:sz w:val="36"/>
+          <w:szCs w:val="36"/>
+        </w:rPr>
+      </w:pPr>
+      <w:r>
+        <w:rPr>
+          <w:rFonts w:ascii="Times New Roman" w:hAnsi="Times New Roman" w:cs="Times New Roman"/>
+          <w:sz w:val="36"/>
+          <w:szCs w:val="36"/>
+        </w:rPr>
+        <w:t>_To see all tables’ names,</w:t>
+      </w:r>
+      <w:r>
+        <w:rPr>
+          <w:rFonts w:ascii="Times New Roman" w:hAnsi="Times New Roman" w:cs="Times New Roman"/>
+          <w:color w:val="000000" w:themeColor="text1"/>
+          <w:sz w:val="36"/>
+          <w:szCs w:val="36"/>
+        </w:rPr>
+        <w:t xml:space="preserve"> </w:t>
+      </w:r>
+      <w:r>
+        <w:rPr>
+          <w:rFonts w:ascii="Times New Roman" w:hAnsi="Times New Roman" w:cs="Times New Roman"/>
+          <w:color w:val="000000" w:themeColor="text1"/>
+          <w:sz w:val="36"/>
+          <w:szCs w:val="36"/>
+        </w:rPr>
+        <w:t>run this:</w:t>
+      </w:r>
+    </w:p>
+    <w:p>
+      <w:pPr>
+        <w:rPr>
+          <w:rFonts w:ascii="Times New Roman" w:hAnsi="Times New Roman" w:cs="Times New Roman"/>
+          <w:sz w:val="36"/>
+          <w:szCs w:val="36"/>
+        </w:rPr>
+      </w:pPr>
+      <w:r>
+        <w:rPr>
+          <w:rFonts w:ascii="Times New Roman" w:hAnsi="Times New Roman" w:cs="Times New Roman"/>
+          <w:sz w:val="36"/>
+          <w:szCs w:val="36"/>
+        </w:rPr>
+        <w:t>docker exec -it javaapi-duc-company1-mysql mysql -uroot -pabcxyz -D javaapi_duc_company1 -e "SHOW TABLES;"</w:t>
+      </w:r>
+    </w:p>
+    <w:p>
+      <w:pPr>
+        <w:rPr>
+          <w:rFonts w:ascii="Times New Roman" w:hAnsi="Times New Roman" w:cs="Times New Roman"/>
+          <w:sz w:val="36"/>
+          <w:szCs w:val="36"/>
+        </w:rPr>
+      </w:pPr>
+      <w:r>
+        <w:rPr>
+          <w:rFonts w:ascii="Times New Roman" w:hAnsi="Times New Roman" w:cs="Times New Roman"/>
+          <w:sz w:val="36"/>
+          <w:szCs w:val="36"/>
+        </w:rPr>
+        <w:t>And create all stored procedures, triggers.Remember to change tables names : Furnitures=&gt; furnitures,Potteries -&gt; potteries since</w:t>
+      </w:r>
+    </w:p>
+    <w:p>
+      <w:pPr>
+        <w:rPr>
+          <w:rFonts w:ascii="Times New Roman" w:hAnsi="Times New Roman" w:cs="Times New Roman"/>
+          <w:sz w:val="36"/>
+          <w:szCs w:val="36"/>
+        </w:rPr>
+      </w:pPr>
+      <w:r>
+        <w:rPr>
+          <w:rFonts w:ascii="Times New Roman" w:hAnsi="Times New Roman" w:cs="Times New Roman"/>
+          <w:sz w:val="36"/>
+          <w:szCs w:val="36"/>
+        </w:rPr>
+        <w:t>In MySQL workbench both Furnitures and furnitures are acceptable, whereas in docker MySQL container Furnitures is different from furnitures.</w:t>
+      </w:r>
+    </w:p>
+    <w:p>
+      <w:pPr>
+        <w:rPr>
+          <w:rFonts w:ascii="Times New Roman" w:hAnsi="Times New Roman" w:cs="Times New Roman"/>
+          <w:b/>
+          <w:bCs/>
+          <w:sz w:val="36"/>
+          <w:szCs w:val="36"/>
+        </w:rPr>
+      </w:pPr>
+      <w:r>
+        <w:rPr>
+          <w:rFonts w:ascii="Times New Roman" w:hAnsi="Times New Roman" w:cs="Times New Roman"/>
+          <w:b/>
+          <w:bCs/>
+          <w:sz w:val="36"/>
+          <w:szCs w:val="36"/>
+        </w:rPr>
+        <w:lastRenderedPageBreak/>
+        <w:t>h.</w:t>
+      </w:r>
+      <w:r>
+        <w:rPr>
+          <w:rFonts w:ascii="Times New Roman" w:hAnsi="Times New Roman" w:cs="Times New Roman"/>
+          <w:b/>
+          <w:bCs/>
+          <w:sz w:val="36"/>
+          <w:szCs w:val="36"/>
+        </w:rPr>
+        <w:t>Check MySQL:</w:t>
+      </w:r>
+    </w:p>
+    <w:p>
+      <w:pPr>
+        <w:rPr>
+          <w:rFonts w:ascii="Times New Roman" w:hAnsi="Times New Roman" w:cs="Times New Roman"/>
+          <w:color w:val="000000" w:themeColor="text1"/>
+          <w:sz w:val="36"/>
+          <w:szCs w:val="36"/>
+        </w:rPr>
+      </w:pPr>
+      <w:r>
+        <w:rPr>
+          <w:rFonts w:ascii="Times New Roman" w:hAnsi="Times New Roman" w:cs="Times New Roman"/>
+          <w:color w:val="000000" w:themeColor="text1"/>
+          <w:sz w:val="36"/>
+          <w:szCs w:val="36"/>
+        </w:rPr>
+        <w:t xml:space="preserve">In “Command Prompt”, </w:t>
+      </w:r>
+    </w:p>
+    <w:p>
+      <w:pPr>
+        <w:rPr>
+          <w:rFonts w:ascii="Times New Roman" w:hAnsi="Times New Roman" w:cs="Times New Roman"/>
+          <w:sz w:val="36"/>
+          <w:szCs w:val="36"/>
+        </w:rPr>
+      </w:pPr>
+      <w:r>
+        <w:rPr>
+          <w:rFonts w:ascii="Times New Roman" w:hAnsi="Times New Roman" w:cs="Times New Roman"/>
+          <w:sz w:val="36"/>
+          <w:szCs w:val="36"/>
+        </w:rPr>
+        <w:t>_To see all tables’ names,</w:t>
+      </w:r>
+      <w:r>
+        <w:rPr>
+          <w:rFonts w:ascii="Times New Roman" w:hAnsi="Times New Roman" w:cs="Times New Roman"/>
+          <w:color w:val="000000" w:themeColor="text1"/>
+          <w:sz w:val="36"/>
+          <w:szCs w:val="36"/>
+        </w:rPr>
+        <w:t xml:space="preserve"> </w:t>
+      </w:r>
+      <w:r>
+        <w:rPr>
+          <w:rFonts w:ascii="Times New Roman" w:hAnsi="Times New Roman" w:cs="Times New Roman"/>
+          <w:color w:val="000000" w:themeColor="text1"/>
+          <w:sz w:val="36"/>
+          <w:szCs w:val="36"/>
+        </w:rPr>
+        <w:t>run this:</w:t>
+      </w:r>
+    </w:p>
+    <w:p>
+      <w:pPr>
+        <w:rPr>
+          <w:rFonts w:ascii="Times New Roman" w:hAnsi="Times New Roman" w:cs="Times New Roman"/>
+          <w:sz w:val="36"/>
+          <w:szCs w:val="36"/>
+        </w:rPr>
+      </w:pPr>
+      <w:r>
+        <w:rPr>
+          <w:rFonts w:ascii="Times New Roman" w:hAnsi="Times New Roman" w:cs="Times New Roman"/>
+          <w:sz w:val="36"/>
+          <w:szCs w:val="36"/>
+        </w:rPr>
+        <w:t>docker exec -it javaapi-duc-company1-mysql mysql -uroot -pabcxyz -D javaapi_duc_company1 -e "SHOW TABLES;"</w:t>
+      </w:r>
+    </w:p>
+    <w:p>
+      <w:pPr>
+        <w:rPr>
+          <w:rFonts w:ascii="Times New Roman" w:hAnsi="Times New Roman" w:cs="Times New Roman"/>
+          <w:sz w:val="36"/>
+          <w:szCs w:val="36"/>
+        </w:rPr>
+      </w:pPr>
+      <w:r>
+        <w:rPr>
+          <w:rFonts w:ascii="Times New Roman" w:hAnsi="Times New Roman" w:cs="Times New Roman"/>
+          <w:sz w:val="36"/>
+          <w:szCs w:val="36"/>
+        </w:rPr>
+        <w:t>_To see the number of books,</w:t>
+      </w:r>
+      <w:r>
+        <w:rPr>
+          <w:rFonts w:ascii="Times New Roman" w:hAnsi="Times New Roman" w:cs="Times New Roman"/>
+          <w:color w:val="000000" w:themeColor="text1"/>
+          <w:sz w:val="36"/>
+          <w:szCs w:val="36"/>
+        </w:rPr>
+        <w:t xml:space="preserve"> </w:t>
+      </w:r>
+      <w:r>
+        <w:rPr>
+          <w:rFonts w:ascii="Times New Roman" w:hAnsi="Times New Roman" w:cs="Times New Roman"/>
+          <w:color w:val="000000" w:themeColor="text1"/>
+          <w:sz w:val="36"/>
+          <w:szCs w:val="36"/>
+        </w:rPr>
+        <w:t>run this:</w:t>
+      </w:r>
+    </w:p>
+    <w:p>
+      <w:pPr>
+        <w:rPr>
+          <w:rFonts w:ascii="Times New Roman" w:hAnsi="Times New Roman" w:cs="Times New Roman"/>
+          <w:sz w:val="36"/>
+          <w:szCs w:val="36"/>
+        </w:rPr>
+      </w:pPr>
+      <w:r>
+        <w:rPr>
+          <w:rFonts w:ascii="Times New Roman" w:hAnsi="Times New Roman" w:cs="Times New Roman"/>
+          <w:sz w:val="36"/>
+          <w:szCs w:val="36"/>
+        </w:rPr>
+        <w:t>docker exec -it javaapi-duc-company1-mysql mysql -uroot -pabcxyz -D javaapi_duc_company1 -e "SELECT Count(*) FROM books ;"</w:t>
+      </w:r>
+    </w:p>
+    <w:p>
+      <w:pPr>
+        <w:rPr>
+          <w:rFonts w:ascii="Times New Roman" w:hAnsi="Times New Roman" w:cs="Times New Roman"/>
+          <w:sz w:val="36"/>
+          <w:szCs w:val="36"/>
+        </w:rPr>
+      </w:pPr>
+      <w:r>
+        <w:rPr>
+          <w:rFonts w:ascii="Times New Roman" w:hAnsi="Times New Roman" w:cs="Times New Roman"/>
+          <w:sz w:val="36"/>
+          <w:szCs w:val="36"/>
+        </w:rPr>
+        <w:t>………………</w:t>
+      </w:r>
+    </w:p>
+    <w:p>
+      <w:pPr>
+        <w:rPr>
+          <w:rFonts w:ascii="Times New Roman" w:hAnsi="Times New Roman" w:cs="Times New Roman"/>
+          <w:sz w:val="36"/>
+          <w:szCs w:val="36"/>
+        </w:rPr>
+      </w:pPr>
+      <w:r>
+        <w:rPr>
+          <w:rFonts w:ascii="Times New Roman" w:hAnsi="Times New Roman" w:cs="Times New Roman"/>
+          <w:sz w:val="36"/>
+          <w:szCs w:val="36"/>
+        </w:rPr>
+        <w:t>Password of My</w:t>
+      </w:r>
+      <w:r>
+        <w:rPr>
+          <w:rFonts w:ascii="Times New Roman" w:hAnsi="Times New Roman" w:cs="Times New Roman"/>
+          <w:sz w:val="36"/>
+          <w:szCs w:val="36"/>
+        </w:rPr>
+        <w:t>S</w:t>
+      </w:r>
+      <w:r>
+        <w:rPr>
+          <w:rFonts w:ascii="Times New Roman" w:hAnsi="Times New Roman" w:cs="Times New Roman"/>
+          <w:sz w:val="36"/>
+          <w:szCs w:val="36"/>
+        </w:rPr>
+        <w:t>QL is abcxyz</w:t>
+      </w:r>
+      <w:r>
+        <w:rPr>
+          <w:rFonts w:ascii="Times New Roman" w:hAnsi="Times New Roman" w:cs="Times New Roman"/>
+          <w:sz w:val="36"/>
+          <w:szCs w:val="36"/>
+        </w:rPr>
+        <w:t xml:space="preserve"> (in file </w:t>
+      </w:r>
+      <w:r>
+        <w:rPr>
+          <w:rFonts w:ascii="Times New Roman" w:hAnsi="Times New Roman" w:cs="Times New Roman"/>
+          <w:sz w:val="36"/>
+          <w:szCs w:val="36"/>
+        </w:rPr>
+        <w:t>application</w:t>
+      </w:r>
+      <w:r>
+        <w:rPr>
+          <w:rFonts w:ascii="Times New Roman" w:hAnsi="Times New Roman" w:cs="Times New Roman"/>
+          <w:sz w:val="36"/>
+          <w:szCs w:val="36"/>
+        </w:rPr>
+        <w:t>.</w:t>
+      </w:r>
+      <w:r>
+        <w:rPr>
+          <w:rFonts w:ascii="Times New Roman" w:hAnsi="Times New Roman" w:cs="Times New Roman"/>
+          <w:sz w:val="36"/>
+          <w:szCs w:val="36"/>
+        </w:rPr>
+        <w:t>properties</w:t>
+      </w:r>
+      <w:r>
+        <w:rPr>
+          <w:rFonts w:ascii="Times New Roman" w:hAnsi="Times New Roman" w:cs="Times New Roman"/>
+          <w:sz w:val="36"/>
+          <w:szCs w:val="36"/>
+        </w:rPr>
+        <w:t>)</w:t>
+      </w:r>
+      <w:r>
+        <w:rPr>
+          <w:rFonts w:ascii="Times New Roman" w:hAnsi="Times New Roman" w:cs="Times New Roman"/>
+          <w:sz w:val="36"/>
+          <w:szCs w:val="36"/>
+        </w:rPr>
+        <w:t>, so thre is “</w:t>
+      </w:r>
+      <w:r>
+        <w:rPr>
+          <w:rFonts w:ascii="Times New Roman" w:hAnsi="Times New Roman" w:cs="Times New Roman"/>
+          <w:sz w:val="36"/>
+          <w:szCs w:val="36"/>
+        </w:rPr>
+        <w:t>pabcxyz</w:t>
+      </w:r>
+      <w:r>
+        <w:rPr>
+          <w:rFonts w:ascii="Times New Roman" w:hAnsi="Times New Roman" w:cs="Times New Roman"/>
+          <w:sz w:val="36"/>
+          <w:szCs w:val="36"/>
+        </w:rPr>
+        <w:t xml:space="preserve">” </w:t>
+      </w:r>
+      <w:r>
+        <w:rPr>
+          <w:rFonts w:ascii="Times New Roman" w:hAnsi="Times New Roman" w:cs="Times New Roman"/>
+          <w:sz w:val="36"/>
+          <w:szCs w:val="36"/>
+        </w:rPr>
+        <w:t xml:space="preserve">in the commands </w:t>
+      </w:r>
+      <w:r>
+        <w:rPr>
+          <w:rFonts w:ascii="Times New Roman" w:hAnsi="Times New Roman" w:cs="Times New Roman"/>
+          <w:sz w:val="36"/>
+          <w:szCs w:val="36"/>
+        </w:rPr>
+        <w:t>above.</w:t>
+      </w:r>
+    </w:p>
+    <w:p>
+      <w:pPr>
+        <w:rPr>
+          <w:rFonts w:ascii="Times New Roman" w:hAnsi="Times New Roman" w:cs="Times New Roman"/>
+          <w:sz w:val="36"/>
+          <w:szCs w:val="36"/>
+        </w:rPr>
+      </w:pPr>
+    </w:p>
+    <w:p>
+      <w:pPr>
+        <w:rPr>
+          <w:rFonts w:ascii="Times New Roman" w:hAnsi="Times New Roman" w:cs="Times New Roman"/>
+          <w:sz w:val="36"/>
+          <w:szCs w:val="36"/>
+        </w:rPr>
+      </w:pPr>
+    </w:p>
+    <w:p>
+      <w:pPr>
+        <w:rPr>
+          <w:rFonts w:ascii="Times New Roman" w:hAnsi="Times New Roman" w:cs="Times New Roman"/>
+          <w:sz w:val="36"/>
+          <w:szCs w:val="36"/>
+        </w:rPr>
+      </w:pPr>
+    </w:p>
+    <w:p>
+      <w:pPr>
+        <w:rPr>
+          <w:rFonts w:ascii="Times New Roman" w:hAnsi="Times New Roman" w:cs="Times New Roman"/>
+          <w:color w:val="000000" w:themeColor="text1"/>
+          <w:sz w:val="36"/>
+          <w:szCs w:val="36"/>
+        </w:rPr>
+      </w:pPr>
     </w:p>
     <w:p>
       <w:pPr>
@@ -9685,7 +13916,7 @@
         <v:path o:extrusionok="f" gradientshapeok="t" o:connecttype="rect"/>
         <o:lock v:ext="edit" aspectratio="t"/>
       </v:shapetype>
-      <v:shape id="_x0000_i1241" type="#_x0000_t75" alt="💡" style="width:12pt;height:12pt;visibility:visible;mso-wrap-style:square" o:bullet="t">
+      <v:shape id="_x0000_i1084" type="#_x0000_t75" alt="💡" style="width:12pt;height:12pt;visibility:visible;mso-wrap-style:square" o:bullet="t">
         <v:imagedata r:id="rId1" o:title="💡"/>
       </v:shape>
     </w:pict>
@@ -14026,6 +18257,155 @@
     </w:lvl>
   </w:abstractNum>
   <w:abstractNum w:abstractNumId="32" w15:restartNumberingAfterBreak="0">
+    <w:nsid w:val="69B22884"/>
+    <w:multiLevelType w:val="multilevel"/>
+    <w:tmpl w:val="1C400E18"/>
+    <w:lvl w:ilvl="0">
+      <w:start w:val="1"/>
+      <w:numFmt w:val="bullet"/>
+      <w:lvlText w:val=""/>
+      <w:lvlJc w:val="left"/>
+      <w:pPr>
+        <w:tabs>
+          <w:tab w:val="num" w:pos="720"/>
+        </w:tabs>
+        <w:ind w:left="720" w:hanging="360"/>
+      </w:pPr>
+      <w:rPr>
+        <w:rFonts w:ascii="Symbol" w:hAnsi="Symbol" w:hint="default"/>
+        <w:sz w:val="20"/>
+      </w:rPr>
+    </w:lvl>
+    <w:lvl w:ilvl="1" w:tentative="1">
+      <w:start w:val="1"/>
+      <w:numFmt w:val="bullet"/>
+      <w:lvlText w:val="o"/>
+      <w:lvlJc w:val="left"/>
+      <w:pPr>
+        <w:tabs>
+          <w:tab w:val="num" w:pos="1440"/>
+        </w:tabs>
+        <w:ind w:left="1440" w:hanging="360"/>
+      </w:pPr>
+      <w:rPr>
+        <w:rFonts w:ascii="Courier New" w:hAnsi="Courier New" w:hint="default"/>
+        <w:sz w:val="20"/>
+      </w:rPr>
+    </w:lvl>
+    <w:lvl w:ilvl="2" w:tentative="1">
+      <w:start w:val="1"/>
+      <w:numFmt w:val="bullet"/>
+      <w:lvlText w:val=""/>
+      <w:lvlJc w:val="left"/>
+      <w:pPr>
+        <w:tabs>
+          <w:tab w:val="num" w:pos="2160"/>
+        </w:tabs>
+        <w:ind w:left="2160" w:hanging="360"/>
+      </w:pPr>
+      <w:rPr>
+        <w:rFonts w:ascii="Wingdings" w:hAnsi="Wingdings" w:hint="default"/>
+        <w:sz w:val="20"/>
+      </w:rPr>
+    </w:lvl>
+    <w:lvl w:ilvl="3" w:tentative="1">
+      <w:start w:val="1"/>
+      <w:numFmt w:val="bullet"/>
+      <w:lvlText w:val=""/>
+      <w:lvlJc w:val="left"/>
+      <w:pPr>
+        <w:tabs>
+          <w:tab w:val="num" w:pos="2880"/>
+        </w:tabs>
+        <w:ind w:left="2880" w:hanging="360"/>
+      </w:pPr>
+      <w:rPr>
+        <w:rFonts w:ascii="Wingdings" w:hAnsi="Wingdings" w:hint="default"/>
+        <w:sz w:val="20"/>
+      </w:rPr>
+    </w:lvl>
+    <w:lvl w:ilvl="4" w:tentative="1">
+      <w:start w:val="1"/>
+      <w:numFmt w:val="bullet"/>
+      <w:lvlText w:val=""/>
+      <w:lvlJc w:val="left"/>
+      <w:pPr>
+        <w:tabs>
+          <w:tab w:val="num" w:pos="3600"/>
+        </w:tabs>
+        <w:ind w:left="3600" w:hanging="360"/>
+      </w:pPr>
+      <w:rPr>
+        <w:rFonts w:ascii="Wingdings" w:hAnsi="Wingdings" w:hint="default"/>
+        <w:sz w:val="20"/>
+      </w:rPr>
+    </w:lvl>
+    <w:lvl w:ilvl="5" w:tentative="1">
+      <w:start w:val="1"/>
+      <w:numFmt w:val="bullet"/>
+      <w:lvlText w:val=""/>
+      <w:lvlJc w:val="left"/>
+      <w:pPr>
+        <w:tabs>
+          <w:tab w:val="num" w:pos="4320"/>
+        </w:tabs>
+        <w:ind w:left="4320" w:hanging="360"/>
+      </w:pPr>
+      <w:rPr>
+        <w:rFonts w:ascii="Wingdings" w:hAnsi="Wingdings" w:hint="default"/>
+        <w:sz w:val="20"/>
+      </w:rPr>
+    </w:lvl>
+    <w:lvl w:ilvl="6" w:tentative="1">
+      <w:start w:val="1"/>
+      <w:numFmt w:val="bullet"/>
+      <w:lvlText w:val=""/>
+      <w:lvlJc w:val="left"/>
+      <w:pPr>
+        <w:tabs>
+          <w:tab w:val="num" w:pos="5040"/>
+        </w:tabs>
+        <w:ind w:left="5040" w:hanging="360"/>
+      </w:pPr>
+      <w:rPr>
+        <w:rFonts w:ascii="Wingdings" w:hAnsi="Wingdings" w:hint="default"/>
+        <w:sz w:val="20"/>
+      </w:rPr>
+    </w:lvl>
+    <w:lvl w:ilvl="7" w:tentative="1">
+      <w:start w:val="1"/>
+      <w:numFmt w:val="bullet"/>
+      <w:lvlText w:val=""/>
+      <w:lvlJc w:val="left"/>
+      <w:pPr>
+        <w:tabs>
+          <w:tab w:val="num" w:pos="5760"/>
+        </w:tabs>
+        <w:ind w:left="5760" w:hanging="360"/>
+      </w:pPr>
+      <w:rPr>
+        <w:rFonts w:ascii="Wingdings" w:hAnsi="Wingdings" w:hint="default"/>
+        <w:sz w:val="20"/>
+      </w:rPr>
+    </w:lvl>
+    <w:lvl w:ilvl="8" w:tentative="1">
+      <w:start w:val="1"/>
+      <w:numFmt w:val="bullet"/>
+      <w:lvlText w:val=""/>
+      <w:lvlJc w:val="left"/>
+      <w:pPr>
+        <w:tabs>
+          <w:tab w:val="num" w:pos="6480"/>
+        </w:tabs>
+        <w:ind w:left="6480" w:hanging="360"/>
+      </w:pPr>
+      <w:rPr>
+        <w:rFonts w:ascii="Wingdings" w:hAnsi="Wingdings" w:hint="default"/>
+        <w:sz w:val="20"/>
+      </w:rPr>
+    </w:lvl>
+  </w:abstractNum>
+  <w:abstractNum w:abstractNumId="33" w15:restartNumberingAfterBreak="0">
     <w:nsid w:val="69DF66EC"/>
     <w:multiLevelType w:val="multilevel"/>
     <w:tmpl w:val="862E0228"/>
@@ -14174,7 +18554,7 @@
       </w:rPr>
     </w:lvl>
   </w:abstractNum>
-  <w:abstractNum w:abstractNumId="33" w15:restartNumberingAfterBreak="0">
+  <w:abstractNum w:abstractNumId="34" w15:restartNumberingAfterBreak="0">
     <w:nsid w:val="6D732A5C"/>
     <w:multiLevelType w:val="multilevel"/>
     <w:tmpl w:val="7E7AA8F0"/>
@@ -14323,7 +18703,7 @@
       </w:rPr>
     </w:lvl>
   </w:abstractNum>
-  <w:abstractNum w:abstractNumId="34" w15:restartNumberingAfterBreak="0">
+  <w:abstractNum w:abstractNumId="35" w15:restartNumberingAfterBreak="0">
     <w:nsid w:val="70BE7BA6"/>
     <w:multiLevelType w:val="hybridMultilevel"/>
     <w:tmpl w:val="BF187D5A"/>
@@ -14464,7 +18844,7 @@
       </w:rPr>
     </w:lvl>
   </w:abstractNum>
-  <w:abstractNum w:abstractNumId="35" w15:restartNumberingAfterBreak="0">
+  <w:abstractNum w:abstractNumId="36" w15:restartNumberingAfterBreak="0">
     <w:nsid w:val="71632D0F"/>
     <w:multiLevelType w:val="multilevel"/>
     <w:tmpl w:val="BC86E59C"/>
@@ -14577,7 +18957,7 @@
       </w:pPr>
     </w:lvl>
   </w:abstractNum>
-  <w:abstractNum w:abstractNumId="36" w15:restartNumberingAfterBreak="0">
+  <w:abstractNum w:abstractNumId="37" w15:restartNumberingAfterBreak="0">
     <w:nsid w:val="72D3633D"/>
     <w:multiLevelType w:val="multilevel"/>
     <w:tmpl w:val="E9063DAE"/>
@@ -14690,7 +19070,7 @@
       </w:pPr>
     </w:lvl>
   </w:abstractNum>
-  <w:abstractNum w:abstractNumId="37" w15:restartNumberingAfterBreak="0">
+  <w:abstractNum w:abstractNumId="38" w15:restartNumberingAfterBreak="0">
     <w:nsid w:val="779E4257"/>
     <w:multiLevelType w:val="multilevel"/>
     <w:tmpl w:val="66566D96"/>
@@ -14839,7 +19219,7 @@
       </w:rPr>
     </w:lvl>
   </w:abstractNum>
-  <w:abstractNum w:abstractNumId="38" w15:restartNumberingAfterBreak="0">
+  <w:abstractNum w:abstractNumId="39" w15:restartNumberingAfterBreak="0">
     <w:nsid w:val="781A421C"/>
     <w:multiLevelType w:val="multilevel"/>
     <w:tmpl w:val="F5160B58"/>
@@ -14988,7 +19368,7 @@
       </w:rPr>
     </w:lvl>
   </w:abstractNum>
-  <w:abstractNum w:abstractNumId="39" w15:restartNumberingAfterBreak="0">
+  <w:abstractNum w:abstractNumId="40" w15:restartNumberingAfterBreak="0">
     <w:nsid w:val="790D2FE9"/>
     <w:multiLevelType w:val="hybridMultilevel"/>
     <w:tmpl w:val="831C68BA"/>
@@ -15100,7 +19480,7 @@
       </w:rPr>
     </w:lvl>
   </w:abstractNum>
-  <w:abstractNum w:abstractNumId="40" w15:restartNumberingAfterBreak="0">
+  <w:abstractNum w:abstractNumId="41" w15:restartNumberingAfterBreak="0">
     <w:nsid w:val="7E500D9E"/>
     <w:multiLevelType w:val="multilevel"/>
     <w:tmpl w:val="0FC8C7AC"/>
@@ -15213,7 +19593,7 @@
       </w:pPr>
     </w:lvl>
   </w:abstractNum>
-  <w:abstractNum w:abstractNumId="41" w15:restartNumberingAfterBreak="0">
+  <w:abstractNum w:abstractNumId="42" w15:restartNumberingAfterBreak="0">
     <w:nsid w:val="7EC228A7"/>
     <w:multiLevelType w:val="multilevel"/>
     <w:tmpl w:val="B6F45E94"/>
@@ -15375,10 +19755,10 @@
     <w:abstractNumId w:val="1"/>
   </w:num>
   <w:num w:numId="5">
-    <w:abstractNumId w:val="32"/>
+    <w:abstractNumId w:val="33"/>
   </w:num>
   <w:num w:numId="6">
-    <w:abstractNumId w:val="33"/>
+    <w:abstractNumId w:val="34"/>
   </w:num>
   <w:num w:numId="7">
     <w:abstractNumId w:val="24"/>
@@ -15387,10 +19767,10 @@
     <w:abstractNumId w:val="4"/>
   </w:num>
   <w:num w:numId="9">
-    <w:abstractNumId w:val="34"/>
+    <w:abstractNumId w:val="35"/>
   </w:num>
   <w:num w:numId="10">
-    <w:abstractNumId w:val="39"/>
+    <w:abstractNumId w:val="40"/>
   </w:num>
   <w:num w:numId="11">
     <w:abstractNumId w:val="13"/>
@@ -15405,7 +19785,7 @@
     <w:abstractNumId w:val="27"/>
   </w:num>
   <w:num w:numId="15">
-    <w:abstractNumId w:val="38"/>
+    <w:abstractNumId w:val="39"/>
   </w:num>
   <w:num w:numId="16">
     <w:abstractNumId w:val="18"/>
@@ -15417,13 +19797,13 @@
     <w:abstractNumId w:val="31"/>
   </w:num>
   <w:num w:numId="19">
-    <w:abstractNumId w:val="41"/>
+    <w:abstractNumId w:val="42"/>
   </w:num>
   <w:num w:numId="20">
     <w:abstractNumId w:val="9"/>
   </w:num>
   <w:num w:numId="21">
-    <w:abstractNumId w:val="36"/>
+    <w:abstractNumId w:val="37"/>
   </w:num>
   <w:num w:numId="22">
     <w:abstractNumId w:val="30"/>
@@ -15435,7 +19815,7 @@
     <w:abstractNumId w:val="0"/>
   </w:num>
   <w:num w:numId="25">
-    <w:abstractNumId w:val="35"/>
+    <w:abstractNumId w:val="36"/>
   </w:num>
   <w:num w:numId="26">
     <w:abstractNumId w:val="20"/>
@@ -15468,7 +19848,7 @@
     <w:abstractNumId w:val="25"/>
   </w:num>
   <w:num w:numId="36">
-    <w:abstractNumId w:val="40"/>
+    <w:abstractNumId w:val="41"/>
   </w:num>
   <w:num w:numId="37">
     <w:abstractNumId w:val="6"/>
@@ -15480,13 +19860,16 @@
     <w:abstractNumId w:val="26"/>
   </w:num>
   <w:num w:numId="40">
-    <w:abstractNumId w:val="37"/>
+    <w:abstractNumId w:val="38"/>
   </w:num>
   <w:num w:numId="41">
     <w:abstractNumId w:val="3"/>
   </w:num>
   <w:num w:numId="42">
     <w:abstractNumId w:val="11"/>
+  </w:num>
+  <w:num w:numId="43">
+    <w:abstractNumId w:val="32"/>
   </w:num>
 </w:numbering>
 </file>
@@ -15889,7 +20272,7 @@
   <w:style w:type="paragraph" w:default="1" w:styleId="Normal">
     <w:name w:val="Normal"/>
     <w:qFormat/>
-    <w:rsid w:val="00D56796"/>
+    <w:rsid w:val="00AB73B5"/>
   </w:style>
   <w:style w:type="paragraph" w:styleId="Heading1">
     <w:name w:val="heading 1"/>

</xml_diff>